<commit_message>
Entrega avance fase 2 07-11
</commit_message>
<xml_diff>
--- a/Fase 2/Evidencias Grupales/2.4_GuiaEstudiante_Fase 2_DesarrolloProyecto APT.docx
+++ b/Fase 2/Evidencias Grupales/2.4_GuiaEstudiante_Fase 2_DesarrolloProyecto APT.docx
@@ -2,7 +2,10 @@
 <file path=word/document.xml><?xml version="1.0" encoding="utf-8"?>
 <w:document xmlns:wpc="http://schemas.microsoft.com/office/word/2010/wordprocessingCanvas" xmlns:cx="http://schemas.microsoft.com/office/drawing/2014/chartex" xmlns:mc="http://schemas.openxmlformats.org/markup-compatibility/2006" xmlns:o="urn:schemas-microsoft-com:office:office" xmlns:r="http://schemas.openxmlformats.org/officeDocument/2006/relationships" xmlns:m="http://schemas.openxmlformats.org/officeDocument/2006/math" xmlns:v="urn:schemas-microsoft-com:vml" xmlns:wp14="http://schemas.microsoft.com/office/word/2010/wordprocessingDrawing" xmlns:wp="http://schemas.openxmlformats.org/drawingml/2006/wordprocessingDrawing" xmlns:w10="urn:schemas-microsoft-com:office:word" xmlns:w="http://schemas.openxmlformats.org/wordprocessingml/2006/main" xmlns:w14="http://schemas.microsoft.com/office/word/2010/wordml" xmlns:w15="http://schemas.microsoft.com/office/word/2012/wordml" xmlns:w16se="http://schemas.microsoft.com/office/word/2015/wordml/symex" xmlns:wpg="http://schemas.microsoft.com/office/word/2010/wordprocessingGroup" xmlns:wpi="http://schemas.microsoft.com/office/word/2010/wordprocessingInk" xmlns:wne="http://schemas.microsoft.com/office/word/2006/wordml" xmlns:wps="http://schemas.microsoft.com/office/word/2010/wordprocessingShape" mc:Ignorable="w14 w15 w16se wp14">
   <w:body>
-    <w:p/>
+    <w:p>
+      <w:bookmarkStart w:id="0" w:name="_GoBack"/>
+      <w:bookmarkEnd w:id="0"/>
+    </w:p>
     <w:p>
       <w:pPr>
         <w:rPr>
@@ -162,7 +165,6 @@
                                 </w:rPr>
                                 <w:t xml:space="preserve">Asignatura </w:t>
                               </w:r>
-                              <w:proofErr w:type="spellStart"/>
                               <w:r>
                                 <w:rPr>
                                   <w:b/>
@@ -172,7 +174,6 @@
                                 </w:rPr>
                                 <w:t>Capstone</w:t>
                               </w:r>
-                              <w:proofErr w:type="spellEnd"/>
                             </w:p>
                           </w:txbxContent>
                         </wps:txbx>
@@ -235,9 +236,9 @@
               </wp:anchor>
             </w:drawing>
           </mc:Choice>
-          <mc:Fallback>
+          <mc:Fallback xmlns:w16sdtfl="http://schemas.microsoft.com/office/word/2024/wordml/sdtformatlock" xmlns:w16sdtdh="http://schemas.microsoft.com/office/word/2020/wordml/sdtdatahash" xmlns:w16du="http://schemas.microsoft.com/office/word/2023/wordml/word16du" xmlns:w16="http://schemas.microsoft.com/office/word/2018/wordml" xmlns:w16cid="http://schemas.microsoft.com/office/word/2016/wordml/cid" xmlns:w16cex="http://schemas.microsoft.com/office/word/2018/wordml/cex" xmlns:oel="http://schemas.microsoft.com/office/2019/extlst" xmlns:am3d="http://schemas.microsoft.com/office/drawing/2017/model3d" xmlns:aink="http://schemas.microsoft.com/office/drawing/2016/ink" xmlns:cx8="http://schemas.microsoft.com/office/drawing/2016/5/14/chartex" xmlns:cx7="http://schemas.microsoft.com/office/drawing/2016/5/13/chartex" xmlns:cx6="http://schemas.microsoft.com/office/drawing/2016/5/12/chartex" xmlns:cx5="http://schemas.microsoft.com/office/drawing/2016/5/11/chartex" xmlns:cx4="http://schemas.microsoft.com/office/drawing/2016/5/10/chartex" xmlns:cx3="http://schemas.microsoft.com/office/drawing/2016/5/9/chartex" xmlns:cx2="http://schemas.microsoft.com/office/drawing/2015/10/21/chartex" xmlns:cx1="http://schemas.microsoft.com/office/drawing/2015/9/8/chartex">
             <w:pict>
-              <v:group w14:anchorId="39581AEC" id="Grupo 27" o:spid="_x0000_s1026" style="position:absolute;margin-left:0;margin-top:.75pt;width:491.25pt;height:123pt;z-index:251659264;mso-position-horizontal:center;mso-position-horizontal-relative:margin;mso-width-relative:margin;mso-height-relative:margin" coordsize="59912,15621" o:gfxdata="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">
+              <v:group w14:anchorId="39581AEC" id="Grupo 27" o:spid="_x0000_s1026" style="position:absolute;margin-left:0;margin-top:.75pt;width:491.25pt;height:123pt;z-index:251659264;mso-position-horizontal:center;mso-position-horizontal-relative:margin;mso-width-relative:margin;mso-height-relative:margin" coordsize="59912,15621" o:gfxdata="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">
                 <v:shapetype id="_x0000_t202" coordsize="21600,21600" o:spt="202" path="m,l,21600r21600,l21600,xe">
                   <v:stroke joinstyle="miter"/>
                   <v:path gradientshapeok="t" o:connecttype="rect"/>
@@ -340,7 +341,6 @@
                           </w:rPr>
                           <w:t xml:space="preserve">Asignatura </w:t>
                         </w:r>
-                        <w:proofErr w:type="spellStart"/>
                         <w:r>
                           <w:rPr>
                             <w:b/>
@@ -350,7 +350,6 @@
                           </w:rPr>
                           <w:t>Capstone</w:t>
                         </w:r>
-                        <w:proofErr w:type="spellEnd"/>
                       </w:p>
                     </w:txbxContent>
                   </v:textbox>
@@ -570,7 +569,7 @@
     <w:tbl>
       <w:tblPr>
         <w:tblStyle w:val="Tablaconcuadrcula"/>
-        <w:tblW w:w="9639" w:type="dxa"/>
+        <w:tblW w:w="10081" w:type="dxa"/>
         <w:tblInd w:w="-572" w:type="dxa"/>
         <w:tblBorders>
           <w:top w:val="single" w:sz="4" w:space="0" w:color="BFBFBF" w:themeColor="background1" w:themeShade="BF"/>
@@ -589,7 +588,7 @@
       <w:tr>
         <w:tc>
           <w:tcPr>
-            <w:tcW w:w="2528" w:type="dxa"/>
+            <w:tcW w:w="1361" w:type="dxa"/>
             <w:vAlign w:val="center"/>
           </w:tcPr>
           <w:p>
@@ -624,7 +623,7 @@
         </w:tc>
         <w:tc>
           <w:tcPr>
-            <w:tcW w:w="7111" w:type="dxa"/>
+            <w:tcW w:w="8720" w:type="dxa"/>
           </w:tcPr>
           <w:p>
             <w:pPr>
@@ -748,29 +747,7 @@
                 <w:szCs w:val="20"/>
                 <w:lang w:eastAsia="es-CL"/>
               </w:rPr>
-              <w:t xml:space="preserve">En relación con los avances realizados en el proyecto APT, se implementaron diversas metodologías con el objetivo de obtener una visión más clara de las necesidades de los usuarios y/o streamers en la plataforma </w:t>
-            </w:r>
-            <w:proofErr w:type="spellStart"/>
-            <w:r>
-              <w:rPr>
-                <w:rFonts w:ascii="Calibri" w:hAnsi="Calibri" w:cs="Arial"/>
-                <w:i/>
-                <w:sz w:val="20"/>
-                <w:szCs w:val="20"/>
-                <w:lang w:eastAsia="es-CL"/>
-              </w:rPr>
-              <w:t>Twitch</w:t>
-            </w:r>
-            <w:proofErr w:type="spellEnd"/>
-            <w:r>
-              <w:rPr>
-                <w:rFonts w:ascii="Calibri" w:hAnsi="Calibri" w:cs="Arial"/>
-                <w:i/>
-                <w:sz w:val="20"/>
-                <w:szCs w:val="20"/>
-                <w:lang w:eastAsia="es-CL"/>
-              </w:rPr>
-              <w:t>. En una primera instancia, se llevaron a cabo licitaciones orientadas a recopilar información relevante sobre los requerimientos funcionales y no funcionales del sistema, con el propósito de definir los estándares necesarios para desarrollar un proyecto innovador y útil d</w:t>
+              <w:t>En relación con los avances realizados en el proyecto APT, se implementaron diversas metodologías con el objetivo de obtener una visión más clara de las necesidades de los usuarios y/o streamers en la plataforma Twitch. En una primera instancia, se llevaron a cabo licitaciones orientadas a recopilar información relevante sobre los requerimientos funcionales y no funcionales del sistema, con el propósito de definir los estándares necesarios para desarrollar un proyecto innovador y útil d</w:t>
             </w:r>
             <w:r>
               <w:rPr>
@@ -802,51 +779,7 @@
                 <w:szCs w:val="20"/>
                 <w:lang w:eastAsia="es-CL"/>
               </w:rPr>
-              <w:t xml:space="preserve">Posteriormente, se procedió con el diseño preliminar de la aplicación, utilizando las herramientas </w:t>
-            </w:r>
-            <w:proofErr w:type="spellStart"/>
-            <w:r>
-              <w:rPr>
-                <w:rFonts w:ascii="Calibri" w:hAnsi="Calibri" w:cs="Arial"/>
-                <w:i/>
-                <w:sz w:val="20"/>
-                <w:szCs w:val="20"/>
-                <w:lang w:eastAsia="es-CL"/>
-              </w:rPr>
-              <w:t>Electron</w:t>
-            </w:r>
-            <w:proofErr w:type="spellEnd"/>
-            <w:r>
-              <w:rPr>
-                <w:rFonts w:ascii="Calibri" w:hAnsi="Calibri" w:cs="Arial"/>
-                <w:i/>
-                <w:sz w:val="20"/>
-                <w:szCs w:val="20"/>
-                <w:lang w:eastAsia="es-CL"/>
-              </w:rPr>
-              <w:t xml:space="preserve"> y CSS, prescindiendo del uso de </w:t>
-            </w:r>
-            <w:proofErr w:type="spellStart"/>
-            <w:r>
-              <w:rPr>
-                <w:rFonts w:ascii="Calibri" w:hAnsi="Calibri" w:cs="Arial"/>
-                <w:i/>
-                <w:sz w:val="20"/>
-                <w:szCs w:val="20"/>
-                <w:lang w:eastAsia="es-CL"/>
-              </w:rPr>
-              <w:t>Figma</w:t>
-            </w:r>
-            <w:proofErr w:type="spellEnd"/>
-            <w:r>
-              <w:rPr>
-                <w:rFonts w:ascii="Calibri" w:hAnsi="Calibri" w:cs="Arial"/>
-                <w:i/>
-                <w:sz w:val="20"/>
-                <w:szCs w:val="20"/>
-                <w:lang w:eastAsia="es-CL"/>
-              </w:rPr>
-              <w:t>. Esta decisión metodológica permitió optimizar el tiempo de desarrollo y visualizar de manera práctica la estructura de la interfaz, los campos de entrada y los tipos de datos que lo</w:t>
+              <w:t>Posteriormente, se procedió con el diseño preliminar de la aplicación, utilizando las herramientas Electron y CSS, prescindiendo del uso de Figma. Esta decisión metodológica permitió optimizar el tiempo de desarrollo y visualizar de manera práctica la estructura de la interfaz, los campos de entrada y los tipos de datos que lo</w:t>
             </w:r>
             <w:r>
               <w:rPr>
@@ -878,95 +811,7 @@
                 <w:szCs w:val="20"/>
                 <w:lang w:eastAsia="es-CL"/>
               </w:rPr>
-              <w:t xml:space="preserve">Finalmente, una vez establecido el marco base de la aplicación, se dio inicio a la integración de las </w:t>
-            </w:r>
-            <w:proofErr w:type="spellStart"/>
-            <w:r>
-              <w:rPr>
-                <w:rFonts w:ascii="Calibri" w:hAnsi="Calibri" w:cs="Arial"/>
-                <w:i/>
-                <w:sz w:val="20"/>
-                <w:szCs w:val="20"/>
-                <w:lang w:eastAsia="es-CL"/>
-              </w:rPr>
-              <w:t>APIs</w:t>
-            </w:r>
-            <w:proofErr w:type="spellEnd"/>
-            <w:r>
-              <w:rPr>
-                <w:rFonts w:ascii="Calibri" w:hAnsi="Calibri" w:cs="Arial"/>
-                <w:i/>
-                <w:sz w:val="20"/>
-                <w:szCs w:val="20"/>
-                <w:lang w:eastAsia="es-CL"/>
-              </w:rPr>
-              <w:t xml:space="preserve"> de </w:t>
-            </w:r>
-            <w:proofErr w:type="spellStart"/>
-            <w:r>
-              <w:rPr>
-                <w:rFonts w:ascii="Calibri" w:hAnsi="Calibri" w:cs="Arial"/>
-                <w:i/>
-                <w:sz w:val="20"/>
-                <w:szCs w:val="20"/>
-                <w:lang w:eastAsia="es-CL"/>
-              </w:rPr>
-              <w:t>Gemini</w:t>
-            </w:r>
-            <w:proofErr w:type="spellEnd"/>
-            <w:r>
-              <w:rPr>
-                <w:rFonts w:ascii="Calibri" w:hAnsi="Calibri" w:cs="Arial"/>
-                <w:i/>
-                <w:sz w:val="20"/>
-                <w:szCs w:val="20"/>
-                <w:lang w:eastAsia="es-CL"/>
-              </w:rPr>
-              <w:t xml:space="preserve">, </w:t>
-            </w:r>
-            <w:proofErr w:type="spellStart"/>
-            <w:r>
-              <w:rPr>
-                <w:rFonts w:ascii="Calibri" w:hAnsi="Calibri" w:cs="Arial"/>
-                <w:i/>
-                <w:sz w:val="20"/>
-                <w:szCs w:val="20"/>
-                <w:lang w:eastAsia="es-CL"/>
-              </w:rPr>
-              <w:t>ElevenLabs</w:t>
-            </w:r>
-            <w:proofErr w:type="spellEnd"/>
-            <w:r>
-              <w:rPr>
-                <w:rFonts w:ascii="Calibri" w:hAnsi="Calibri" w:cs="Arial"/>
-                <w:i/>
-                <w:sz w:val="20"/>
-                <w:szCs w:val="20"/>
-                <w:lang w:eastAsia="es-CL"/>
-              </w:rPr>
-              <w:t xml:space="preserve"> y </w:t>
-            </w:r>
-            <w:proofErr w:type="spellStart"/>
-            <w:r>
-              <w:rPr>
-                <w:rFonts w:ascii="Calibri" w:hAnsi="Calibri" w:cs="Arial"/>
-                <w:i/>
-                <w:sz w:val="20"/>
-                <w:szCs w:val="20"/>
-                <w:lang w:eastAsia="es-CL"/>
-              </w:rPr>
-              <w:t>Twitch</w:t>
-            </w:r>
-            <w:proofErr w:type="spellEnd"/>
-            <w:r>
-              <w:rPr>
-                <w:rFonts w:ascii="Calibri" w:hAnsi="Calibri" w:cs="Arial"/>
-                <w:i/>
-                <w:sz w:val="20"/>
-                <w:szCs w:val="20"/>
-                <w:lang w:eastAsia="es-CL"/>
-              </w:rPr>
-              <w:t>, con el fin de incorporar las funcionalidades esenciales del sistema y asegurar la interoperabilidad e</w:t>
+              <w:t>Finalmente, una vez establecido el marco base de la aplicación, se dio inicio a la integración de las APIs de Gemini, ElevenLabs y Twitch, con el fin de incorporar las funcionalidades esenciales del sistema y asegurar la interoperabilidad e</w:t>
             </w:r>
             <w:r>
               <w:rPr>
@@ -998,29 +843,7 @@
                 <w:szCs w:val="20"/>
                 <w:lang w:eastAsia="es-CL"/>
               </w:rPr>
-              <w:t xml:space="preserve">En cuanto a los ajustes realizados, se modificó parcialmente la metodología inicial, priorizando el desarrollo funcional sobre la fase de </w:t>
-            </w:r>
-            <w:proofErr w:type="spellStart"/>
-            <w:r>
-              <w:rPr>
-                <w:rFonts w:ascii="Calibri" w:hAnsi="Calibri" w:cs="Arial"/>
-                <w:i/>
-                <w:sz w:val="20"/>
-                <w:szCs w:val="20"/>
-                <w:lang w:eastAsia="es-CL"/>
-              </w:rPr>
-              <w:t>prototipado</w:t>
-            </w:r>
-            <w:proofErr w:type="spellEnd"/>
-            <w:r>
-              <w:rPr>
-                <w:rFonts w:ascii="Calibri" w:hAnsi="Calibri" w:cs="Arial"/>
-                <w:i/>
-                <w:sz w:val="20"/>
-                <w:szCs w:val="20"/>
-                <w:lang w:eastAsia="es-CL"/>
-              </w:rPr>
-              <w:t xml:space="preserve"> visual. Este cambio permitió avanzar más rápidamente hacia la validación técnica y cumplir con los objetivos específicos planteados hasta el momento, entre ellos el diseño del entorno base de la aplicación y la integración de los servicios principales.</w:t>
+              <w:t>En cuanto a los ajustes realizados, se modificó parcialmente la metodología inicial, priorizando el desarrollo funcional sobre la fase de prototipado visual. Este cambio permitió avanzar más rápidamente hacia la validación técnica y cumplir con los objetivos específicos planteados hasta el momento, entre ellos el diseño del entorno base de la aplicación y la integración de los servicios principales.</w:t>
             </w:r>
           </w:p>
         </w:tc>
@@ -1031,7 +854,7 @@
         </w:trPr>
         <w:tc>
           <w:tcPr>
-            <w:tcW w:w="2528" w:type="dxa"/>
+            <w:tcW w:w="1361" w:type="dxa"/>
             <w:vAlign w:val="center"/>
           </w:tcPr>
           <w:p>
@@ -1052,7 +875,7 @@
         </w:tc>
         <w:tc>
           <w:tcPr>
-            <w:tcW w:w="7111" w:type="dxa"/>
+            <w:tcW w:w="8720" w:type="dxa"/>
             <w:vAlign w:val="center"/>
           </w:tcPr>
           <w:p>
@@ -1088,7 +911,7 @@
         </w:trPr>
         <w:tc>
           <w:tcPr>
-            <w:tcW w:w="2528" w:type="dxa"/>
+            <w:tcW w:w="1361" w:type="dxa"/>
             <w:vAlign w:val="center"/>
           </w:tcPr>
           <w:p>
@@ -1110,7 +933,7 @@
         </w:tc>
         <w:tc>
           <w:tcPr>
-            <w:tcW w:w="7111" w:type="dxa"/>
+            <w:tcW w:w="8720" w:type="dxa"/>
             <w:vAlign w:val="center"/>
           </w:tcPr>
           <w:p>
@@ -1145,7 +968,7 @@
         </w:trPr>
         <w:tc>
           <w:tcPr>
-            <w:tcW w:w="2528" w:type="dxa"/>
+            <w:tcW w:w="1361" w:type="dxa"/>
             <w:vAlign w:val="center"/>
           </w:tcPr>
           <w:p>
@@ -1166,7 +989,7 @@
         </w:tc>
         <w:tc>
           <w:tcPr>
-            <w:tcW w:w="7111" w:type="dxa"/>
+            <w:tcW w:w="8720" w:type="dxa"/>
             <w:vAlign w:val="center"/>
           </w:tcPr>
           <w:p>
@@ -1559,9 +1382,8 @@
                 <w:szCs w:val="20"/>
                 <w:lang w:eastAsia="es-CL"/>
               </w:rPr>
-              <w:t xml:space="preserve">Como evidencia principal del progreso alcanzado en el Proyecto APT, se presenta el prototipo funcional inicial de la aplicación, desarrollado con las herramientas </w:t>
-            </w:r>
-            <w:proofErr w:type="spellStart"/>
+              <w:t xml:space="preserve">Como evidencia principal del progreso alcanzado en el Proyecto APT, se presenta el prototipo funcional inicial de la aplicación, desarrollado con las herramientas Electron y CSS. Este prototipo incluye la estructura base de la interfaz, los campos de entrada de datos y la integración preliminar de las APIs de Gemini, ElevenLabs y Twitch, lo que permite visualizar de forma tangible el avance en el diseño y funcionamiento del sistema, así como preparar la posterior configuración de los parámetros del </w:t>
+            </w:r>
             <w:r>
               <w:rPr>
                 <w:rFonts w:ascii="Calibri" w:hAnsi="Calibri" w:cs="Arial"/>
@@ -1571,10 +1393,12 @@
                 <w:szCs w:val="20"/>
                 <w:lang w:eastAsia="es-CL"/>
               </w:rPr>
-              <w:t>Electron</w:t>
-            </w:r>
-            <w:proofErr w:type="spellEnd"/>
-            <w:r>
+              <w:t>asistente virtual.</w:t>
+            </w:r>
+          </w:p>
+          <w:p>
+            <w:pPr>
+              <w:jc w:val="both"/>
               <w:rPr>
                 <w:rFonts w:ascii="Calibri" w:hAnsi="Calibri" w:cs="Arial"/>
                 <w:i/>
@@ -1583,9 +1407,7 @@
                 <w:szCs w:val="20"/>
                 <w:lang w:eastAsia="es-CL"/>
               </w:rPr>
-              <w:t xml:space="preserve"> y CSS. Este prototipo incluye la estructura base de la interfaz, los campos de entrada de datos y la integración preliminar de las </w:t>
-            </w:r>
-            <w:proofErr w:type="spellStart"/>
+            </w:pPr>
             <w:r>
               <w:rPr>
                 <w:rFonts w:ascii="Calibri" w:hAnsi="Calibri" w:cs="Arial"/>
@@ -1595,9 +1417,8 @@
                 <w:szCs w:val="20"/>
                 <w:lang w:eastAsia="es-CL"/>
               </w:rPr>
-              <w:t>APIs</w:t>
-            </w:r>
-            <w:proofErr w:type="spellEnd"/>
+              <w:t>Adicionalmente, se incluyen documentación técnica y diagramas de apoyo, tales como el flujograma BPMN, el diagrama de casos de uso y las historias de usuario con sus respectivas épicas, que detallan el proceso de integración de las APIs, los requerimientos funcionales y no funcionales identificados, y las decisiones metodológicas adoptadas durante el desarrollo. Estas evidencias permiten reflejar la evolución del proyecto desde la etapa de análisis hasta la fase de implementación inicial</w:t>
+            </w:r>
             <w:r>
               <w:rPr>
                 <w:rFonts w:ascii="Calibri" w:hAnsi="Calibri" w:cs="Arial"/>
@@ -1607,10 +1428,12 @@
                 <w:szCs w:val="20"/>
                 <w:lang w:eastAsia="es-CL"/>
               </w:rPr>
-              <w:t xml:space="preserve"> de </w:t>
-            </w:r>
-            <w:proofErr w:type="spellStart"/>
-            <w:r>
+              <w:t>.</w:t>
+            </w:r>
+          </w:p>
+          <w:p>
+            <w:pPr>
+              <w:jc w:val="both"/>
               <w:rPr>
                 <w:rFonts w:ascii="Calibri" w:hAnsi="Calibri" w:cs="Arial"/>
                 <w:i/>
@@ -1619,9 +1442,7 @@
                 <w:szCs w:val="20"/>
                 <w:lang w:eastAsia="es-CL"/>
               </w:rPr>
-              <w:t>Gemini</w:t>
-            </w:r>
-            <w:proofErr w:type="spellEnd"/>
+            </w:pPr>
             <w:r>
               <w:rPr>
                 <w:rFonts w:ascii="Calibri" w:hAnsi="Calibri" w:cs="Arial"/>
@@ -1631,186 +1452,7 @@
                 <w:szCs w:val="20"/>
                 <w:lang w:eastAsia="es-CL"/>
               </w:rPr>
-              <w:t xml:space="preserve">, </w:t>
-            </w:r>
-            <w:proofErr w:type="spellStart"/>
-            <w:r>
-              <w:rPr>
-                <w:rFonts w:ascii="Calibri" w:hAnsi="Calibri" w:cs="Arial"/>
-                <w:i/>
-                <w:color w:val="000000" w:themeColor="text1"/>
-                <w:sz w:val="20"/>
-                <w:szCs w:val="20"/>
-                <w:lang w:eastAsia="es-CL"/>
-              </w:rPr>
-              <w:t>ElevenLabs</w:t>
-            </w:r>
-            <w:proofErr w:type="spellEnd"/>
-            <w:r>
-              <w:rPr>
-                <w:rFonts w:ascii="Calibri" w:hAnsi="Calibri" w:cs="Arial"/>
-                <w:i/>
-                <w:color w:val="000000" w:themeColor="text1"/>
-                <w:sz w:val="20"/>
-                <w:szCs w:val="20"/>
-                <w:lang w:eastAsia="es-CL"/>
-              </w:rPr>
-              <w:t xml:space="preserve"> y </w:t>
-            </w:r>
-            <w:proofErr w:type="spellStart"/>
-            <w:r>
-              <w:rPr>
-                <w:rFonts w:ascii="Calibri" w:hAnsi="Calibri" w:cs="Arial"/>
-                <w:i/>
-                <w:color w:val="000000" w:themeColor="text1"/>
-                <w:sz w:val="20"/>
-                <w:szCs w:val="20"/>
-                <w:lang w:eastAsia="es-CL"/>
-              </w:rPr>
-              <w:t>Twitch</w:t>
-            </w:r>
-            <w:proofErr w:type="spellEnd"/>
-            <w:r>
-              <w:rPr>
-                <w:rFonts w:ascii="Calibri" w:hAnsi="Calibri" w:cs="Arial"/>
-                <w:i/>
-                <w:color w:val="000000" w:themeColor="text1"/>
-                <w:sz w:val="20"/>
-                <w:szCs w:val="20"/>
-                <w:lang w:eastAsia="es-CL"/>
-              </w:rPr>
-              <w:t>, lo que permite visualizar de forma tangible el avance en el dis</w:t>
-            </w:r>
-            <w:bookmarkStart w:id="0" w:name="_GoBack"/>
-            <w:bookmarkEnd w:id="0"/>
-            <w:r>
-              <w:rPr>
-                <w:rFonts w:ascii="Calibri" w:hAnsi="Calibri" w:cs="Arial"/>
-                <w:i/>
-                <w:color w:val="000000" w:themeColor="text1"/>
-                <w:sz w:val="20"/>
-                <w:szCs w:val="20"/>
-                <w:lang w:eastAsia="es-CL"/>
-              </w:rPr>
-              <w:t xml:space="preserve">eño y funcionamiento del sistema, así como preparar la posterior configuración de los parámetros del </w:t>
-            </w:r>
-            <w:r>
-              <w:rPr>
-                <w:rFonts w:ascii="Calibri" w:hAnsi="Calibri" w:cs="Arial"/>
-                <w:i/>
-                <w:color w:val="000000" w:themeColor="text1"/>
-                <w:sz w:val="20"/>
-                <w:szCs w:val="20"/>
-                <w:lang w:eastAsia="es-CL"/>
-              </w:rPr>
-              <w:t>asistente virtual.</w:t>
-            </w:r>
-          </w:p>
-          <w:p>
-            <w:pPr>
-              <w:jc w:val="both"/>
-              <w:rPr>
-                <w:rFonts w:ascii="Calibri" w:hAnsi="Calibri" w:cs="Arial"/>
-                <w:i/>
-                <w:color w:val="000000" w:themeColor="text1"/>
-                <w:sz w:val="20"/>
-                <w:szCs w:val="20"/>
-                <w:lang w:eastAsia="es-CL"/>
-              </w:rPr>
-            </w:pPr>
-            <w:r>
-              <w:rPr>
-                <w:rFonts w:ascii="Calibri" w:hAnsi="Calibri" w:cs="Arial"/>
-                <w:i/>
-                <w:color w:val="000000" w:themeColor="text1"/>
-                <w:sz w:val="20"/>
-                <w:szCs w:val="20"/>
-                <w:lang w:eastAsia="es-CL"/>
-              </w:rPr>
-              <w:t xml:space="preserve">Adicionalmente, se incluyen documentación técnica y diagramas de apoyo, tales como el flujograma BPMN, el diagrama de casos de uso y las historias de usuario con sus respectivas épicas, que detallan el proceso de integración de las </w:t>
-            </w:r>
-            <w:proofErr w:type="spellStart"/>
-            <w:r>
-              <w:rPr>
-                <w:rFonts w:ascii="Calibri" w:hAnsi="Calibri" w:cs="Arial"/>
-                <w:i/>
-                <w:color w:val="000000" w:themeColor="text1"/>
-                <w:sz w:val="20"/>
-                <w:szCs w:val="20"/>
-                <w:lang w:eastAsia="es-CL"/>
-              </w:rPr>
-              <w:t>APIs</w:t>
-            </w:r>
-            <w:proofErr w:type="spellEnd"/>
-            <w:r>
-              <w:rPr>
-                <w:rFonts w:ascii="Calibri" w:hAnsi="Calibri" w:cs="Arial"/>
-                <w:i/>
-                <w:color w:val="000000" w:themeColor="text1"/>
-                <w:sz w:val="20"/>
-                <w:szCs w:val="20"/>
-                <w:lang w:eastAsia="es-CL"/>
-              </w:rPr>
-              <w:t>, los requerimientos funcionales y no funcionales identificados, y las decisiones metodológicas adoptadas durante el desarrollo. Estas evidencias permiten reflejar la evolución del proyecto desde la etapa de análisis hasta la fase de implementación inicial</w:t>
-            </w:r>
-            <w:r>
-              <w:rPr>
-                <w:rFonts w:ascii="Calibri" w:hAnsi="Calibri" w:cs="Arial"/>
-                <w:i/>
-                <w:color w:val="000000" w:themeColor="text1"/>
-                <w:sz w:val="20"/>
-                <w:szCs w:val="20"/>
-                <w:lang w:eastAsia="es-CL"/>
-              </w:rPr>
-              <w:t>.</w:t>
-            </w:r>
-          </w:p>
-          <w:p>
-            <w:pPr>
-              <w:jc w:val="both"/>
-              <w:rPr>
-                <w:rFonts w:ascii="Calibri" w:hAnsi="Calibri" w:cs="Arial"/>
-                <w:i/>
-                <w:color w:val="000000" w:themeColor="text1"/>
-                <w:sz w:val="20"/>
-                <w:szCs w:val="20"/>
-                <w:lang w:eastAsia="es-CL"/>
-              </w:rPr>
-            </w:pPr>
-            <w:r>
-              <w:rPr>
-                <w:rFonts w:ascii="Calibri" w:hAnsi="Calibri" w:cs="Arial"/>
-                <w:i/>
-                <w:color w:val="000000" w:themeColor="text1"/>
-                <w:sz w:val="20"/>
-                <w:szCs w:val="20"/>
-                <w:lang w:eastAsia="es-CL"/>
-              </w:rPr>
-              <w:t xml:space="preserve">La calidad del proyecto se resguardó mediante la correcta aplicación de la metodología </w:t>
-            </w:r>
-            <w:proofErr w:type="spellStart"/>
-            <w:r>
-              <w:rPr>
-                <w:rFonts w:ascii="Calibri" w:hAnsi="Calibri" w:cs="Arial"/>
-                <w:i/>
-                <w:color w:val="000000" w:themeColor="text1"/>
-                <w:sz w:val="20"/>
-                <w:szCs w:val="20"/>
-                <w:lang w:eastAsia="es-CL"/>
-              </w:rPr>
-              <w:t>Scrum</w:t>
-            </w:r>
-            <w:proofErr w:type="spellEnd"/>
-            <w:r>
-              <w:rPr>
-                <w:rFonts w:ascii="Calibri" w:hAnsi="Calibri" w:cs="Arial"/>
-                <w:i/>
-                <w:color w:val="000000" w:themeColor="text1"/>
-                <w:sz w:val="20"/>
-                <w:szCs w:val="20"/>
-                <w:lang w:eastAsia="es-CL"/>
-              </w:rPr>
-              <w:t xml:space="preserve"> y el desarrollo iterativo, lo que permitió realizar ajustes oportunos en la planificación y priorizar tareas críticas. Asimismo, se aplicaron principios de diseño centrado en el usuario, asegurando una experiencia intuitiva para los streamers y cumpliendo con los objeti</w:t>
+              <w:t>La calidad del proyecto se resguardó mediante la correcta aplicación de la metodología Scrum y el desarrollo iterativo, lo que permitió realizar ajustes oportunos en la planificación y priorizar tareas críticas. Asimismo, se aplicaron principios de diseño centrado en el usuario, asegurando una experiencia intuitiva para los streamers y cumpliendo con los objeti</w:t>
             </w:r>
             <w:r>
               <w:rPr>
@@ -1929,8 +1571,10 @@
               <w:rPr>
                 <w:b/>
                 <w:i/>
+                <w:noProof/>
                 <w:color w:val="0070C0"/>
                 <w:sz w:val="18"/>
+                <w:lang w:val="en-US"/>
               </w:rPr>
               <w:drawing>
                 <wp:inline distT="0" distB="0" distL="0" distR="0" wp14:anchorId="59D0CDC7" wp14:editId="3A73273B">
@@ -1985,10 +1629,11 @@
               <w:rPr>
                 <w:rFonts w:ascii="Calibri" w:hAnsi="Calibri" w:cs="Arial"/>
                 <w:i/>
+                <w:noProof/>
                 <w:color w:val="000000" w:themeColor="text1"/>
                 <w:sz w:val="20"/>
                 <w:szCs w:val="20"/>
-                <w:lang w:eastAsia="es-CL"/>
+                <w:lang w:val="en-US"/>
               </w:rPr>
               <w:lastRenderedPageBreak/>
               <w:drawing>
@@ -2038,10 +1683,11 @@
               <w:rPr>
                 <w:rFonts w:ascii="Calibri" w:hAnsi="Calibri" w:cs="Arial"/>
                 <w:i/>
+                <w:noProof/>
                 <w:color w:val="000000" w:themeColor="text1"/>
                 <w:sz w:val="20"/>
                 <w:szCs w:val="20"/>
-                <w:lang w:eastAsia="es-CL"/>
+                <w:lang w:val="en-US"/>
               </w:rPr>
               <w:drawing>
                 <wp:inline distT="0" distB="0" distL="0" distR="0" wp14:anchorId="19B18CF9" wp14:editId="4B79D944">
@@ -2096,10 +1742,11 @@
               <w:rPr>
                 <w:rFonts w:ascii="Calibri" w:hAnsi="Calibri" w:cs="Arial"/>
                 <w:i/>
+                <w:noProof/>
                 <w:color w:val="000000" w:themeColor="text1"/>
                 <w:sz w:val="20"/>
                 <w:szCs w:val="20"/>
-                <w:lang w:eastAsia="es-CL"/>
+                <w:lang w:val="en-US"/>
               </w:rPr>
               <w:drawing>
                 <wp:inline distT="0" distB="0" distL="0" distR="0" wp14:anchorId="3D7172D9" wp14:editId="444FB9E9">
@@ -2163,119 +1810,739 @@
               </w:rPr>
             </w:pPr>
           </w:p>
+          <w:p>
+            <w:pPr>
+              <w:jc w:val="both"/>
+              <w:rPr>
+                <w:rFonts w:ascii="Calibri" w:hAnsi="Calibri" w:cs="Arial"/>
+                <w:b/>
+                <w:i/>
+                <w:color w:val="548DD4"/>
+                <w:sz w:val="20"/>
+                <w:szCs w:val="20"/>
+                <w:lang w:eastAsia="es-CL"/>
+              </w:rPr>
+            </w:pPr>
+          </w:p>
+          <w:p>
+            <w:pPr>
+              <w:jc w:val="both"/>
+              <w:rPr>
+                <w:rFonts w:ascii="Calibri" w:hAnsi="Calibri" w:cs="Arial"/>
+                <w:b/>
+                <w:i/>
+                <w:color w:val="548DD4"/>
+                <w:sz w:val="20"/>
+                <w:szCs w:val="20"/>
+                <w:lang w:eastAsia="es-CL"/>
+              </w:rPr>
+            </w:pPr>
+            <w:r>
+              <w:rPr>
+                <w:noProof/>
+                <w:lang w:val="en-US"/>
+              </w:rPr>
+              <w:drawing>
+                <wp:anchor distT="0" distB="0" distL="114300" distR="114300" simplePos="0" relativeHeight="251661312" behindDoc="0" locked="0" layoutInCell="1" allowOverlap="1" wp14:anchorId="2D199469" wp14:editId="495F4D52">
+                  <wp:simplePos x="0" y="0"/>
+                  <wp:positionH relativeFrom="column">
+                    <wp:posOffset>-6985</wp:posOffset>
+                  </wp:positionH>
+                  <wp:positionV relativeFrom="paragraph">
+                    <wp:posOffset>6350</wp:posOffset>
+                  </wp:positionV>
+                  <wp:extent cx="5400040" cy="1212850"/>
+                  <wp:effectExtent l="0" t="0" r="0" b="6350"/>
+                  <wp:wrapNone/>
+                  <wp:docPr id="1152258574" name="Imagen 1"/>
+                  <wp:cNvGraphicFramePr>
+                    <a:graphicFrameLocks xmlns:a="http://schemas.openxmlformats.org/drawingml/2006/main" noChangeAspect="1"/>
+                  </wp:cNvGraphicFramePr>
+                  <a:graphic xmlns:a="http://schemas.openxmlformats.org/drawingml/2006/main">
+                    <a:graphicData uri="http://schemas.openxmlformats.org/drawingml/2006/picture">
+                      <pic:pic xmlns:pic="http://schemas.openxmlformats.org/drawingml/2006/picture">
+                        <pic:nvPicPr>
+                          <pic:cNvPr id="1152258574" name="Imagen 1"/>
+                          <pic:cNvPicPr>
+                            <a:picLocks noChangeAspect="1"/>
+                          </pic:cNvPicPr>
+                        </pic:nvPicPr>
+                        <pic:blipFill>
+                          <a:blip r:embed="rId15">
+                            <a:extLst>
+                              <a:ext uri="{28A0092B-C50C-407E-A947-70E740481C1C}">
+                                <a14:useLocalDpi xmlns:a14="http://schemas.microsoft.com/office/drawing/2010/main" val="0"/>
+                              </a:ext>
+                            </a:extLst>
+                          </a:blip>
+                          <a:stretch>
+                            <a:fillRect/>
+                          </a:stretch>
+                        </pic:blipFill>
+                        <pic:spPr>
+                          <a:xfrm>
+                            <a:off x="0" y="0"/>
+                            <a:ext cx="5400040" cy="1212850"/>
+                          </a:xfrm>
+                          <a:prstGeom prst="rect">
+                            <a:avLst/>
+                          </a:prstGeom>
+                        </pic:spPr>
+                      </pic:pic>
+                    </a:graphicData>
+                  </a:graphic>
+                </wp:anchor>
+              </w:drawing>
+            </w:r>
+            <w:r>
+              <w:rPr>
+                <w:noProof/>
+                <w:lang w:val="en-US"/>
+              </w:rPr>
+              <w:drawing>
+                <wp:anchor distT="0" distB="0" distL="114300" distR="114300" simplePos="0" relativeHeight="251662336" behindDoc="0" locked="0" layoutInCell="1" allowOverlap="1" wp14:anchorId="68262013" wp14:editId="19A95837">
+                  <wp:simplePos x="0" y="0"/>
+                  <wp:positionH relativeFrom="column">
+                    <wp:posOffset>-1905</wp:posOffset>
+                  </wp:positionH>
+                  <wp:positionV relativeFrom="paragraph">
+                    <wp:posOffset>1501775</wp:posOffset>
+                  </wp:positionV>
+                  <wp:extent cx="5400040" cy="1380490"/>
+                  <wp:effectExtent l="0" t="0" r="0" b="0"/>
+                  <wp:wrapNone/>
+                  <wp:docPr id="1509154520" name="Imagen 1"/>
+                  <wp:cNvGraphicFramePr>
+                    <a:graphicFrameLocks xmlns:a="http://schemas.openxmlformats.org/drawingml/2006/main" noChangeAspect="1"/>
+                  </wp:cNvGraphicFramePr>
+                  <a:graphic xmlns:a="http://schemas.openxmlformats.org/drawingml/2006/main">
+                    <a:graphicData uri="http://schemas.openxmlformats.org/drawingml/2006/picture">
+                      <pic:pic xmlns:pic="http://schemas.openxmlformats.org/drawingml/2006/picture">
+                        <pic:nvPicPr>
+                          <pic:cNvPr id="1509154520" name="Imagen 1"/>
+                          <pic:cNvPicPr>
+                            <a:picLocks noChangeAspect="1"/>
+                          </pic:cNvPicPr>
+                        </pic:nvPicPr>
+                        <pic:blipFill>
+                          <a:blip r:embed="rId16">
+                            <a:extLst>
+                              <a:ext uri="{28A0092B-C50C-407E-A947-70E740481C1C}">
+                                <a14:useLocalDpi xmlns:a14="http://schemas.microsoft.com/office/drawing/2010/main" val="0"/>
+                              </a:ext>
+                            </a:extLst>
+                          </a:blip>
+                          <a:stretch>
+                            <a:fillRect/>
+                          </a:stretch>
+                        </pic:blipFill>
+                        <pic:spPr>
+                          <a:xfrm>
+                            <a:off x="0" y="0"/>
+                            <a:ext cx="5400040" cy="1380490"/>
+                          </a:xfrm>
+                          <a:prstGeom prst="rect">
+                            <a:avLst/>
+                          </a:prstGeom>
+                        </pic:spPr>
+                      </pic:pic>
+                    </a:graphicData>
+                  </a:graphic>
+                </wp:anchor>
+              </w:drawing>
+            </w:r>
+          </w:p>
+          <w:p>
+            <w:pPr>
+              <w:jc w:val="both"/>
+              <w:rPr>
+                <w:rFonts w:ascii="Calibri" w:hAnsi="Calibri" w:cs="Arial"/>
+                <w:b/>
+                <w:i/>
+                <w:color w:val="548DD4"/>
+                <w:sz w:val="20"/>
+                <w:szCs w:val="20"/>
+                <w:lang w:eastAsia="es-CL"/>
+              </w:rPr>
+            </w:pPr>
+          </w:p>
+          <w:p>
+            <w:pPr>
+              <w:jc w:val="both"/>
+              <w:rPr>
+                <w:rFonts w:ascii="Calibri" w:hAnsi="Calibri" w:cs="Arial"/>
+                <w:b/>
+                <w:i/>
+                <w:color w:val="548DD4"/>
+                <w:sz w:val="20"/>
+                <w:szCs w:val="20"/>
+                <w:lang w:eastAsia="es-CL"/>
+              </w:rPr>
+            </w:pPr>
+          </w:p>
+          <w:p>
+            <w:pPr>
+              <w:jc w:val="both"/>
+              <w:rPr>
+                <w:rFonts w:ascii="Calibri" w:hAnsi="Calibri" w:cs="Arial"/>
+                <w:b/>
+                <w:i/>
+                <w:color w:val="548DD4"/>
+                <w:sz w:val="20"/>
+                <w:szCs w:val="20"/>
+                <w:lang w:eastAsia="es-CL"/>
+              </w:rPr>
+            </w:pPr>
+          </w:p>
+          <w:p>
+            <w:pPr>
+              <w:jc w:val="both"/>
+              <w:rPr>
+                <w:rFonts w:ascii="Calibri" w:hAnsi="Calibri" w:cs="Arial"/>
+                <w:b/>
+                <w:i/>
+                <w:color w:val="548DD4"/>
+                <w:sz w:val="20"/>
+                <w:szCs w:val="20"/>
+                <w:lang w:eastAsia="es-CL"/>
+              </w:rPr>
+            </w:pPr>
+          </w:p>
+          <w:p>
+            <w:pPr>
+              <w:jc w:val="both"/>
+              <w:rPr>
+                <w:rFonts w:ascii="Calibri" w:hAnsi="Calibri" w:cs="Arial"/>
+                <w:b/>
+                <w:i/>
+                <w:color w:val="548DD4"/>
+                <w:sz w:val="20"/>
+                <w:szCs w:val="20"/>
+                <w:lang w:eastAsia="es-CL"/>
+              </w:rPr>
+            </w:pPr>
+          </w:p>
+          <w:p>
+            <w:pPr>
+              <w:jc w:val="both"/>
+              <w:rPr>
+                <w:rFonts w:ascii="Calibri" w:hAnsi="Calibri" w:cs="Arial"/>
+                <w:b/>
+                <w:i/>
+                <w:color w:val="548DD4"/>
+                <w:sz w:val="20"/>
+                <w:szCs w:val="20"/>
+                <w:lang w:eastAsia="es-CL"/>
+              </w:rPr>
+            </w:pPr>
+          </w:p>
+          <w:p>
+            <w:pPr>
+              <w:jc w:val="both"/>
+              <w:rPr>
+                <w:rFonts w:ascii="Calibri" w:hAnsi="Calibri" w:cs="Arial"/>
+                <w:b/>
+                <w:i/>
+                <w:color w:val="548DD4"/>
+                <w:sz w:val="20"/>
+                <w:szCs w:val="20"/>
+                <w:lang w:eastAsia="es-CL"/>
+              </w:rPr>
+            </w:pPr>
+          </w:p>
+          <w:p>
+            <w:pPr>
+              <w:jc w:val="both"/>
+              <w:rPr>
+                <w:rFonts w:ascii="Calibri" w:hAnsi="Calibri" w:cs="Arial"/>
+                <w:b/>
+                <w:i/>
+                <w:color w:val="548DD4"/>
+                <w:sz w:val="20"/>
+                <w:szCs w:val="20"/>
+                <w:lang w:eastAsia="es-CL"/>
+              </w:rPr>
+            </w:pPr>
+          </w:p>
+          <w:p>
+            <w:pPr>
+              <w:jc w:val="both"/>
+              <w:rPr>
+                <w:rFonts w:ascii="Calibri" w:hAnsi="Calibri" w:cs="Arial"/>
+                <w:b/>
+                <w:i/>
+                <w:color w:val="548DD4"/>
+                <w:sz w:val="20"/>
+                <w:szCs w:val="20"/>
+                <w:lang w:eastAsia="es-CL"/>
+              </w:rPr>
+            </w:pPr>
+          </w:p>
+          <w:p>
+            <w:pPr>
+              <w:jc w:val="both"/>
+              <w:rPr>
+                <w:rFonts w:ascii="Calibri" w:hAnsi="Calibri" w:cs="Arial"/>
+                <w:b/>
+                <w:i/>
+                <w:color w:val="548DD4"/>
+                <w:sz w:val="20"/>
+                <w:szCs w:val="20"/>
+                <w:lang w:eastAsia="es-CL"/>
+              </w:rPr>
+            </w:pPr>
+          </w:p>
+          <w:p>
+            <w:pPr>
+              <w:jc w:val="both"/>
+              <w:rPr>
+                <w:rFonts w:ascii="Calibri" w:hAnsi="Calibri" w:cs="Arial"/>
+                <w:b/>
+                <w:i/>
+                <w:color w:val="548DD4"/>
+                <w:sz w:val="20"/>
+                <w:szCs w:val="20"/>
+                <w:lang w:eastAsia="es-CL"/>
+              </w:rPr>
+            </w:pPr>
+          </w:p>
+          <w:p>
+            <w:pPr>
+              <w:jc w:val="both"/>
+              <w:rPr>
+                <w:rFonts w:ascii="Calibri" w:hAnsi="Calibri" w:cs="Arial"/>
+                <w:b/>
+                <w:i/>
+                <w:color w:val="548DD4"/>
+                <w:sz w:val="20"/>
+                <w:szCs w:val="20"/>
+                <w:lang w:eastAsia="es-CL"/>
+              </w:rPr>
+            </w:pPr>
+          </w:p>
+          <w:p>
+            <w:pPr>
+              <w:jc w:val="both"/>
+              <w:rPr>
+                <w:rFonts w:ascii="Calibri" w:hAnsi="Calibri" w:cs="Arial"/>
+                <w:b/>
+                <w:i/>
+                <w:color w:val="548DD4"/>
+                <w:sz w:val="20"/>
+                <w:szCs w:val="20"/>
+                <w:lang w:eastAsia="es-CL"/>
+              </w:rPr>
+            </w:pPr>
+            <w:r>
+              <w:rPr>
+                <w:noProof/>
+                <w:lang w:val="en-US"/>
+              </w:rPr>
+              <w:drawing>
+                <wp:inline distT="0" distB="0" distL="0" distR="0" wp14:anchorId="1F823CEA" wp14:editId="6267A65C">
+                  <wp:extent cx="5400040" cy="3138170"/>
+                  <wp:effectExtent l="0" t="0" r="0" b="5080"/>
+                  <wp:docPr id="1231370918" name="Imagen 1"/>
+                  <wp:cNvGraphicFramePr>
+                    <a:graphicFrameLocks xmlns:a="http://schemas.openxmlformats.org/drawingml/2006/main" noChangeAspect="1"/>
+                  </wp:cNvGraphicFramePr>
+                  <a:graphic xmlns:a="http://schemas.openxmlformats.org/drawingml/2006/main">
+                    <a:graphicData uri="http://schemas.openxmlformats.org/drawingml/2006/picture">
+                      <pic:pic xmlns:pic="http://schemas.openxmlformats.org/drawingml/2006/picture">
+                        <pic:nvPicPr>
+                          <pic:cNvPr id="1231370918" name="Imagen 1"/>
+                          <pic:cNvPicPr>
+                            <a:picLocks noChangeAspect="1"/>
+                          </pic:cNvPicPr>
+                        </pic:nvPicPr>
+                        <pic:blipFill>
+                          <a:blip r:embed="rId17">
+                            <a:extLst>
+                              <a:ext uri="{28A0092B-C50C-407E-A947-70E740481C1C}">
+                                <a14:useLocalDpi xmlns:a14="http://schemas.microsoft.com/office/drawing/2010/main" val="0"/>
+                              </a:ext>
+                            </a:extLst>
+                          </a:blip>
+                          <a:stretch>
+                            <a:fillRect/>
+                          </a:stretch>
+                        </pic:blipFill>
+                        <pic:spPr>
+                          <a:xfrm>
+                            <a:off x="0" y="0"/>
+                            <a:ext cx="5400040" cy="3138170"/>
+                          </a:xfrm>
+                          <a:prstGeom prst="rect">
+                            <a:avLst/>
+                          </a:prstGeom>
+                        </pic:spPr>
+                      </pic:pic>
+                    </a:graphicData>
+                  </a:graphic>
+                </wp:inline>
+              </w:drawing>
+            </w:r>
+          </w:p>
+          <w:p>
+            <w:pPr>
+              <w:jc w:val="both"/>
+              <w:rPr>
+                <w:rFonts w:ascii="Calibri" w:hAnsi="Calibri" w:cs="Arial"/>
+                <w:b/>
+                <w:i/>
+                <w:color w:val="548DD4"/>
+                <w:sz w:val="20"/>
+                <w:szCs w:val="20"/>
+                <w:lang w:eastAsia="es-CL"/>
+              </w:rPr>
+            </w:pPr>
+          </w:p>
+          <w:p>
+            <w:pPr>
+              <w:jc w:val="both"/>
+              <w:rPr>
+                <w:rFonts w:ascii="Calibri" w:hAnsi="Calibri" w:cs="Arial"/>
+                <w:b/>
+                <w:i/>
+                <w:color w:val="548DD4"/>
+                <w:sz w:val="20"/>
+                <w:szCs w:val="20"/>
+                <w:lang w:eastAsia="es-CL"/>
+              </w:rPr>
+            </w:pPr>
+          </w:p>
+          <w:p>
+            <w:pPr>
+              <w:jc w:val="both"/>
+              <w:rPr>
+                <w:rFonts w:ascii="Calibri" w:hAnsi="Calibri" w:cs="Arial"/>
+                <w:b/>
+                <w:i/>
+                <w:color w:val="548DD4"/>
+                <w:sz w:val="20"/>
+                <w:szCs w:val="20"/>
+                <w:lang w:eastAsia="es-CL"/>
+              </w:rPr>
+            </w:pPr>
+          </w:p>
+          <w:p>
+            <w:pPr>
+              <w:jc w:val="both"/>
+              <w:rPr>
+                <w:rFonts w:ascii="Calibri" w:hAnsi="Calibri" w:cs="Arial"/>
+                <w:b/>
+                <w:i/>
+                <w:color w:val="548DD4"/>
+                <w:sz w:val="20"/>
+                <w:szCs w:val="20"/>
+                <w:lang w:eastAsia="es-CL"/>
+              </w:rPr>
+            </w:pPr>
+          </w:p>
+          <w:p>
+            <w:pPr>
+              <w:jc w:val="both"/>
+              <w:rPr>
+                <w:rFonts w:ascii="Calibri" w:hAnsi="Calibri" w:cs="Arial"/>
+                <w:b/>
+                <w:i/>
+                <w:color w:val="548DD4"/>
+                <w:sz w:val="20"/>
+                <w:szCs w:val="20"/>
+                <w:lang w:eastAsia="es-CL"/>
+              </w:rPr>
+            </w:pPr>
+          </w:p>
+          <w:p>
+            <w:pPr>
+              <w:jc w:val="both"/>
+              <w:rPr>
+                <w:rFonts w:ascii="Calibri" w:hAnsi="Calibri" w:cs="Arial"/>
+                <w:b/>
+                <w:i/>
+                <w:color w:val="548DD4"/>
+                <w:sz w:val="20"/>
+                <w:szCs w:val="20"/>
+                <w:lang w:eastAsia="es-CL"/>
+              </w:rPr>
+            </w:pPr>
+          </w:p>
+          <w:p>
+            <w:pPr>
+              <w:jc w:val="both"/>
+              <w:rPr>
+                <w:rFonts w:ascii="Calibri" w:hAnsi="Calibri" w:cs="Arial"/>
+                <w:b/>
+                <w:i/>
+                <w:color w:val="548DD4"/>
+                <w:sz w:val="20"/>
+                <w:szCs w:val="20"/>
+                <w:lang w:eastAsia="es-CL"/>
+              </w:rPr>
+            </w:pPr>
+          </w:p>
+          <w:p>
+            <w:pPr>
+              <w:jc w:val="both"/>
+              <w:rPr>
+                <w:rFonts w:ascii="Calibri" w:hAnsi="Calibri" w:cs="Arial"/>
+                <w:b/>
+                <w:i/>
+                <w:color w:val="548DD4"/>
+                <w:sz w:val="20"/>
+                <w:szCs w:val="20"/>
+                <w:lang w:eastAsia="es-CL"/>
+              </w:rPr>
+            </w:pPr>
+            <w:r>
+              <w:rPr>
+                <w:rFonts w:ascii="Calibri" w:hAnsi="Calibri" w:cs="Arial"/>
+                <w:b/>
+                <w:i/>
+                <w:noProof/>
+                <w:color w:val="548DD4"/>
+                <w:sz w:val="20"/>
+                <w:szCs w:val="20"/>
+                <w:lang w:val="en-US"/>
+              </w:rPr>
+              <w:drawing>
+                <wp:inline distT="0" distB="0" distL="0" distR="0" wp14:anchorId="4BD58C6B" wp14:editId="5A78B891">
+                  <wp:extent cx="5400040" cy="1784985"/>
+                  <wp:effectExtent l="0" t="0" r="0" b="5715"/>
+                  <wp:docPr id="295720241" name="Imagen 1"/>
+                  <wp:cNvGraphicFramePr>
+                    <a:graphicFrameLocks xmlns:a="http://schemas.openxmlformats.org/drawingml/2006/main" noChangeAspect="1"/>
+                  </wp:cNvGraphicFramePr>
+                  <a:graphic xmlns:a="http://schemas.openxmlformats.org/drawingml/2006/main">
+                    <a:graphicData uri="http://schemas.openxmlformats.org/drawingml/2006/picture">
+                      <pic:pic xmlns:pic="http://schemas.openxmlformats.org/drawingml/2006/picture">
+                        <pic:nvPicPr>
+                          <pic:cNvPr id="295720241" name=""/>
+                          <pic:cNvPicPr/>
+                        </pic:nvPicPr>
+                        <pic:blipFill>
+                          <a:blip r:embed="rId18"/>
+                          <a:stretch>
+                            <a:fillRect/>
+                          </a:stretch>
+                        </pic:blipFill>
+                        <pic:spPr>
+                          <a:xfrm>
+                            <a:off x="0" y="0"/>
+                            <a:ext cx="5400040" cy="1784985"/>
+                          </a:xfrm>
+                          <a:prstGeom prst="rect">
+                            <a:avLst/>
+                          </a:prstGeom>
+                        </pic:spPr>
+                      </pic:pic>
+                    </a:graphicData>
+                  </a:graphic>
+                </wp:inline>
+              </w:drawing>
+            </w:r>
+          </w:p>
+          <w:p>
+            <w:pPr>
+              <w:jc w:val="both"/>
+              <w:rPr>
+                <w:rFonts w:ascii="Calibri" w:hAnsi="Calibri" w:cs="Arial"/>
+                <w:b/>
+                <w:i/>
+                <w:color w:val="548DD4"/>
+                <w:sz w:val="20"/>
+                <w:szCs w:val="20"/>
+                <w:lang w:eastAsia="es-CL"/>
+              </w:rPr>
+            </w:pPr>
+          </w:p>
+          <w:p>
+            <w:pPr>
+              <w:jc w:val="both"/>
+              <w:rPr>
+                <w:rFonts w:ascii="Calibri" w:hAnsi="Calibri" w:cs="Arial"/>
+                <w:b/>
+                <w:i/>
+                <w:color w:val="548DD4"/>
+                <w:sz w:val="20"/>
+                <w:szCs w:val="20"/>
+                <w:lang w:eastAsia="es-CL"/>
+              </w:rPr>
+            </w:pPr>
+          </w:p>
+          <w:p>
+            <w:pPr>
+              <w:jc w:val="both"/>
+              <w:rPr>
+                <w:rFonts w:ascii="Calibri" w:hAnsi="Calibri" w:cs="Arial"/>
+                <w:b/>
+                <w:i/>
+                <w:color w:val="548DD4"/>
+                <w:sz w:val="20"/>
+                <w:szCs w:val="20"/>
+                <w:lang w:eastAsia="es-CL"/>
+              </w:rPr>
+            </w:pPr>
+          </w:p>
+          <w:p>
+            <w:pPr>
+              <w:jc w:val="both"/>
+              <w:rPr>
+                <w:rFonts w:ascii="Calibri" w:hAnsi="Calibri" w:cs="Arial"/>
+                <w:b/>
+                <w:i/>
+                <w:color w:val="548DD4"/>
+                <w:sz w:val="20"/>
+                <w:szCs w:val="20"/>
+                <w:lang w:eastAsia="es-CL"/>
+              </w:rPr>
+            </w:pPr>
+          </w:p>
+          <w:p>
+            <w:pPr>
+              <w:jc w:val="both"/>
+              <w:rPr>
+                <w:rFonts w:ascii="Calibri" w:hAnsi="Calibri" w:cs="Arial"/>
+                <w:b/>
+                <w:i/>
+                <w:color w:val="548DD4"/>
+                <w:sz w:val="20"/>
+                <w:szCs w:val="20"/>
+                <w:lang w:eastAsia="es-CL"/>
+              </w:rPr>
+            </w:pPr>
+          </w:p>
+          <w:p>
+            <w:pPr>
+              <w:jc w:val="both"/>
+              <w:rPr>
+                <w:rFonts w:ascii="Calibri" w:hAnsi="Calibri" w:cs="Arial"/>
+                <w:b/>
+                <w:i/>
+                <w:color w:val="548DD4"/>
+                <w:sz w:val="20"/>
+                <w:szCs w:val="20"/>
+                <w:lang w:eastAsia="es-CL"/>
+              </w:rPr>
+            </w:pPr>
+          </w:p>
+          <w:p>
+            <w:pPr>
+              <w:jc w:val="both"/>
+              <w:rPr>
+                <w:rFonts w:ascii="Calibri" w:hAnsi="Calibri" w:cs="Arial"/>
+                <w:b/>
+                <w:i/>
+                <w:color w:val="548DD4"/>
+                <w:sz w:val="20"/>
+                <w:szCs w:val="20"/>
+                <w:lang w:eastAsia="es-CL"/>
+              </w:rPr>
+            </w:pPr>
+          </w:p>
+          <w:p>
+            <w:pPr>
+              <w:jc w:val="both"/>
+              <w:rPr>
+                <w:rFonts w:ascii="Calibri" w:hAnsi="Calibri" w:cs="Arial"/>
+                <w:b/>
+                <w:i/>
+                <w:color w:val="548DD4"/>
+                <w:sz w:val="20"/>
+                <w:szCs w:val="20"/>
+                <w:lang w:eastAsia="es-CL"/>
+              </w:rPr>
+            </w:pPr>
+          </w:p>
+          <w:p>
+            <w:pPr>
+              <w:jc w:val="both"/>
+              <w:rPr>
+                <w:rFonts w:ascii="Calibri" w:hAnsi="Calibri" w:cs="Arial"/>
+                <w:b/>
+                <w:i/>
+                <w:color w:val="548DD4"/>
+                <w:sz w:val="20"/>
+                <w:szCs w:val="20"/>
+                <w:lang w:eastAsia="es-CL"/>
+              </w:rPr>
+            </w:pPr>
+          </w:p>
         </w:tc>
       </w:tr>
     </w:tbl>
-    <w:tbl>
-      <w:tblPr>
-        <w:tblStyle w:val="Tablaconcuadrcula"/>
-        <w:tblpPr w:leftFromText="141" w:rightFromText="141" w:vertAnchor="text" w:horzAnchor="margin" w:tblpX="-719" w:tblpY="-116"/>
-        <w:tblW w:w="9640" w:type="dxa"/>
-        <w:tblBorders>
-          <w:top w:val="single" w:sz="4" w:space="0" w:color="BFBFBF" w:themeColor="background1" w:themeShade="BF"/>
-          <w:left w:val="single" w:sz="4" w:space="0" w:color="BFBFBF" w:themeColor="background1" w:themeShade="BF"/>
-          <w:bottom w:val="single" w:sz="4" w:space="0" w:color="BFBFBF" w:themeColor="background1" w:themeShade="BF"/>
-          <w:right w:val="single" w:sz="4" w:space="0" w:color="BFBFBF" w:themeColor="background1" w:themeShade="BF"/>
-          <w:insideH w:val="single" w:sz="4" w:space="0" w:color="BFBFBF" w:themeColor="background1" w:themeShade="BF"/>
-          <w:insideV w:val="single" w:sz="4" w:space="0" w:color="BFBFBF" w:themeColor="background1" w:themeShade="BF"/>
-        </w:tblBorders>
-        <w:tblLook w:val="04A0" w:firstRow="1" w:lastRow="0" w:firstColumn="1" w:lastColumn="0" w:noHBand="0" w:noVBand="1"/>
-      </w:tblPr>
-      <w:tblGrid>
-        <w:gridCol w:w="9640"/>
-      </w:tblGrid>
-      <w:tr>
-        <w:trPr>
-          <w:trHeight w:val="440"/>
-        </w:trPr>
-        <w:tc>
-          <w:tcPr>
-            <w:tcW w:w="9640" w:type="dxa"/>
-            <w:vAlign w:val="center"/>
-          </w:tcPr>
-          <w:p>
-            <w:pPr>
-              <w:rPr>
-                <w:b/>
-                <w:color w:val="1F3864" w:themeColor="accent1" w:themeShade="80"/>
-                <w:sz w:val="28"/>
-                <w:szCs w:val="28"/>
-              </w:rPr>
-            </w:pPr>
-            <w:r>
-              <w:rPr>
-                <w:b/>
-                <w:color w:val="1F3864" w:themeColor="accent1" w:themeShade="80"/>
-                <w:sz w:val="28"/>
-                <w:szCs w:val="28"/>
-              </w:rPr>
-              <w:lastRenderedPageBreak/>
-              <w:t>2</w:t>
-            </w:r>
-            <w:r>
-              <w:rPr>
-                <w:b/>
-                <w:color w:val="1F3864" w:themeColor="accent1" w:themeShade="80"/>
-                <w:sz w:val="28"/>
-                <w:szCs w:val="28"/>
-              </w:rPr>
-              <w:t xml:space="preserve">. </w:t>
-            </w:r>
-            <w:r>
-              <w:rPr>
-                <w:b/>
-                <w:color w:val="1F3864" w:themeColor="accent1" w:themeShade="80"/>
-                <w:sz w:val="28"/>
-                <w:szCs w:val="28"/>
-              </w:rPr>
-              <w:t xml:space="preserve">Monitoreo del Plan de Trabajo </w:t>
-            </w:r>
-          </w:p>
-        </w:tc>
-      </w:tr>
-      <w:tr>
-        <w:trPr>
-          <w:trHeight w:val="800"/>
-        </w:trPr>
-        <w:tc>
-          <w:tcPr>
-            <w:tcW w:w="9640" w:type="dxa"/>
-            <w:shd w:val="clear" w:color="auto" w:fill="D9E2F3" w:themeFill="accent1" w:themeFillTint="33"/>
-            <w:vAlign w:val="center"/>
-          </w:tcPr>
-          <w:p>
-            <w:pPr>
-              <w:jc w:val="both"/>
-              <w:rPr>
-                <w:rFonts w:ascii="Calibri" w:hAnsi="Calibri"/>
-                <w:color w:val="1F3864" w:themeColor="accent1" w:themeShade="80"/>
-              </w:rPr>
-            </w:pPr>
-            <w:r>
-              <w:rPr>
-                <w:rFonts w:ascii="Calibri" w:hAnsi="Calibri"/>
-                <w:color w:val="1F3864" w:themeColor="accent1" w:themeShade="80"/>
-              </w:rPr>
-              <w:t xml:space="preserve">Examina cuidadosamente tu plan de trabajo, enfocándote especialmente en la columna de </w:t>
-            </w:r>
-            <w:r>
-              <w:rPr>
-                <w:rFonts w:ascii="Calibri" w:hAnsi="Calibri"/>
-                <w:color w:val="1F3864" w:themeColor="accent1" w:themeShade="80"/>
-              </w:rPr>
-              <w:t xml:space="preserve">estado de avance </w:t>
-            </w:r>
-            <w:r>
-              <w:rPr>
-                <w:rFonts w:ascii="Calibri" w:hAnsi="Calibri"/>
-                <w:color w:val="1F3864" w:themeColor="accent1" w:themeShade="80"/>
-              </w:rPr>
-              <w:t>y ajustes.</w:t>
-            </w:r>
-          </w:p>
-        </w:tc>
-      </w:tr>
-    </w:tbl>
+    <w:p>
+      <w:pPr>
+        <w:spacing w:after="0" w:line="240" w:lineRule="auto"/>
+        <w:rPr>
+          <w:rFonts w:cs="Calibri Light"/>
+          <w:color w:val="595959" w:themeColor="text1" w:themeTint="A6"/>
+          <w:sz w:val="24"/>
+          <w:szCs w:val="24"/>
+          <w:lang w:val="es-ES"/>
+        </w:rPr>
+      </w:pPr>
+    </w:p>
+    <w:p>
+      <w:pPr>
+        <w:spacing w:after="0" w:line="240" w:lineRule="auto"/>
+        <w:rPr>
+          <w:rFonts w:cs="Calibri Light"/>
+          <w:color w:val="595959" w:themeColor="text1" w:themeTint="A6"/>
+          <w:sz w:val="24"/>
+          <w:szCs w:val="24"/>
+          <w:lang w:val="es-ES"/>
+        </w:rPr>
+      </w:pPr>
+    </w:p>
+    <w:p>
+      <w:pPr>
+        <w:spacing w:after="0" w:line="240" w:lineRule="auto"/>
+        <w:rPr>
+          <w:rFonts w:cs="Calibri Light"/>
+          <w:color w:val="595959" w:themeColor="text1" w:themeTint="A6"/>
+          <w:sz w:val="24"/>
+          <w:szCs w:val="24"/>
+          <w:lang w:val="es-ES"/>
+        </w:rPr>
+      </w:pPr>
+    </w:p>
+    <w:p>
+      <w:pPr>
+        <w:spacing w:after="0" w:line="240" w:lineRule="auto"/>
+        <w:rPr>
+          <w:rFonts w:cs="Calibri Light"/>
+          <w:color w:val="595959" w:themeColor="text1" w:themeTint="A6"/>
+          <w:sz w:val="24"/>
+          <w:szCs w:val="24"/>
+          <w:lang w:val="es-ES"/>
+        </w:rPr>
+      </w:pPr>
+    </w:p>
+    <w:p>
+      <w:pPr>
+        <w:spacing w:after="0" w:line="240" w:lineRule="auto"/>
+        <w:rPr>
+          <w:rFonts w:cs="Calibri Light"/>
+          <w:color w:val="595959" w:themeColor="text1" w:themeTint="A6"/>
+          <w:sz w:val="24"/>
+          <w:szCs w:val="24"/>
+          <w:lang w:val="es-ES"/>
+        </w:rPr>
+      </w:pPr>
+    </w:p>
+    <w:p>
+      <w:pPr>
+        <w:spacing w:after="0" w:line="240" w:lineRule="auto"/>
+        <w:rPr>
+          <w:rFonts w:cs="Calibri Light"/>
+          <w:color w:val="595959" w:themeColor="text1" w:themeTint="A6"/>
+          <w:sz w:val="24"/>
+          <w:szCs w:val="24"/>
+          <w:lang w:val="es-ES"/>
+        </w:rPr>
+      </w:pPr>
+    </w:p>
     <w:p>
       <w:pPr>
         <w:spacing w:after="0" w:line="240" w:lineRule="auto"/>
@@ -2292,7 +2559,7 @@
       <w:tblPr>
         <w:tblStyle w:val="Tablaconcuadrcula"/>
         <w:tblpPr w:leftFromText="180" w:rightFromText="180" w:vertAnchor="page" w:horzAnchor="margin" w:tblpXSpec="center" w:tblpY="3517"/>
-        <w:tblW w:w="9776" w:type="dxa"/>
+        <w:tblW w:w="11058" w:type="dxa"/>
         <w:tblBorders>
           <w:top w:val="single" w:sz="4" w:space="0" w:color="BFBFBF" w:themeColor="background1" w:themeShade="BF"/>
           <w:left w:val="single" w:sz="4" w:space="0" w:color="BFBFBF" w:themeColor="background1" w:themeShade="BF"/>
@@ -2305,14 +2572,14 @@
         <w:tblLook w:val="04A0" w:firstRow="1" w:lastRow="0" w:firstColumn="1" w:lastColumn="0" w:noHBand="0" w:noVBand="1"/>
       </w:tblPr>
       <w:tblGrid>
-        <w:gridCol w:w="1328"/>
+        <w:gridCol w:w="1759"/>
         <w:gridCol w:w="1077"/>
         <w:gridCol w:w="1276"/>
         <w:gridCol w:w="1276"/>
         <w:gridCol w:w="1275"/>
         <w:gridCol w:w="1276"/>
         <w:gridCol w:w="1418"/>
-        <w:gridCol w:w="850"/>
+        <w:gridCol w:w="1701"/>
       </w:tblGrid>
       <w:tr>
         <w:trPr>
@@ -2320,7 +2587,7 @@
         </w:trPr>
         <w:tc>
           <w:tcPr>
-            <w:tcW w:w="9776" w:type="dxa"/>
+            <w:tcW w:w="11058" w:type="dxa"/>
             <w:gridSpan w:val="8"/>
             <w:vAlign w:val="center"/>
           </w:tcPr>
@@ -2339,6 +2606,7 @@
                 <w:color w:val="1F3864" w:themeColor="accent1" w:themeShade="80"/>
                 <w:sz w:val="18"/>
               </w:rPr>
+              <w:lastRenderedPageBreak/>
               <w:t>Plan de Trabajo</w:t>
             </w:r>
           </w:p>
@@ -2350,7 +2618,7 @@
         </w:trPr>
         <w:tc>
           <w:tcPr>
-            <w:tcW w:w="1328" w:type="dxa"/>
+            <w:tcW w:w="1759" w:type="dxa"/>
             <w:vAlign w:val="center"/>
           </w:tcPr>
           <w:p>
@@ -2543,7 +2811,7 @@
         </w:tc>
         <w:tc>
           <w:tcPr>
-            <w:tcW w:w="850" w:type="dxa"/>
+            <w:tcW w:w="1701" w:type="dxa"/>
             <w:vAlign w:val="center"/>
           </w:tcPr>
           <w:p>
@@ -2580,7 +2848,7 @@
         </w:trPr>
         <w:tc>
           <w:tcPr>
-            <w:tcW w:w="1328" w:type="dxa"/>
+            <w:tcW w:w="1759" w:type="dxa"/>
           </w:tcPr>
           <w:p>
             <w:pPr>
@@ -3099,7 +3367,7 @@
         </w:tc>
         <w:tc>
           <w:tcPr>
-            <w:tcW w:w="850" w:type="dxa"/>
+            <w:tcW w:w="1701" w:type="dxa"/>
           </w:tcPr>
           <w:p>
             <w:pPr>
@@ -3177,7 +3445,7 @@
         </w:trPr>
         <w:tc>
           <w:tcPr>
-            <w:tcW w:w="1328" w:type="dxa"/>
+            <w:tcW w:w="1759" w:type="dxa"/>
           </w:tcPr>
           <w:p>
             <w:pPr>
@@ -3206,90 +3474,66 @@
               <w:rPr>
                 <w:lang w:val="es-ES"/>
               </w:rPr>
-              <w:t xml:space="preserve">Identificar y documentar requisitos funcionales y no funcionales, definición del </w:t>
-            </w:r>
-            <w:proofErr w:type="spellStart"/>
+              <w:t>Identificar y documentar requisitos funcionales y no funcionales, definición del backlog y organización de sprints</w:t>
+            </w:r>
+          </w:p>
+        </w:tc>
+        <w:tc>
+          <w:tcPr>
+            <w:tcW w:w="1276" w:type="dxa"/>
+          </w:tcPr>
+          <w:p>
+            <w:r>
+              <w:t xml:space="preserve">Jira, GitHub, </w:t>
+            </w:r>
+          </w:p>
+          <w:p>
+            <w:pPr>
+              <w:jc w:val="both"/>
+            </w:pPr>
+            <w:r>
+              <w:t>Gemini</w:t>
+            </w:r>
+          </w:p>
+        </w:tc>
+        <w:tc>
+          <w:tcPr>
+            <w:tcW w:w="1276" w:type="dxa"/>
+          </w:tcPr>
+          <w:p>
+            <w:pPr>
+              <w:jc w:val="both"/>
+            </w:pPr>
+            <w:r>
+              <w:t>1 semana (S1)</w:t>
+            </w:r>
+          </w:p>
+        </w:tc>
+        <w:tc>
+          <w:tcPr>
+            <w:tcW w:w="1275" w:type="dxa"/>
+          </w:tcPr>
+          <w:p>
+            <w:pPr>
+              <w:jc w:val="both"/>
+            </w:pPr>
+            <w:r>
+              <w:t>Coordinador / Project Manager</w:t>
+            </w:r>
+          </w:p>
+        </w:tc>
+        <w:tc>
+          <w:tcPr>
+            <w:tcW w:w="1276" w:type="dxa"/>
+          </w:tcPr>
+          <w:p>
+            <w:pPr>
+              <w:jc w:val="both"/>
+            </w:pPr>
             <w:r>
               <w:rPr>
                 <w:lang w:val="es-ES"/>
               </w:rPr>
-              <w:t>backlog</w:t>
-            </w:r>
-            <w:proofErr w:type="spellEnd"/>
-            <w:r>
-              <w:rPr>
-                <w:lang w:val="es-ES"/>
-              </w:rPr>
-              <w:t xml:space="preserve"> y organización de </w:t>
-            </w:r>
-            <w:proofErr w:type="spellStart"/>
-            <w:r>
-              <w:rPr>
-                <w:lang w:val="es-ES"/>
-              </w:rPr>
-              <w:t>sprints</w:t>
-            </w:r>
-            <w:proofErr w:type="spellEnd"/>
-          </w:p>
-        </w:tc>
-        <w:tc>
-          <w:tcPr>
-            <w:tcW w:w="1276" w:type="dxa"/>
-          </w:tcPr>
-          <w:p>
-            <w:r>
-              <w:t xml:space="preserve">Jira, GitHub, </w:t>
-            </w:r>
-          </w:p>
-          <w:p>
-            <w:pPr>
-              <w:jc w:val="both"/>
-            </w:pPr>
-            <w:proofErr w:type="spellStart"/>
-            <w:r>
-              <w:t>Gemini</w:t>
-            </w:r>
-            <w:proofErr w:type="spellEnd"/>
-          </w:p>
-        </w:tc>
-        <w:tc>
-          <w:tcPr>
-            <w:tcW w:w="1276" w:type="dxa"/>
-          </w:tcPr>
-          <w:p>
-            <w:pPr>
-              <w:jc w:val="both"/>
-            </w:pPr>
-            <w:r>
-              <w:t>1 semana (S1)</w:t>
-            </w:r>
-          </w:p>
-        </w:tc>
-        <w:tc>
-          <w:tcPr>
-            <w:tcW w:w="1275" w:type="dxa"/>
-          </w:tcPr>
-          <w:p>
-            <w:pPr>
-              <w:jc w:val="both"/>
-            </w:pPr>
-            <w:r>
-              <w:t>Coordinador / Project Manager</w:t>
-            </w:r>
-          </w:p>
-        </w:tc>
-        <w:tc>
-          <w:tcPr>
-            <w:tcW w:w="1276" w:type="dxa"/>
-          </w:tcPr>
-          <w:p>
-            <w:pPr>
-              <w:jc w:val="both"/>
-            </w:pPr>
-            <w:r>
-              <w:rPr>
-                <w:lang w:val="es-ES"/>
-              </w:rPr>
               <w:t>Permite planificar y priorizar tareas del proyecto</w:t>
             </w:r>
           </w:p>
@@ -3323,7 +3567,7 @@
         </w:tc>
         <w:tc>
           <w:tcPr>
-            <w:tcW w:w="850" w:type="dxa"/>
+            <w:tcW w:w="1701" w:type="dxa"/>
           </w:tcPr>
           <w:p>
             <w:pPr>
@@ -3354,18 +3598,7 @@
                 <w:szCs w:val="20"/>
                 <w:lang w:eastAsia="es-CL"/>
               </w:rPr>
-              <w:t xml:space="preserve">os funcionales y no funcionales, lo cual, el proyecto no se </w:t>
-            </w:r>
-            <w:r>
-              <w:rPr>
-                <w:rFonts w:ascii="Calibri" w:hAnsi="Calibri" w:cs="Arial"/>
-                <w:i/>
-                <w:sz w:val="18"/>
-                <w:szCs w:val="20"/>
-                <w:lang w:eastAsia="es-CL"/>
-              </w:rPr>
-              <w:lastRenderedPageBreak/>
-              <w:t>vio en la necesidad de utilizar jira.</w:t>
+              <w:t>os funcionales y no funcionales, lo cual, el proyecto no se vio en la necesidad de utilizar jira.</w:t>
             </w:r>
           </w:p>
         </w:tc>
@@ -3376,7 +3609,7 @@
         </w:trPr>
         <w:tc>
           <w:tcPr>
-            <w:tcW w:w="1328" w:type="dxa"/>
+            <w:tcW w:w="1759" w:type="dxa"/>
           </w:tcPr>
           <w:p>
             <w:pPr>
@@ -3409,111 +3642,61 @@
               <w:rPr>
                 <w:lang w:val="es-ES"/>
               </w:rPr>
-              <w:t xml:space="preserve">Diseñar prototipo inicial en </w:t>
-            </w:r>
-            <w:proofErr w:type="spellStart"/>
-            <w:r>
+              <w:t>Diseñar prototipo inicial en Figma y definir estructura de la base de datos</w:t>
+            </w:r>
+          </w:p>
+        </w:tc>
+        <w:tc>
+          <w:tcPr>
+            <w:tcW w:w="1276" w:type="dxa"/>
+          </w:tcPr>
+          <w:p>
+            <w:r>
+              <w:t>Figma, MySQL, Bootstrap</w:t>
+            </w:r>
+          </w:p>
+        </w:tc>
+        <w:tc>
+          <w:tcPr>
+            <w:tcW w:w="1276" w:type="dxa"/>
+          </w:tcPr>
+          <w:p>
+            <w:pPr>
+              <w:jc w:val="both"/>
+            </w:pPr>
+            <w:r>
+              <w:t xml:space="preserve">1 semana </w:t>
+            </w:r>
+          </w:p>
+        </w:tc>
+        <w:tc>
+          <w:tcPr>
+            <w:tcW w:w="1275" w:type="dxa"/>
+          </w:tcPr>
+          <w:p>
+            <w:pPr>
+              <w:jc w:val="both"/>
+            </w:pPr>
+            <w:r>
+              <w:t>Frontend/Integration Specialist</w:t>
+            </w:r>
+          </w:p>
+        </w:tc>
+        <w:tc>
+          <w:tcPr>
+            <w:tcW w:w="1276" w:type="dxa"/>
+          </w:tcPr>
+          <w:p>
+            <w:pPr>
+              <w:jc w:val="both"/>
               <w:rPr>
                 <w:lang w:val="es-ES"/>
               </w:rPr>
-              <w:t>Figma</w:t>
-            </w:r>
-            <w:proofErr w:type="spellEnd"/>
+            </w:pPr>
             <w:r>
               <w:rPr>
                 <w:lang w:val="es-ES"/>
               </w:rPr>
-              <w:t xml:space="preserve"> y definir estructura de la base de datos</w:t>
-            </w:r>
-          </w:p>
-        </w:tc>
-        <w:tc>
-          <w:tcPr>
-            <w:tcW w:w="1276" w:type="dxa"/>
-          </w:tcPr>
-          <w:p>
-            <w:proofErr w:type="spellStart"/>
-            <w:r>
-              <w:t>Figma</w:t>
-            </w:r>
-            <w:proofErr w:type="spellEnd"/>
-            <w:r>
-              <w:t xml:space="preserve">, </w:t>
-            </w:r>
-            <w:proofErr w:type="spellStart"/>
-            <w:r>
-              <w:t>MySQL</w:t>
-            </w:r>
-            <w:proofErr w:type="spellEnd"/>
-            <w:r>
-              <w:t xml:space="preserve">, </w:t>
-            </w:r>
-            <w:proofErr w:type="spellStart"/>
-            <w:r>
-              <w:t>Bootstrap</w:t>
-            </w:r>
-            <w:proofErr w:type="spellEnd"/>
-          </w:p>
-        </w:tc>
-        <w:tc>
-          <w:tcPr>
-            <w:tcW w:w="1276" w:type="dxa"/>
-          </w:tcPr>
-          <w:p>
-            <w:pPr>
-              <w:jc w:val="both"/>
-            </w:pPr>
-            <w:r>
-              <w:t xml:space="preserve">1 semana </w:t>
-            </w:r>
-          </w:p>
-        </w:tc>
-        <w:tc>
-          <w:tcPr>
-            <w:tcW w:w="1275" w:type="dxa"/>
-          </w:tcPr>
-          <w:p>
-            <w:pPr>
-              <w:jc w:val="both"/>
-            </w:pPr>
-            <w:proofErr w:type="spellStart"/>
-            <w:r>
-              <w:t>Frontend</w:t>
-            </w:r>
-            <w:proofErr w:type="spellEnd"/>
-            <w:r>
-              <w:t>/</w:t>
-            </w:r>
-            <w:proofErr w:type="spellStart"/>
-            <w:r>
-              <w:t>Integration</w:t>
-            </w:r>
-            <w:proofErr w:type="spellEnd"/>
-            <w:r>
-              <w:t xml:space="preserve"> </w:t>
-            </w:r>
-            <w:proofErr w:type="spellStart"/>
-            <w:r>
-              <w:t>Specialist</w:t>
-            </w:r>
-            <w:proofErr w:type="spellEnd"/>
-          </w:p>
-        </w:tc>
-        <w:tc>
-          <w:tcPr>
-            <w:tcW w:w="1276" w:type="dxa"/>
-          </w:tcPr>
-          <w:p>
-            <w:pPr>
-              <w:jc w:val="both"/>
-              <w:rPr>
-                <w:lang w:val="es-ES"/>
-              </w:rPr>
-            </w:pPr>
-            <w:r>
-              <w:rPr>
-                <w:lang w:val="es-ES"/>
-              </w:rPr>
               <w:t>Permite validar la interfaz con el cliente antes del desarrollo</w:t>
             </w:r>
           </w:p>
@@ -3548,138 +3731,28 @@
         </w:tc>
         <w:tc>
           <w:tcPr>
-            <w:tcW w:w="850" w:type="dxa"/>
-          </w:tcPr>
-          <w:p>
-            <w:pPr>
-              <w:jc w:val="both"/>
-              <w:rPr>
-                <w:rFonts w:ascii="Calibri" w:hAnsi="Calibri" w:cs="Arial"/>
-                <w:i/>
-                <w:sz w:val="18"/>
-                <w:szCs w:val="20"/>
-                <w:lang w:eastAsia="es-CL"/>
-              </w:rPr>
-            </w:pPr>
-            <w:r>
-              <w:rPr>
-                <w:rFonts w:ascii="Calibri" w:hAnsi="Calibri" w:cs="Arial"/>
-                <w:i/>
-                <w:sz w:val="18"/>
-                <w:szCs w:val="20"/>
-                <w:lang w:eastAsia="es-CL"/>
-              </w:rPr>
-              <w:t xml:space="preserve">En la </w:t>
-            </w:r>
-            <w:proofErr w:type="spellStart"/>
-            <w:r>
-              <w:rPr>
-                <w:rFonts w:ascii="Calibri" w:hAnsi="Calibri" w:cs="Arial"/>
-                <w:i/>
-                <w:sz w:val="18"/>
-                <w:szCs w:val="20"/>
-                <w:lang w:eastAsia="es-CL"/>
-              </w:rPr>
-              <w:t>elaboracion</w:t>
-            </w:r>
-            <w:proofErr w:type="spellEnd"/>
-            <w:r>
-              <w:rPr>
-                <w:rFonts w:ascii="Calibri" w:hAnsi="Calibri" w:cs="Arial"/>
-                <w:i/>
-                <w:sz w:val="18"/>
-                <w:szCs w:val="20"/>
-                <w:lang w:eastAsia="es-CL"/>
-              </w:rPr>
-              <w:t xml:space="preserve"> del diseño del prototipo inicial no se utilizaron </w:t>
-            </w:r>
-            <w:proofErr w:type="spellStart"/>
-            <w:r>
-              <w:rPr>
-                <w:rFonts w:ascii="Calibri" w:hAnsi="Calibri" w:cs="Arial"/>
-                <w:i/>
-                <w:sz w:val="18"/>
-                <w:szCs w:val="20"/>
-                <w:lang w:eastAsia="es-CL"/>
-              </w:rPr>
-              <w:t>figma</w:t>
-            </w:r>
-            <w:proofErr w:type="spellEnd"/>
-            <w:r>
-              <w:rPr>
-                <w:rFonts w:ascii="Calibri" w:hAnsi="Calibri" w:cs="Arial"/>
-                <w:i/>
-                <w:sz w:val="18"/>
-                <w:szCs w:val="20"/>
-                <w:lang w:eastAsia="es-CL"/>
-              </w:rPr>
-              <w:t xml:space="preserve"> y </w:t>
-            </w:r>
-            <w:proofErr w:type="spellStart"/>
-            <w:r>
-              <w:rPr>
-                <w:rFonts w:ascii="Calibri" w:hAnsi="Calibri" w:cs="Arial"/>
-                <w:i/>
-                <w:sz w:val="18"/>
-                <w:szCs w:val="20"/>
-                <w:lang w:eastAsia="es-CL"/>
-              </w:rPr>
-              <w:t>boostrap</w:t>
-            </w:r>
-            <w:proofErr w:type="spellEnd"/>
-            <w:r>
-              <w:rPr>
-                <w:rFonts w:ascii="Calibri" w:hAnsi="Calibri" w:cs="Arial"/>
-                <w:i/>
-                <w:sz w:val="18"/>
-                <w:szCs w:val="20"/>
-                <w:lang w:eastAsia="es-CL"/>
-              </w:rPr>
-              <w:t xml:space="preserve"> en remplazo de estas herramientas se utilizó directamente </w:t>
-            </w:r>
-            <w:proofErr w:type="spellStart"/>
-            <w:r>
-              <w:rPr>
-                <w:rFonts w:ascii="Calibri" w:hAnsi="Calibri" w:cs="Arial"/>
-                <w:i/>
-                <w:sz w:val="18"/>
-                <w:szCs w:val="20"/>
-                <w:lang w:eastAsia="es-CL"/>
-              </w:rPr>
-              <w:t>electronjunto</w:t>
-            </w:r>
-            <w:proofErr w:type="spellEnd"/>
-            <w:r>
-              <w:rPr>
-                <w:rFonts w:ascii="Calibri" w:hAnsi="Calibri" w:cs="Arial"/>
-                <w:i/>
-                <w:sz w:val="18"/>
-                <w:szCs w:val="20"/>
-                <w:lang w:eastAsia="es-CL"/>
-              </w:rPr>
-              <w:t xml:space="preserve"> a </w:t>
-            </w:r>
-            <w:proofErr w:type="spellStart"/>
-            <w:r>
-              <w:rPr>
-                <w:rFonts w:ascii="Calibri" w:hAnsi="Calibri" w:cs="Arial"/>
-                <w:i/>
-                <w:sz w:val="18"/>
-                <w:szCs w:val="20"/>
-                <w:lang w:eastAsia="es-CL"/>
-              </w:rPr>
-              <w:t>css</w:t>
-            </w:r>
-            <w:proofErr w:type="spellEnd"/>
-            <w:r>
-              <w:rPr>
-                <w:rFonts w:ascii="Calibri" w:hAnsi="Calibri" w:cs="Arial"/>
-                <w:i/>
-                <w:sz w:val="18"/>
-                <w:szCs w:val="20"/>
-                <w:lang w:eastAsia="es-CL"/>
-              </w:rPr>
-              <w:t>.</w:t>
+            <w:tcW w:w="1701" w:type="dxa"/>
+          </w:tcPr>
+          <w:p>
+            <w:pPr>
+              <w:jc w:val="both"/>
+              <w:rPr>
+                <w:rFonts w:ascii="Calibri" w:hAnsi="Calibri" w:cs="Arial"/>
+                <w:i/>
+                <w:sz w:val="18"/>
+                <w:szCs w:val="20"/>
+                <w:lang w:eastAsia="es-CL"/>
+              </w:rPr>
+            </w:pPr>
+            <w:r>
+              <w:rPr>
+                <w:rFonts w:ascii="Calibri" w:hAnsi="Calibri" w:cs="Arial"/>
+                <w:i/>
+                <w:sz w:val="18"/>
+                <w:szCs w:val="20"/>
+                <w:lang w:eastAsia="es-CL"/>
+              </w:rPr>
+              <w:t>En la elaboracion del diseño del prototipo inicial no se utilizaron figma y boostrap en remplazo de estas herramientas se utilizó directamente electronjunto a css.</w:t>
             </w:r>
           </w:p>
         </w:tc>
@@ -3690,7 +3763,7 @@
         </w:trPr>
         <w:tc>
           <w:tcPr>
-            <w:tcW w:w="1328" w:type="dxa"/>
+            <w:tcW w:w="1759" w:type="dxa"/>
           </w:tcPr>
           <w:p>
             <w:pPr>
@@ -3722,104 +3795,61 @@
               <w:rPr>
                 <w:lang w:val="es-ES"/>
               </w:rPr>
-              <w:t xml:space="preserve">Implementar la lógica del sistema para capturar mensajes de </w:t>
-            </w:r>
-            <w:proofErr w:type="spellStart"/>
-            <w:r>
+              <w:t>Implementar la lógica del sistema para capturar mensajes de Twitch y procesarlos con OpenAI</w:t>
+            </w:r>
+          </w:p>
+        </w:tc>
+        <w:tc>
+          <w:tcPr>
+            <w:tcW w:w="1276" w:type="dxa"/>
+          </w:tcPr>
+          <w:p>
+            <w:r>
+              <w:t>Python, Gemini, MySQL, GitHub</w:t>
+            </w:r>
+          </w:p>
+        </w:tc>
+        <w:tc>
+          <w:tcPr>
+            <w:tcW w:w="1276" w:type="dxa"/>
+          </w:tcPr>
+          <w:p>
+            <w:pPr>
+              <w:jc w:val="both"/>
+            </w:pPr>
+            <w:r>
+              <w:t>2 semanas</w:t>
+            </w:r>
+          </w:p>
+        </w:tc>
+        <w:tc>
+          <w:tcPr>
+            <w:tcW w:w="1275" w:type="dxa"/>
+          </w:tcPr>
+          <w:p>
+            <w:pPr>
+              <w:jc w:val="both"/>
+            </w:pPr>
+            <w:r>
+              <w:t>Backend Developer</w:t>
+            </w:r>
+          </w:p>
+        </w:tc>
+        <w:tc>
+          <w:tcPr>
+            <w:tcW w:w="1276" w:type="dxa"/>
+          </w:tcPr>
+          <w:p>
+            <w:pPr>
+              <w:jc w:val="both"/>
               <w:rPr>
                 <w:lang w:val="es-ES"/>
               </w:rPr>
-              <w:t>Twitch</w:t>
-            </w:r>
-            <w:proofErr w:type="spellEnd"/>
+            </w:pPr>
             <w:r>
               <w:rPr>
                 <w:lang w:val="es-ES"/>
               </w:rPr>
-              <w:t xml:space="preserve"> y procesarlos con </w:t>
-            </w:r>
-            <w:proofErr w:type="spellStart"/>
-            <w:r>
-              <w:rPr>
-                <w:lang w:val="es-ES"/>
-              </w:rPr>
-              <w:t>OpenAI</w:t>
-            </w:r>
-            <w:proofErr w:type="spellEnd"/>
-          </w:p>
-        </w:tc>
-        <w:tc>
-          <w:tcPr>
-            <w:tcW w:w="1276" w:type="dxa"/>
-          </w:tcPr>
-          <w:p>
-            <w:r>
-              <w:t xml:space="preserve">Python, </w:t>
-            </w:r>
-            <w:proofErr w:type="spellStart"/>
-            <w:r>
-              <w:t>Gemini</w:t>
-            </w:r>
-            <w:proofErr w:type="spellEnd"/>
-            <w:r>
-              <w:t xml:space="preserve">, </w:t>
-            </w:r>
-            <w:proofErr w:type="spellStart"/>
-            <w:r>
-              <w:t>MySQL</w:t>
-            </w:r>
-            <w:proofErr w:type="spellEnd"/>
-            <w:r>
-              <w:t>, GitHub</w:t>
-            </w:r>
-          </w:p>
-        </w:tc>
-        <w:tc>
-          <w:tcPr>
-            <w:tcW w:w="1276" w:type="dxa"/>
-          </w:tcPr>
-          <w:p>
-            <w:pPr>
-              <w:jc w:val="both"/>
-            </w:pPr>
-            <w:r>
-              <w:t>2 semanas</w:t>
-            </w:r>
-          </w:p>
-        </w:tc>
-        <w:tc>
-          <w:tcPr>
-            <w:tcW w:w="1275" w:type="dxa"/>
-          </w:tcPr>
-          <w:p>
-            <w:pPr>
-              <w:jc w:val="both"/>
-            </w:pPr>
-            <w:r>
-              <w:t xml:space="preserve">Backend </w:t>
-            </w:r>
-            <w:proofErr w:type="spellStart"/>
-            <w:r>
-              <w:t>Developer</w:t>
-            </w:r>
-            <w:proofErr w:type="spellEnd"/>
-          </w:p>
-        </w:tc>
-        <w:tc>
-          <w:tcPr>
-            <w:tcW w:w="1276" w:type="dxa"/>
-          </w:tcPr>
-          <w:p>
-            <w:pPr>
-              <w:jc w:val="both"/>
-              <w:rPr>
-                <w:lang w:val="es-ES"/>
-              </w:rPr>
-            </w:pPr>
-            <w:r>
-              <w:rPr>
-                <w:lang w:val="es-ES"/>
-              </w:rPr>
               <w:t>Base del sistema, conexión API</w:t>
             </w:r>
           </w:p>
@@ -3853,7 +3883,7 @@
         </w:tc>
         <w:tc>
           <w:tcPr>
-            <w:tcW w:w="850" w:type="dxa"/>
+            <w:tcW w:w="1701" w:type="dxa"/>
           </w:tcPr>
           <w:p>
             <w:pPr>
@@ -3876,7 +3906,7 @@
         </w:trPr>
         <w:tc>
           <w:tcPr>
-            <w:tcW w:w="1328" w:type="dxa"/>
+            <w:tcW w:w="1759" w:type="dxa"/>
           </w:tcPr>
           <w:p>
             <w:pPr>
@@ -3889,7 +3919,6 @@
               <w:rPr>
                 <w:lang w:val="es-ES"/>
               </w:rPr>
-              <w:lastRenderedPageBreak/>
               <w:t>Diseñar y generar soluciones con bases de datos relacionales</w:t>
             </w:r>
           </w:p>
@@ -3909,111 +3938,67 @@
               <w:rPr>
                 <w:lang w:val="es-ES"/>
               </w:rPr>
-              <w:t xml:space="preserve">Integrar servicios externos </w:t>
-            </w:r>
-            <w:proofErr w:type="spellStart"/>
-            <w:r>
+              <w:t>Integrar servicios externos ElevenLabs y VTube Studio para TTS y sincronización del avatar</w:t>
+            </w:r>
+          </w:p>
+        </w:tc>
+        <w:tc>
+          <w:tcPr>
+            <w:tcW w:w="1276" w:type="dxa"/>
+          </w:tcPr>
+          <w:p>
+            <w:r>
+              <w:t>Python, ElevenLabs, VTube Studio</w:t>
+            </w:r>
+          </w:p>
+        </w:tc>
+        <w:tc>
+          <w:tcPr>
+            <w:tcW w:w="1276" w:type="dxa"/>
+          </w:tcPr>
+          <w:p>
+            <w:pPr>
+              <w:jc w:val="both"/>
+            </w:pPr>
+            <w:r>
+              <w:t>2 semanas</w:t>
+            </w:r>
+          </w:p>
+        </w:tc>
+        <w:tc>
+          <w:tcPr>
+            <w:tcW w:w="1275" w:type="dxa"/>
+          </w:tcPr>
+          <w:p>
+            <w:pPr>
+              <w:jc w:val="both"/>
+              <w:rPr>
+                <w:lang w:val="en-US"/>
+              </w:rPr>
+            </w:pPr>
+            <w:r>
+              <w:rPr>
+                <w:lang w:val="en-US"/>
+              </w:rPr>
+              <w:t>Frontend/Integration Specialist + Backend Developer</w:t>
+            </w:r>
+          </w:p>
+        </w:tc>
+        <w:tc>
+          <w:tcPr>
+            <w:tcW w:w="1276" w:type="dxa"/>
+          </w:tcPr>
+          <w:p>
+            <w:pPr>
+              <w:jc w:val="both"/>
               <w:rPr>
                 <w:lang w:val="es-ES"/>
               </w:rPr>
-              <w:t>ElevenLabs</w:t>
-            </w:r>
-            <w:proofErr w:type="spellEnd"/>
+            </w:pPr>
             <w:r>
               <w:rPr>
                 <w:lang w:val="es-ES"/>
               </w:rPr>
-              <w:t xml:space="preserve"> y </w:t>
-            </w:r>
-            <w:proofErr w:type="spellStart"/>
-            <w:r>
-              <w:rPr>
-                <w:lang w:val="es-ES"/>
-              </w:rPr>
-              <w:t>VTube</w:t>
-            </w:r>
-            <w:proofErr w:type="spellEnd"/>
-            <w:r>
-              <w:rPr>
-                <w:lang w:val="es-ES"/>
-              </w:rPr>
-              <w:t xml:space="preserve"> Studio para TTS y sincronización del avatar</w:t>
-            </w:r>
-          </w:p>
-        </w:tc>
-        <w:tc>
-          <w:tcPr>
-            <w:tcW w:w="1276" w:type="dxa"/>
-          </w:tcPr>
-          <w:p>
-            <w:r>
-              <w:t xml:space="preserve">Python, </w:t>
-            </w:r>
-            <w:proofErr w:type="spellStart"/>
-            <w:r>
-              <w:t>ElevenLabs</w:t>
-            </w:r>
-            <w:proofErr w:type="spellEnd"/>
-            <w:r>
-              <w:t xml:space="preserve">, </w:t>
-            </w:r>
-            <w:proofErr w:type="spellStart"/>
-            <w:r>
-              <w:t>VTube</w:t>
-            </w:r>
-            <w:proofErr w:type="spellEnd"/>
-            <w:r>
-              <w:t xml:space="preserve"> Studio</w:t>
-            </w:r>
-          </w:p>
-        </w:tc>
-        <w:tc>
-          <w:tcPr>
-            <w:tcW w:w="1276" w:type="dxa"/>
-          </w:tcPr>
-          <w:p>
-            <w:pPr>
-              <w:jc w:val="both"/>
-            </w:pPr>
-            <w:r>
-              <w:t>2 semanas</w:t>
-            </w:r>
-          </w:p>
-        </w:tc>
-        <w:tc>
-          <w:tcPr>
-            <w:tcW w:w="1275" w:type="dxa"/>
-          </w:tcPr>
-          <w:p>
-            <w:pPr>
-              <w:jc w:val="both"/>
-              <w:rPr>
-                <w:lang w:val="en-US"/>
-              </w:rPr>
-            </w:pPr>
-            <w:r>
-              <w:rPr>
-                <w:lang w:val="en-US"/>
-              </w:rPr>
-              <w:t>Frontend/Integration Specialist + Backend Developer</w:t>
-            </w:r>
-          </w:p>
-        </w:tc>
-        <w:tc>
-          <w:tcPr>
-            <w:tcW w:w="1276" w:type="dxa"/>
-          </w:tcPr>
-          <w:p>
-            <w:pPr>
-              <w:jc w:val="both"/>
-              <w:rPr>
-                <w:lang w:val="es-ES"/>
-              </w:rPr>
-            </w:pPr>
-            <w:r>
-              <w:rPr>
-                <w:lang w:val="es-ES"/>
-              </w:rPr>
               <w:t>Permite interacción en tiempo real con audiencia</w:t>
             </w:r>
           </w:p>
@@ -4047,62 +4032,28 @@
         </w:tc>
         <w:tc>
           <w:tcPr>
-            <w:tcW w:w="850" w:type="dxa"/>
-          </w:tcPr>
-          <w:p>
-            <w:pPr>
-              <w:jc w:val="both"/>
-              <w:rPr>
-                <w:rFonts w:ascii="Calibri" w:hAnsi="Calibri" w:cs="Arial"/>
-                <w:i/>
-                <w:sz w:val="18"/>
-                <w:szCs w:val="20"/>
-                <w:lang w:eastAsia="es-CL"/>
-              </w:rPr>
-            </w:pPr>
-            <w:proofErr w:type="spellStart"/>
-            <w:r>
-              <w:rPr>
-                <w:rFonts w:ascii="Calibri" w:hAnsi="Calibri" w:cs="Arial"/>
-                <w:i/>
-                <w:sz w:val="18"/>
-                <w:szCs w:val="20"/>
-                <w:lang w:eastAsia="es-CL"/>
-              </w:rPr>
-              <w:t>Unicamente</w:t>
-            </w:r>
-            <w:proofErr w:type="spellEnd"/>
-            <w:r>
-              <w:rPr>
-                <w:rFonts w:ascii="Calibri" w:hAnsi="Calibri" w:cs="Arial"/>
-                <w:i/>
-                <w:sz w:val="18"/>
-                <w:szCs w:val="20"/>
-                <w:lang w:eastAsia="es-CL"/>
-              </w:rPr>
-              <w:t xml:space="preserve"> falta integrar </w:t>
-            </w:r>
-            <w:proofErr w:type="spellStart"/>
-            <w:r>
-              <w:rPr>
-                <w:rFonts w:ascii="Calibri" w:hAnsi="Calibri" w:cs="Arial"/>
-                <w:i/>
-                <w:sz w:val="18"/>
-                <w:szCs w:val="20"/>
-                <w:lang w:eastAsia="es-CL"/>
-              </w:rPr>
-              <w:t>VTuberStudio</w:t>
-            </w:r>
-            <w:proofErr w:type="spellEnd"/>
-            <w:r>
-              <w:rPr>
-                <w:rFonts w:ascii="Calibri" w:hAnsi="Calibri" w:cs="Arial"/>
-                <w:i/>
-                <w:sz w:val="18"/>
-                <w:szCs w:val="20"/>
-                <w:lang w:eastAsia="es-CL"/>
-              </w:rPr>
-              <w:t xml:space="preserve"> al sistema para sincronización del avatar.</w:t>
+            <w:tcW w:w="1701" w:type="dxa"/>
+          </w:tcPr>
+          <w:p>
+            <w:pPr>
+              <w:jc w:val="both"/>
+              <w:rPr>
+                <w:rFonts w:ascii="Calibri" w:hAnsi="Calibri" w:cs="Arial"/>
+                <w:i/>
+                <w:sz w:val="18"/>
+                <w:szCs w:val="20"/>
+                <w:lang w:eastAsia="es-CL"/>
+              </w:rPr>
+            </w:pPr>
+            <w:r>
+              <w:rPr>
+                <w:rFonts w:ascii="Calibri" w:hAnsi="Calibri" w:cs="Arial"/>
+                <w:i/>
+                <w:sz w:val="18"/>
+                <w:szCs w:val="20"/>
+                <w:lang w:eastAsia="es-CL"/>
+              </w:rPr>
+              <w:t>Unicamente falta integrar VTuberStudio al sistema para sincronización del avatar.</w:t>
             </w:r>
           </w:p>
         </w:tc>
@@ -4113,7 +4064,7 @@
         </w:trPr>
         <w:tc>
           <w:tcPr>
-            <w:tcW w:w="1328" w:type="dxa"/>
+            <w:tcW w:w="1759" w:type="dxa"/>
           </w:tcPr>
           <w:p>
             <w:pPr>
@@ -4155,15 +4106,7 @@
           </w:tcPr>
           <w:p>
             <w:r>
-              <w:t>Python (</w:t>
-            </w:r>
-            <w:proofErr w:type="spellStart"/>
-            <w:r>
-              <w:t>pytest</w:t>
-            </w:r>
-            <w:proofErr w:type="spellEnd"/>
-            <w:r>
-              <w:t>), Jira, GitHub</w:t>
+              <w:t>Python (pytest), Jira, GitHub</w:t>
             </w:r>
           </w:p>
         </w:tc>
@@ -4191,11 +4134,9 @@
                 <w:lang w:val="en-US"/>
               </w:rPr>
             </w:pPr>
-            <w:proofErr w:type="spellStart"/>
             <w:r>
               <w:t>Tester</w:t>
             </w:r>
-            <w:proofErr w:type="spellEnd"/>
           </w:p>
         </w:tc>
         <w:tc>
@@ -4246,7 +4187,7 @@
         </w:tc>
         <w:tc>
           <w:tcPr>
-            <w:tcW w:w="850" w:type="dxa"/>
+            <w:tcW w:w="1701" w:type="dxa"/>
           </w:tcPr>
           <w:p>
             <w:pPr>
@@ -4269,7 +4210,7 @@
         </w:trPr>
         <w:tc>
           <w:tcPr>
-            <w:tcW w:w="1328" w:type="dxa"/>
+            <w:tcW w:w="1759" w:type="dxa"/>
           </w:tcPr>
           <w:p>
             <w:pPr>
@@ -4282,6 +4223,7 @@
               <w:rPr>
                 <w:lang w:val="es-ES"/>
               </w:rPr>
+              <w:lastRenderedPageBreak/>
               <w:t>Desarrollar proyectos de software innovadores para plataformas</w:t>
             </w:r>
           </w:p>
@@ -4310,21 +4252,8 @@
             <w:tcW w:w="1276" w:type="dxa"/>
           </w:tcPr>
           <w:p>
-            <w:proofErr w:type="spellStart"/>
-            <w:r>
-              <w:t>Electron</w:t>
-            </w:r>
-            <w:proofErr w:type="spellEnd"/>
-            <w:r>
-              <w:t xml:space="preserve">, Python, </w:t>
-            </w:r>
-            <w:proofErr w:type="spellStart"/>
-            <w:r>
-              <w:t>MySQL</w:t>
-            </w:r>
-            <w:proofErr w:type="spellEnd"/>
-            <w:r>
-              <w:t>, GitHub</w:t>
+            <w:r>
+              <w:t>Electron, Python, MySQL, GitHub</w:t>
             </w:r>
           </w:p>
         </w:tc>
@@ -4403,7 +4332,7 @@
         </w:tc>
         <w:tc>
           <w:tcPr>
-            <w:tcW w:w="850" w:type="dxa"/>
+            <w:tcW w:w="1701" w:type="dxa"/>
           </w:tcPr>
           <w:p>
             <w:pPr>
@@ -4426,7 +4355,7 @@
         </w:trPr>
         <w:tc>
           <w:tcPr>
-            <w:tcW w:w="1328" w:type="dxa"/>
+            <w:tcW w:w="1759" w:type="dxa"/>
           </w:tcPr>
           <w:p>
             <w:pPr>
@@ -4458,69 +4387,61 @@
               <w:rPr>
                 <w:lang w:val="es-ES"/>
               </w:rPr>
-              <w:t xml:space="preserve">Corregir incidencias post-despliegue, aplicar mejoras y ajustes según </w:t>
-            </w:r>
-            <w:proofErr w:type="spellStart"/>
-            <w:r>
+              <w:t>Corregir incidencias post-despliegue, aplicar mejoras y ajustes según feedback</w:t>
+            </w:r>
+          </w:p>
+        </w:tc>
+        <w:tc>
+          <w:tcPr>
+            <w:tcW w:w="1276" w:type="dxa"/>
+          </w:tcPr>
+          <w:p>
+            <w:r>
+              <w:t>GitHub, Jira</w:t>
+            </w:r>
+          </w:p>
+        </w:tc>
+        <w:tc>
+          <w:tcPr>
+            <w:tcW w:w="1276" w:type="dxa"/>
+          </w:tcPr>
+          <w:p>
+            <w:pPr>
+              <w:jc w:val="both"/>
+            </w:pPr>
+            <w:r>
+              <w:t>Monitoreo continuo.</w:t>
+            </w:r>
+          </w:p>
+        </w:tc>
+        <w:tc>
+          <w:tcPr>
+            <w:tcW w:w="1275" w:type="dxa"/>
+          </w:tcPr>
+          <w:p>
+            <w:pPr>
+              <w:jc w:val="both"/>
+            </w:pPr>
+            <w:r>
+              <w:t>Todo el equipo</w:t>
+            </w:r>
+          </w:p>
+        </w:tc>
+        <w:tc>
+          <w:tcPr>
+            <w:tcW w:w="1276" w:type="dxa"/>
+          </w:tcPr>
+          <w:p>
+            <w:pPr>
+              <w:jc w:val="both"/>
               <w:rPr>
                 <w:lang w:val="es-ES"/>
               </w:rPr>
-              <w:t>feedback</w:t>
-            </w:r>
-            <w:proofErr w:type="spellEnd"/>
-          </w:p>
-        </w:tc>
-        <w:tc>
-          <w:tcPr>
-            <w:tcW w:w="1276" w:type="dxa"/>
-          </w:tcPr>
-          <w:p>
-            <w:r>
-              <w:t>GitHub, Jira</w:t>
-            </w:r>
-          </w:p>
-        </w:tc>
-        <w:tc>
-          <w:tcPr>
-            <w:tcW w:w="1276" w:type="dxa"/>
-          </w:tcPr>
-          <w:p>
-            <w:pPr>
-              <w:jc w:val="both"/>
-            </w:pPr>
-            <w:r>
-              <w:t>Monitoreo continuo.</w:t>
-            </w:r>
-          </w:p>
-        </w:tc>
-        <w:tc>
-          <w:tcPr>
-            <w:tcW w:w="1275" w:type="dxa"/>
-          </w:tcPr>
-          <w:p>
-            <w:pPr>
-              <w:jc w:val="both"/>
-            </w:pPr>
-            <w:r>
-              <w:t>Todo el equipo</w:t>
-            </w:r>
-          </w:p>
-        </w:tc>
-        <w:tc>
-          <w:tcPr>
-            <w:tcW w:w="1276" w:type="dxa"/>
-          </w:tcPr>
-          <w:p>
-            <w:pPr>
-              <w:jc w:val="both"/>
+            </w:pPr>
+            <w:r>
               <w:rPr>
                 <w:lang w:val="es-ES"/>
               </w:rPr>
-            </w:pPr>
-            <w:r>
-              <w:rPr>
-                <w:lang w:val="es-ES"/>
-              </w:rPr>
               <w:t>Asegurar continuidad del proyecto y escalabilidad</w:t>
             </w:r>
           </w:p>
@@ -4555,7 +4476,7 @@
         </w:tc>
         <w:tc>
           <w:tcPr>
-            <w:tcW w:w="850" w:type="dxa"/>
+            <w:tcW w:w="1701" w:type="dxa"/>
           </w:tcPr>
           <w:p>
             <w:pPr>
@@ -4674,7 +4595,6 @@
                 <w:rFonts w:ascii="Calibri" w:hAnsi="Calibri"/>
                 <w:color w:val="1F3864" w:themeColor="accent1" w:themeShade="80"/>
               </w:rPr>
-              <w:lastRenderedPageBreak/>
               <w:t>Profundiza en las observaciones de tu plan de trabajo</w:t>
             </w:r>
             <w:r>
@@ -4966,71 +4886,8 @@
                 <w:rFonts w:ascii="Calibri" w:hAnsi="Calibri"/>
                 <w:color w:val="000000" w:themeColor="text1"/>
               </w:rPr>
-              <w:t xml:space="preserve">En cuanto a las dificultades, se presentaron desafíos relacionados con la integración de las </w:t>
-            </w:r>
-            <w:proofErr w:type="spellStart"/>
-            <w:r>
-              <w:rPr>
-                <w:rFonts w:ascii="Calibri" w:hAnsi="Calibri"/>
-                <w:color w:val="000000" w:themeColor="text1"/>
-              </w:rPr>
-              <w:t>APIs</w:t>
-            </w:r>
-            <w:proofErr w:type="spellEnd"/>
-            <w:r>
-              <w:rPr>
-                <w:rFonts w:ascii="Calibri" w:hAnsi="Calibri"/>
-                <w:color w:val="000000" w:themeColor="text1"/>
-              </w:rPr>
-              <w:t xml:space="preserve"> externas (</w:t>
-            </w:r>
-            <w:proofErr w:type="spellStart"/>
-            <w:r>
-              <w:rPr>
-                <w:rFonts w:ascii="Calibri" w:hAnsi="Calibri"/>
-                <w:color w:val="000000" w:themeColor="text1"/>
-              </w:rPr>
-              <w:t>Gemini</w:t>
-            </w:r>
-            <w:proofErr w:type="spellEnd"/>
-            <w:r>
-              <w:rPr>
-                <w:rFonts w:ascii="Calibri" w:hAnsi="Calibri"/>
-                <w:color w:val="000000" w:themeColor="text1"/>
-              </w:rPr>
-              <w:t xml:space="preserve">, </w:t>
-            </w:r>
-            <w:proofErr w:type="spellStart"/>
-            <w:r>
-              <w:rPr>
-                <w:rFonts w:ascii="Calibri" w:hAnsi="Calibri"/>
-                <w:color w:val="000000" w:themeColor="text1"/>
-              </w:rPr>
-              <w:t>ElevenLabs</w:t>
-            </w:r>
-            <w:proofErr w:type="spellEnd"/>
-            <w:r>
-              <w:rPr>
-                <w:rFonts w:ascii="Calibri" w:hAnsi="Calibri"/>
-                <w:color w:val="000000" w:themeColor="text1"/>
-              </w:rPr>
-              <w:t xml:space="preserve"> y </w:t>
-            </w:r>
-            <w:proofErr w:type="spellStart"/>
-            <w:r>
-              <w:rPr>
-                <w:rFonts w:ascii="Calibri" w:hAnsi="Calibri"/>
-                <w:color w:val="000000" w:themeColor="text1"/>
-              </w:rPr>
-              <w:t>Twitch</w:t>
-            </w:r>
-            <w:proofErr w:type="spellEnd"/>
-            <w:r>
-              <w:rPr>
-                <w:rFonts w:ascii="Calibri" w:hAnsi="Calibri"/>
-                <w:color w:val="000000" w:themeColor="text1"/>
-              </w:rPr>
-              <w:t>), principalmente por diferencias en la documentación y en la gestión de autenticaciones. Para abordar estos inconvenientes, se implementó un proceso de pruebas iterativas y documentación técnica complementaria, lo que permitió resolver gradualmente los errores y asegurar la correcta interoperabilidad entre los distintos servicios.</w:t>
+              <w:lastRenderedPageBreak/>
+              <w:t>En cuanto a las dificultades, se presentaron desafíos relacionados con la integración de las APIs externas (Gemini, ElevenLabs y Twitch), principalmente por diferencias en la documentación y en la gestión de autenticaciones. Para abordar estos inconvenientes, se implementó un proceso de pruebas iterativas y documentación técnica complementaria, lo que permitió resolver gradualmente los errores y asegurar la correcta interoperabilidad entre los distintos servicios.</w:t>
             </w:r>
           </w:p>
           <w:p>
@@ -5326,7 +5183,6 @@
                 <w:szCs w:val="20"/>
                 <w:lang w:eastAsia="es-CL"/>
               </w:rPr>
-              <w:lastRenderedPageBreak/>
               <w:t>El ajuste respondió principalmente a la necesidad de priorizar la eficiencia y la simplicidad en la gestión de la información, asegurando que los esfuerzos se concentraran en el desarrollo técnico del sistema y no en la configuración inicial de herramientas complementarias.</w:t>
             </w:r>
           </w:p>
@@ -5701,6 +5557,7 @@
                 <w:szCs w:val="20"/>
                 <w:lang w:eastAsia="es-CL"/>
               </w:rPr>
+              <w:lastRenderedPageBreak/>
               <w:t>Esta fase contempla la aplicación de diferentes tipos de pruebas, incluyendo pruebas unitarias, de integración y de sistema, las cuales se ejecutarán una vez finalizada la</w:t>
             </w:r>
             <w:r>
@@ -5867,7 +5724,7 @@
       </w:pPr>
     </w:p>
     <w:sectPr>
-      <w:headerReference w:type="default" r:id="rId15"/>
+      <w:headerReference w:type="default" r:id="rId19"/>
       <w:pgSz w:w="11906" w:h="16838"/>
       <w:pgMar w:top="1417" w:right="1701" w:bottom="1417" w:left="1701" w:header="708" w:footer="708" w:gutter="0"/>
       <w:cols w:space="708"/>
@@ -5925,6 +5782,115 @@
     </w:p>
   </w:footnote>
   <w:footnote w:id="1">
+    <w:tbl>
+      <w:tblPr>
+        <w:tblStyle w:val="Tablaconcuadrcula"/>
+        <w:tblW w:w="9640" w:type="dxa"/>
+        <w:tblInd w:w="-569" w:type="dxa"/>
+        <w:tblBorders>
+          <w:top w:val="single" w:sz="4" w:space="0" w:color="BFBFBF" w:themeColor="background1" w:themeShade="BF"/>
+          <w:left w:val="single" w:sz="4" w:space="0" w:color="BFBFBF" w:themeColor="background1" w:themeShade="BF"/>
+          <w:bottom w:val="single" w:sz="4" w:space="0" w:color="BFBFBF" w:themeColor="background1" w:themeShade="BF"/>
+          <w:right w:val="single" w:sz="4" w:space="0" w:color="BFBFBF" w:themeColor="background1" w:themeShade="BF"/>
+          <w:insideH w:val="single" w:sz="4" w:space="0" w:color="BFBFBF" w:themeColor="background1" w:themeShade="BF"/>
+          <w:insideV w:val="single" w:sz="4" w:space="0" w:color="BFBFBF" w:themeColor="background1" w:themeShade="BF"/>
+        </w:tblBorders>
+        <w:tblLook w:val="04A0" w:firstRow="1" w:lastRow="0" w:firstColumn="1" w:lastColumn="0" w:noHBand="0" w:noVBand="1"/>
+      </w:tblPr>
+      <w:tblGrid>
+        <w:gridCol w:w="9640"/>
+      </w:tblGrid>
+      <w:tr>
+        <w:trPr>
+          <w:trHeight w:val="440"/>
+        </w:trPr>
+        <w:tc>
+          <w:tcPr>
+            <w:tcW w:w="9640" w:type="dxa"/>
+            <w:vAlign w:val="center"/>
+          </w:tcPr>
+          <w:p>
+            <w:pPr>
+              <w:rPr>
+                <w:b/>
+                <w:color w:val="1F3864" w:themeColor="accent1" w:themeShade="80"/>
+                <w:sz w:val="28"/>
+                <w:szCs w:val="28"/>
+              </w:rPr>
+            </w:pPr>
+            <w:r>
+              <w:rPr>
+                <w:b/>
+                <w:color w:val="1F3864" w:themeColor="accent1" w:themeShade="80"/>
+                <w:sz w:val="28"/>
+                <w:szCs w:val="28"/>
+              </w:rPr>
+              <w:t>2</w:t>
+            </w:r>
+            <w:r>
+              <w:rPr>
+                <w:b/>
+                <w:color w:val="1F3864" w:themeColor="accent1" w:themeShade="80"/>
+                <w:sz w:val="28"/>
+                <w:szCs w:val="28"/>
+              </w:rPr>
+              <w:t xml:space="preserve">. </w:t>
+            </w:r>
+            <w:r>
+              <w:rPr>
+                <w:b/>
+                <w:color w:val="1F3864" w:themeColor="accent1" w:themeShade="80"/>
+                <w:sz w:val="28"/>
+                <w:szCs w:val="28"/>
+              </w:rPr>
+              <w:t xml:space="preserve">Monitoreo del Plan de Trabajo </w:t>
+            </w:r>
+          </w:p>
+        </w:tc>
+      </w:tr>
+      <w:tr>
+        <w:trPr>
+          <w:trHeight w:val="800"/>
+        </w:trPr>
+        <w:tc>
+          <w:tcPr>
+            <w:tcW w:w="9640" w:type="dxa"/>
+            <w:shd w:val="clear" w:color="auto" w:fill="D9E2F3" w:themeFill="accent1" w:themeFillTint="33"/>
+            <w:vAlign w:val="center"/>
+          </w:tcPr>
+          <w:p>
+            <w:pPr>
+              <w:jc w:val="both"/>
+              <w:rPr>
+                <w:rFonts w:ascii="Calibri" w:hAnsi="Calibri"/>
+                <w:color w:val="1F3864" w:themeColor="accent1" w:themeShade="80"/>
+              </w:rPr>
+            </w:pPr>
+            <w:r>
+              <w:rPr>
+                <w:rFonts w:ascii="Calibri" w:hAnsi="Calibri"/>
+                <w:color w:val="1F3864" w:themeColor="accent1" w:themeShade="80"/>
+              </w:rPr>
+              <w:t xml:space="preserve">Examina cuidadosamente tu plan de trabajo, enfocándote especialmente en la columna de </w:t>
+            </w:r>
+            <w:r>
+              <w:rPr>
+                <w:rFonts w:ascii="Calibri" w:hAnsi="Calibri"/>
+                <w:color w:val="1F3864" w:themeColor="accent1" w:themeShade="80"/>
+              </w:rPr>
+              <w:t xml:space="preserve">estado de avance </w:t>
+            </w:r>
+            <w:r>
+              <w:rPr>
+                <w:rFonts w:ascii="Calibri" w:hAnsi="Calibri"/>
+                <w:color w:val="1F3864" w:themeColor="accent1" w:themeShade="80"/>
+              </w:rPr>
+              <w:t>y ajustes.</w:t>
+            </w:r>
+          </w:p>
+        </w:tc>
+      </w:tr>
+    </w:tbl>
     <w:p>
       <w:pPr>
         <w:pStyle w:val="Textonotapie"/>
@@ -7326,21 +7292,12 @@
 </file>
 
 <file path=customXml/item1.xml><?xml version="1.0" encoding="utf-8"?>
-<?mso-contentType ?>
-<FormTemplates xmlns="http://schemas.microsoft.com/sharepoint/v3/contenttype/forms">
-  <Display>DocumentLibraryForm</Display>
-  <Edit>DocumentLibraryForm</Edit>
-  <New>DocumentLibraryForm</New>
-</FormTemplates>
-</file>
-
-<file path=customXml/item2.xml><?xml version="1.0" encoding="utf-8"?>
 <p:properties xmlns:p="http://schemas.microsoft.com/office/2006/metadata/properties" xmlns:xsi="http://www.w3.org/2001/XMLSchema-instance" xmlns:pc="http://schemas.microsoft.com/office/infopath/2007/PartnerControls">
   <documentManagement/>
 </p:properties>
 </file>
 
-<file path=customXml/item3.xml><?xml version="1.0" encoding="utf-8"?>
+<file path=customXml/item2.xml><?xml version="1.0" encoding="utf-8"?>
 <ct:contentTypeSchema xmlns:ct="http://schemas.microsoft.com/office/2006/metadata/contentType" xmlns:ma="http://schemas.microsoft.com/office/2006/metadata/properties/metaAttributes" ct:_="" ma:_="" ma:contentTypeName="Documento" ma:contentTypeID="0x010100E96778489EE7714D8BD12CC105EB918B" ma:contentTypeVersion="2" ma:contentTypeDescription="Crear nuevo documento." ma:contentTypeScope="" ma:versionID="416c5c7ae9b5d54d83875cd3c65194e3">
   <xsd:schema xmlns:xsd="http://www.w3.org/2001/XMLSchema" xmlns:xs="http://www.w3.org/2001/XMLSchema" xmlns:p="http://schemas.microsoft.com/office/2006/metadata/properties" xmlns:ns2="126e8a1c-9ea9-435a-ac89-d06c80d62e30" targetNamespace="http://schemas.microsoft.com/office/2006/metadata/properties" ma:root="true" ma:fieldsID="70a237c842677bd850644f8595079f5e" ns2:_="">
     <xsd:import namespace="126e8a1c-9ea9-435a-ac89-d06c80d62e30"/>
@@ -7472,15 +7429,16 @@
 </ct:contentTypeSchema>
 </file>
 
-<file path=customXml/itemProps1.xml><?xml version="1.0" encoding="utf-8"?>
-<ds:datastoreItem xmlns:ds="http://schemas.openxmlformats.org/officeDocument/2006/customXml" ds:itemID="{D51C61E4-DB75-4684-AD25-71F546404E96}">
-  <ds:schemaRefs>
-    <ds:schemaRef ds:uri="http://schemas.microsoft.com/sharepoint/v3/contenttype/forms"/>
-  </ds:schemaRefs>
-</ds:datastoreItem>
+<file path=customXml/item3.xml><?xml version="1.0" encoding="utf-8"?>
+<?mso-contentType ?>
+<FormTemplates xmlns="http://schemas.microsoft.com/sharepoint/v3/contenttype/forms">
+  <Display>DocumentLibraryForm</Display>
+  <Edit>DocumentLibraryForm</Edit>
+  <New>DocumentLibraryForm</New>
+</FormTemplates>
 </file>
 
-<file path=customXml/itemProps2.xml><?xml version="1.0" encoding="utf-8"?>
+<file path=customXml/itemProps1.xml><?xml version="1.0" encoding="utf-8"?>
 <ds:datastoreItem xmlns:ds="http://schemas.openxmlformats.org/officeDocument/2006/customXml" ds:itemID="{46CA5683-AF87-4E40-B841-2E23A3B52406}">
   <ds:schemaRefs>
     <ds:schemaRef ds:uri="http://schemas.microsoft.com/office/2006/metadata/properties"/>
@@ -7489,7 +7447,7 @@
 </ds:datastoreItem>
 </file>
 
-<file path=customXml/itemProps3.xml><?xml version="1.0" encoding="utf-8"?>
+<file path=customXml/itemProps2.xml><?xml version="1.0" encoding="utf-8"?>
 <ds:datastoreItem xmlns:ds="http://schemas.openxmlformats.org/officeDocument/2006/customXml" ds:itemID="{6F3661B0-5934-4FAB-ADC6-33A19B814E8D}">
   <ds:schemaRefs>
     <ds:schemaRef ds:uri="http://schemas.microsoft.com/office/2006/metadata/contentType"/>
@@ -7505,4 +7463,12 @@
     <ds:schemaRef ds:uri="http://schemas.microsoft.com/internal/obd"/>
   </ds:schemaRefs>
 </ds:datastoreItem>
+</file>
+
+<file path=customXml/itemProps3.xml><?xml version="1.0" encoding="utf-8"?>
+<ds:datastoreItem xmlns:ds="http://schemas.openxmlformats.org/officeDocument/2006/customXml" ds:itemID="{D51C61E4-DB75-4684-AD25-71F546404E96}">
+  <ds:schemaRefs>
+    <ds:schemaRef ds:uri="http://schemas.microsoft.com/sharepoint/v3/contenttype/forms"/>
+  </ds:schemaRefs>
+</ds:datastoreItem>
 </file>
</xml_diff>

<commit_message>
Entrega avance documento 2.4 fase 2 14-11
</commit_message>
<xml_diff>
--- a/Fase 2/Evidencias Grupales/2.4_GuiaEstudiante_Fase 2_DesarrolloProyecto APT.docx
+++ b/Fase 2/Evidencias Grupales/2.4_GuiaEstudiante_Fase 2_DesarrolloProyecto APT.docx
@@ -2,10 +2,7 @@
 <file path=word/document.xml><?xml version="1.0" encoding="utf-8"?>
 <w:document xmlns:wpc="http://schemas.microsoft.com/office/word/2010/wordprocessingCanvas" xmlns:cx="http://schemas.microsoft.com/office/drawing/2014/chartex" xmlns:mc="http://schemas.openxmlformats.org/markup-compatibility/2006" xmlns:o="urn:schemas-microsoft-com:office:office" xmlns:r="http://schemas.openxmlformats.org/officeDocument/2006/relationships" xmlns:m="http://schemas.openxmlformats.org/officeDocument/2006/math" xmlns:v="urn:schemas-microsoft-com:vml" xmlns:wp14="http://schemas.microsoft.com/office/word/2010/wordprocessingDrawing" xmlns:wp="http://schemas.openxmlformats.org/drawingml/2006/wordprocessingDrawing" xmlns:w10="urn:schemas-microsoft-com:office:word" xmlns:w="http://schemas.openxmlformats.org/wordprocessingml/2006/main" xmlns:w14="http://schemas.microsoft.com/office/word/2010/wordml" xmlns:w15="http://schemas.microsoft.com/office/word/2012/wordml" xmlns:w16se="http://schemas.microsoft.com/office/word/2015/wordml/symex" xmlns:wpg="http://schemas.microsoft.com/office/word/2010/wordprocessingGroup" xmlns:wpi="http://schemas.microsoft.com/office/word/2010/wordprocessingInk" xmlns:wne="http://schemas.microsoft.com/office/word/2006/wordml" xmlns:wps="http://schemas.microsoft.com/office/word/2010/wordprocessingShape" mc:Ignorable="w14 w15 w16se wp14">
   <w:body>
-    <w:p>
-      <w:bookmarkStart w:id="0" w:name="_GoBack"/>
-      <w:bookmarkEnd w:id="0"/>
-    </w:p>
+    <w:p/>
     <w:p>
       <w:pPr>
         <w:rPr>
@@ -165,6 +162,7 @@
                                 </w:rPr>
                                 <w:t xml:space="preserve">Asignatura </w:t>
                               </w:r>
+                              <w:proofErr w:type="spellStart"/>
                               <w:r>
                                 <w:rPr>
                                   <w:b/>
@@ -174,6 +172,7 @@
                                 </w:rPr>
                                 <w:t>Capstone</w:t>
                               </w:r>
+                              <w:proofErr w:type="spellEnd"/>
                             </w:p>
                           </w:txbxContent>
                         </wps:txbx>
@@ -566,6 +565,12 @@
         </w:rPr>
       </w:pPr>
     </w:p>
+    <w:p>
+      <w:pPr>
+        <w:pStyle w:val="Descripcin"/>
+        <w:keepNext/>
+      </w:pPr>
+    </w:p>
     <w:tbl>
       <w:tblPr>
         <w:tblStyle w:val="Tablaconcuadrcula"/>
@@ -747,7 +752,29 @@
                 <w:szCs w:val="20"/>
                 <w:lang w:eastAsia="es-CL"/>
               </w:rPr>
-              <w:t>En relación con los avances realizados en el proyecto APT, se implementaron diversas metodologías con el objetivo de obtener una visión más clara de las necesidades de los usuarios y/o streamers en la plataforma Twitch. En una primera instancia, se llevaron a cabo licitaciones orientadas a recopilar información relevante sobre los requerimientos funcionales y no funcionales del sistema, con el propósito de definir los estándares necesarios para desarrollar un proyecto innovador y útil d</w:t>
+              <w:t xml:space="preserve">En relación con los avances realizados en el proyecto APT, se implementaron diversas metodologías con el objetivo de obtener una visión más clara de las necesidades de los usuarios y/o streamers en la plataforma </w:t>
+            </w:r>
+            <w:proofErr w:type="spellStart"/>
+            <w:r>
+              <w:rPr>
+                <w:rFonts w:ascii="Calibri" w:hAnsi="Calibri" w:cs="Arial"/>
+                <w:i/>
+                <w:sz w:val="20"/>
+                <w:szCs w:val="20"/>
+                <w:lang w:eastAsia="es-CL"/>
+              </w:rPr>
+              <w:t>Twitch</w:t>
+            </w:r>
+            <w:proofErr w:type="spellEnd"/>
+            <w:r>
+              <w:rPr>
+                <w:rFonts w:ascii="Calibri" w:hAnsi="Calibri" w:cs="Arial"/>
+                <w:i/>
+                <w:sz w:val="20"/>
+                <w:szCs w:val="20"/>
+                <w:lang w:eastAsia="es-CL"/>
+              </w:rPr>
+              <w:t>. En una primera instancia, se llevaron a cabo licitaciones orientadas a recopilar información relevante sobre los requerimientos funcionales y no funcionales del sistema, con el propósito de definir los estándares necesarios para desarrollar un proyecto innovador y útil d</w:t>
             </w:r>
             <w:r>
               <w:rPr>
@@ -779,7 +806,51 @@
                 <w:szCs w:val="20"/>
                 <w:lang w:eastAsia="es-CL"/>
               </w:rPr>
-              <w:t>Posteriormente, se procedió con el diseño preliminar de la aplicación, utilizando las herramientas Electron y CSS, prescindiendo del uso de Figma. Esta decisión metodológica permitió optimizar el tiempo de desarrollo y visualizar de manera práctica la estructura de la interfaz, los campos de entrada y los tipos de datos que lo</w:t>
+              <w:t xml:space="preserve">Posteriormente, se procedió con el diseño preliminar de la aplicación, utilizando las herramientas </w:t>
+            </w:r>
+            <w:proofErr w:type="spellStart"/>
+            <w:r>
+              <w:rPr>
+                <w:rFonts w:ascii="Calibri" w:hAnsi="Calibri" w:cs="Arial"/>
+                <w:i/>
+                <w:sz w:val="20"/>
+                <w:szCs w:val="20"/>
+                <w:lang w:eastAsia="es-CL"/>
+              </w:rPr>
+              <w:t>Electron</w:t>
+            </w:r>
+            <w:proofErr w:type="spellEnd"/>
+            <w:r>
+              <w:rPr>
+                <w:rFonts w:ascii="Calibri" w:hAnsi="Calibri" w:cs="Arial"/>
+                <w:i/>
+                <w:sz w:val="20"/>
+                <w:szCs w:val="20"/>
+                <w:lang w:eastAsia="es-CL"/>
+              </w:rPr>
+              <w:t xml:space="preserve"> y CSS, prescindiendo del uso de </w:t>
+            </w:r>
+            <w:proofErr w:type="spellStart"/>
+            <w:r>
+              <w:rPr>
+                <w:rFonts w:ascii="Calibri" w:hAnsi="Calibri" w:cs="Arial"/>
+                <w:i/>
+                <w:sz w:val="20"/>
+                <w:szCs w:val="20"/>
+                <w:lang w:eastAsia="es-CL"/>
+              </w:rPr>
+              <w:t>Figma</w:t>
+            </w:r>
+            <w:proofErr w:type="spellEnd"/>
+            <w:r>
+              <w:rPr>
+                <w:rFonts w:ascii="Calibri" w:hAnsi="Calibri" w:cs="Arial"/>
+                <w:i/>
+                <w:sz w:val="20"/>
+                <w:szCs w:val="20"/>
+                <w:lang w:eastAsia="es-CL"/>
+              </w:rPr>
+              <w:t>. Esta decisión metodológica permitió optimizar el tiempo de desarrollo y visualizar de manera práctica la estructura de la interfaz, los campos de entrada y los tipos de datos que lo</w:t>
             </w:r>
             <w:r>
               <w:rPr>
@@ -811,7 +882,95 @@
                 <w:szCs w:val="20"/>
                 <w:lang w:eastAsia="es-CL"/>
               </w:rPr>
-              <w:t>Finalmente, una vez establecido el marco base de la aplicación, se dio inicio a la integración de las APIs de Gemini, ElevenLabs y Twitch, con el fin de incorporar las funcionalidades esenciales del sistema y asegurar la interoperabilidad e</w:t>
+              <w:t xml:space="preserve">Finalmente, una vez establecido el marco base de la aplicación, se dio inicio a la integración de las </w:t>
+            </w:r>
+            <w:proofErr w:type="spellStart"/>
+            <w:r>
+              <w:rPr>
+                <w:rFonts w:ascii="Calibri" w:hAnsi="Calibri" w:cs="Arial"/>
+                <w:i/>
+                <w:sz w:val="20"/>
+                <w:szCs w:val="20"/>
+                <w:lang w:eastAsia="es-CL"/>
+              </w:rPr>
+              <w:t>APIs</w:t>
+            </w:r>
+            <w:proofErr w:type="spellEnd"/>
+            <w:r>
+              <w:rPr>
+                <w:rFonts w:ascii="Calibri" w:hAnsi="Calibri" w:cs="Arial"/>
+                <w:i/>
+                <w:sz w:val="20"/>
+                <w:szCs w:val="20"/>
+                <w:lang w:eastAsia="es-CL"/>
+              </w:rPr>
+              <w:t xml:space="preserve"> de </w:t>
+            </w:r>
+            <w:proofErr w:type="spellStart"/>
+            <w:r>
+              <w:rPr>
+                <w:rFonts w:ascii="Calibri" w:hAnsi="Calibri" w:cs="Arial"/>
+                <w:i/>
+                <w:sz w:val="20"/>
+                <w:szCs w:val="20"/>
+                <w:lang w:eastAsia="es-CL"/>
+              </w:rPr>
+              <w:t>Gemini</w:t>
+            </w:r>
+            <w:proofErr w:type="spellEnd"/>
+            <w:r>
+              <w:rPr>
+                <w:rFonts w:ascii="Calibri" w:hAnsi="Calibri" w:cs="Arial"/>
+                <w:i/>
+                <w:sz w:val="20"/>
+                <w:szCs w:val="20"/>
+                <w:lang w:eastAsia="es-CL"/>
+              </w:rPr>
+              <w:t xml:space="preserve">, </w:t>
+            </w:r>
+            <w:proofErr w:type="spellStart"/>
+            <w:r>
+              <w:rPr>
+                <w:rFonts w:ascii="Calibri" w:hAnsi="Calibri" w:cs="Arial"/>
+                <w:i/>
+                <w:sz w:val="20"/>
+                <w:szCs w:val="20"/>
+                <w:lang w:eastAsia="es-CL"/>
+              </w:rPr>
+              <w:t>ElevenLabs</w:t>
+            </w:r>
+            <w:proofErr w:type="spellEnd"/>
+            <w:r>
+              <w:rPr>
+                <w:rFonts w:ascii="Calibri" w:hAnsi="Calibri" w:cs="Arial"/>
+                <w:i/>
+                <w:sz w:val="20"/>
+                <w:szCs w:val="20"/>
+                <w:lang w:eastAsia="es-CL"/>
+              </w:rPr>
+              <w:t xml:space="preserve"> y </w:t>
+            </w:r>
+            <w:proofErr w:type="spellStart"/>
+            <w:r>
+              <w:rPr>
+                <w:rFonts w:ascii="Calibri" w:hAnsi="Calibri" w:cs="Arial"/>
+                <w:i/>
+                <w:sz w:val="20"/>
+                <w:szCs w:val="20"/>
+                <w:lang w:eastAsia="es-CL"/>
+              </w:rPr>
+              <w:t>Twitch</w:t>
+            </w:r>
+            <w:proofErr w:type="spellEnd"/>
+            <w:r>
+              <w:rPr>
+                <w:rFonts w:ascii="Calibri" w:hAnsi="Calibri" w:cs="Arial"/>
+                <w:i/>
+                <w:sz w:val="20"/>
+                <w:szCs w:val="20"/>
+                <w:lang w:eastAsia="es-CL"/>
+              </w:rPr>
+              <w:t>, con el fin de incorporar las funcionalidades esenciales del sistema y asegurar la interoperabilidad e</w:t>
             </w:r>
             <w:r>
               <w:rPr>
@@ -843,7 +1002,29 @@
                 <w:szCs w:val="20"/>
                 <w:lang w:eastAsia="es-CL"/>
               </w:rPr>
-              <w:t>En cuanto a los ajustes realizados, se modificó parcialmente la metodología inicial, priorizando el desarrollo funcional sobre la fase de prototipado visual. Este cambio permitió avanzar más rápidamente hacia la validación técnica y cumplir con los objetivos específicos planteados hasta el momento, entre ellos el diseño del entorno base de la aplicación y la integración de los servicios principales.</w:t>
+              <w:t xml:space="preserve">En cuanto a los ajustes realizados, se modificó parcialmente la metodología inicial, priorizando el desarrollo funcional sobre la fase de </w:t>
+            </w:r>
+            <w:proofErr w:type="spellStart"/>
+            <w:r>
+              <w:rPr>
+                <w:rFonts w:ascii="Calibri" w:hAnsi="Calibri" w:cs="Arial"/>
+                <w:i/>
+                <w:sz w:val="20"/>
+                <w:szCs w:val="20"/>
+                <w:lang w:eastAsia="es-CL"/>
+              </w:rPr>
+              <w:t>prototipado</w:t>
+            </w:r>
+            <w:proofErr w:type="spellEnd"/>
+            <w:r>
+              <w:rPr>
+                <w:rFonts w:ascii="Calibri" w:hAnsi="Calibri" w:cs="Arial"/>
+                <w:i/>
+                <w:sz w:val="20"/>
+                <w:szCs w:val="20"/>
+                <w:lang w:eastAsia="es-CL"/>
+              </w:rPr>
+              <w:t xml:space="preserve"> visual. Este cambio permitió avanzar más rápidamente hacia la validación técnica y cumplir con los objetivos específicos planteados hasta el momento, entre ellos el diseño del entorno base de la aplicación y la integración de los servicios principales.</w:t>
             </w:r>
           </w:p>
         </w:tc>
@@ -869,6 +1050,7 @@
                 <w:rFonts w:ascii="Calibri" w:hAnsi="Calibri"/>
                 <w:color w:val="1F3864" w:themeColor="accent1" w:themeShade="80"/>
               </w:rPr>
+              <w:lastRenderedPageBreak/>
               <w:t>Objetivos</w:t>
             </w:r>
           </w:p>
@@ -926,7 +1108,6 @@
                 <w:rFonts w:ascii="Calibri" w:hAnsi="Calibri"/>
                 <w:color w:val="1F3864" w:themeColor="accent1" w:themeShade="80"/>
               </w:rPr>
-              <w:lastRenderedPageBreak/>
               <w:t>Metodología</w:t>
             </w:r>
           </w:p>
@@ -1382,7 +1563,245 @@
                 <w:szCs w:val="20"/>
                 <w:lang w:eastAsia="es-CL"/>
               </w:rPr>
-              <w:t xml:space="preserve">Como evidencia principal del progreso alcanzado en el Proyecto APT, se presenta el prototipo funcional inicial de la aplicación, desarrollado con las herramientas Electron y CSS. Este prototipo incluye la estructura base de la interfaz, los campos de entrada de datos y la integración preliminar de las APIs de Gemini, ElevenLabs y Twitch, lo que permite visualizar de forma tangible el avance en el diseño y funcionamiento del sistema, así como preparar la posterior configuración de los parámetros del </w:t>
+              <w:t>Como evidencia principal del progreso alcanzado en el Proyecto APT, se presenta el prototipo funcional inicial de la aplicación, desarrollado con las herramienta</w:t>
+            </w:r>
+            <w:r>
+              <w:rPr>
+                <w:rFonts w:ascii="Calibri" w:hAnsi="Calibri" w:cs="Arial"/>
+                <w:i/>
+                <w:color w:val="000000" w:themeColor="text1"/>
+                <w:sz w:val="20"/>
+                <w:szCs w:val="20"/>
+                <w:lang w:eastAsia="es-CL"/>
+              </w:rPr>
+              <w:t xml:space="preserve">s </w:t>
+            </w:r>
+            <w:proofErr w:type="spellStart"/>
+            <w:r>
+              <w:rPr>
+                <w:rFonts w:ascii="Calibri" w:hAnsi="Calibri" w:cs="Arial"/>
+                <w:i/>
+                <w:color w:val="000000" w:themeColor="text1"/>
+                <w:sz w:val="20"/>
+                <w:szCs w:val="20"/>
+                <w:lang w:eastAsia="es-CL"/>
+              </w:rPr>
+              <w:t>Electron</w:t>
+            </w:r>
+            <w:proofErr w:type="spellEnd"/>
+            <w:r>
+              <w:rPr>
+                <w:rFonts w:ascii="Calibri" w:hAnsi="Calibri" w:cs="Arial"/>
+                <w:i/>
+                <w:color w:val="000000" w:themeColor="text1"/>
+                <w:sz w:val="20"/>
+                <w:szCs w:val="20"/>
+                <w:lang w:eastAsia="es-CL"/>
+              </w:rPr>
+              <w:t>,</w:t>
+            </w:r>
+            <w:r>
+              <w:rPr>
+                <w:rFonts w:ascii="Calibri" w:hAnsi="Calibri" w:cs="Arial"/>
+                <w:i/>
+                <w:color w:val="000000" w:themeColor="text1"/>
+                <w:sz w:val="20"/>
+                <w:szCs w:val="20"/>
+                <w:lang w:eastAsia="es-CL"/>
+              </w:rPr>
+              <w:t xml:space="preserve"> CSS</w:t>
+            </w:r>
+            <w:r>
+              <w:rPr>
+                <w:rFonts w:ascii="Calibri" w:hAnsi="Calibri" w:cs="Arial"/>
+                <w:i/>
+                <w:color w:val="000000" w:themeColor="text1"/>
+                <w:sz w:val="20"/>
+                <w:szCs w:val="20"/>
+                <w:lang w:eastAsia="es-CL"/>
+              </w:rPr>
+              <w:t xml:space="preserve">, </w:t>
+            </w:r>
+            <w:proofErr w:type="spellStart"/>
+            <w:r>
+              <w:rPr>
+                <w:rFonts w:ascii="Calibri" w:hAnsi="Calibri" w:cs="Arial"/>
+                <w:i/>
+                <w:color w:val="000000" w:themeColor="text1"/>
+                <w:sz w:val="20"/>
+                <w:szCs w:val="20"/>
+                <w:lang w:eastAsia="es-CL"/>
+              </w:rPr>
+              <w:t>JavaScrip</w:t>
+            </w:r>
+            <w:proofErr w:type="spellEnd"/>
+            <w:r>
+              <w:rPr>
+                <w:rFonts w:ascii="Calibri" w:hAnsi="Calibri" w:cs="Arial"/>
+                <w:i/>
+                <w:color w:val="000000" w:themeColor="text1"/>
+                <w:sz w:val="20"/>
+                <w:szCs w:val="20"/>
+                <w:lang w:eastAsia="es-CL"/>
+              </w:rPr>
+              <w:t xml:space="preserve">, Python, </w:t>
+            </w:r>
+            <w:proofErr w:type="spellStart"/>
+            <w:r>
+              <w:rPr>
+                <w:rFonts w:ascii="Calibri" w:hAnsi="Calibri" w:cs="Arial"/>
+                <w:i/>
+                <w:color w:val="000000" w:themeColor="text1"/>
+                <w:sz w:val="20"/>
+                <w:szCs w:val="20"/>
+                <w:lang w:eastAsia="es-CL"/>
+              </w:rPr>
+              <w:t>electron</w:t>
+            </w:r>
+            <w:proofErr w:type="spellEnd"/>
+            <w:r>
+              <w:rPr>
+                <w:rFonts w:ascii="Calibri" w:hAnsi="Calibri" w:cs="Arial"/>
+                <w:i/>
+                <w:color w:val="000000" w:themeColor="text1"/>
+                <w:sz w:val="20"/>
+                <w:szCs w:val="20"/>
+                <w:lang w:eastAsia="es-CL"/>
+              </w:rPr>
+              <w:t xml:space="preserve"> y</w:t>
+            </w:r>
+            <w:bookmarkStart w:id="0" w:name="_GoBack"/>
+            <w:bookmarkEnd w:id="0"/>
+            <w:r>
+              <w:rPr>
+                <w:rFonts w:ascii="Calibri" w:hAnsi="Calibri" w:cs="Arial"/>
+                <w:i/>
+                <w:color w:val="000000" w:themeColor="text1"/>
+                <w:sz w:val="20"/>
+                <w:szCs w:val="20"/>
+                <w:lang w:eastAsia="es-CL"/>
+              </w:rPr>
+              <w:t xml:space="preserve"> </w:t>
+            </w:r>
+            <w:proofErr w:type="spellStart"/>
+            <w:r>
+              <w:rPr>
+                <w:rFonts w:ascii="Calibri" w:hAnsi="Calibri" w:cs="Arial"/>
+                <w:i/>
+                <w:color w:val="000000" w:themeColor="text1"/>
+                <w:sz w:val="20"/>
+                <w:szCs w:val="20"/>
+                <w:lang w:eastAsia="es-CL"/>
+              </w:rPr>
+              <w:t>Firebase</w:t>
+            </w:r>
+            <w:proofErr w:type="spellEnd"/>
+            <w:r>
+              <w:rPr>
+                <w:rFonts w:ascii="Calibri" w:hAnsi="Calibri" w:cs="Arial"/>
+                <w:i/>
+                <w:color w:val="000000" w:themeColor="text1"/>
+                <w:sz w:val="20"/>
+                <w:szCs w:val="20"/>
+                <w:lang w:eastAsia="es-CL"/>
+              </w:rPr>
+              <w:t xml:space="preserve">. Este prototipo incluye la estructura base de la interfaz, los campos de entrada de datos y la integración preliminar de las </w:t>
+            </w:r>
+            <w:proofErr w:type="spellStart"/>
+            <w:r>
+              <w:rPr>
+                <w:rFonts w:ascii="Calibri" w:hAnsi="Calibri" w:cs="Arial"/>
+                <w:i/>
+                <w:color w:val="000000" w:themeColor="text1"/>
+                <w:sz w:val="20"/>
+                <w:szCs w:val="20"/>
+                <w:lang w:eastAsia="es-CL"/>
+              </w:rPr>
+              <w:t>APIs</w:t>
+            </w:r>
+            <w:proofErr w:type="spellEnd"/>
+            <w:r>
+              <w:rPr>
+                <w:rFonts w:ascii="Calibri" w:hAnsi="Calibri" w:cs="Arial"/>
+                <w:i/>
+                <w:color w:val="000000" w:themeColor="text1"/>
+                <w:sz w:val="20"/>
+                <w:szCs w:val="20"/>
+                <w:lang w:eastAsia="es-CL"/>
+              </w:rPr>
+              <w:t xml:space="preserve"> de </w:t>
+            </w:r>
+            <w:proofErr w:type="spellStart"/>
+            <w:r>
+              <w:rPr>
+                <w:rFonts w:ascii="Calibri" w:hAnsi="Calibri" w:cs="Arial"/>
+                <w:i/>
+                <w:color w:val="000000" w:themeColor="text1"/>
+                <w:sz w:val="20"/>
+                <w:szCs w:val="20"/>
+                <w:lang w:eastAsia="es-CL"/>
+              </w:rPr>
+              <w:t>Gemini</w:t>
+            </w:r>
+            <w:proofErr w:type="spellEnd"/>
+            <w:r>
+              <w:rPr>
+                <w:rFonts w:ascii="Calibri" w:hAnsi="Calibri" w:cs="Arial"/>
+                <w:i/>
+                <w:color w:val="000000" w:themeColor="text1"/>
+                <w:sz w:val="20"/>
+                <w:szCs w:val="20"/>
+                <w:lang w:eastAsia="es-CL"/>
+              </w:rPr>
+              <w:t xml:space="preserve">, </w:t>
+            </w:r>
+            <w:proofErr w:type="spellStart"/>
+            <w:r>
+              <w:rPr>
+                <w:rFonts w:ascii="Calibri" w:hAnsi="Calibri" w:cs="Arial"/>
+                <w:i/>
+                <w:color w:val="000000" w:themeColor="text1"/>
+                <w:sz w:val="20"/>
+                <w:szCs w:val="20"/>
+                <w:lang w:eastAsia="es-CL"/>
+              </w:rPr>
+              <w:t>ElevenLabs</w:t>
+            </w:r>
+            <w:proofErr w:type="spellEnd"/>
+            <w:r>
+              <w:rPr>
+                <w:rFonts w:ascii="Calibri" w:hAnsi="Calibri" w:cs="Arial"/>
+                <w:i/>
+                <w:color w:val="000000" w:themeColor="text1"/>
+                <w:sz w:val="20"/>
+                <w:szCs w:val="20"/>
+                <w:lang w:eastAsia="es-CL"/>
+              </w:rPr>
+              <w:t xml:space="preserve"> y </w:t>
+            </w:r>
+            <w:proofErr w:type="spellStart"/>
+            <w:r>
+              <w:rPr>
+                <w:rFonts w:ascii="Calibri" w:hAnsi="Calibri" w:cs="Arial"/>
+                <w:i/>
+                <w:color w:val="000000" w:themeColor="text1"/>
+                <w:sz w:val="20"/>
+                <w:szCs w:val="20"/>
+                <w:lang w:eastAsia="es-CL"/>
+              </w:rPr>
+              <w:t>Twitch</w:t>
+            </w:r>
+            <w:proofErr w:type="spellEnd"/>
+            <w:r>
+              <w:rPr>
+                <w:rFonts w:ascii="Calibri" w:hAnsi="Calibri" w:cs="Arial"/>
+                <w:i/>
+                <w:color w:val="000000" w:themeColor="text1"/>
+                <w:sz w:val="20"/>
+                <w:szCs w:val="20"/>
+                <w:lang w:eastAsia="es-CL"/>
+              </w:rPr>
+              <w:t xml:space="preserve">, lo que permite visualizar de forma tangible el avance en el diseño y funcionamiento del sistema, así como preparar la posterior configuración de los parámetros del </w:t>
             </w:r>
             <w:r>
               <w:rPr>
@@ -1417,7 +1836,31 @@
                 <w:szCs w:val="20"/>
                 <w:lang w:eastAsia="es-CL"/>
               </w:rPr>
-              <w:t>Adicionalmente, se incluyen documentación técnica y diagramas de apoyo, tales como el flujograma BPMN, el diagrama de casos de uso y las historias de usuario con sus respectivas épicas, que detallan el proceso de integración de las APIs, los requerimientos funcionales y no funcionales identificados, y las decisiones metodológicas adoptadas durante el desarrollo. Estas evidencias permiten reflejar la evolución del proyecto desde la etapa de análisis hasta la fase de implementación inicial</w:t>
+              <w:t xml:space="preserve">Adicionalmente, se incluyen documentación técnica y diagramas de apoyo, tales como el flujograma BPMN, el diagrama de casos de uso y las historias de usuario con sus respectivas épicas, que detallan el proceso de integración de las </w:t>
+            </w:r>
+            <w:proofErr w:type="spellStart"/>
+            <w:r>
+              <w:rPr>
+                <w:rFonts w:ascii="Calibri" w:hAnsi="Calibri" w:cs="Arial"/>
+                <w:i/>
+                <w:color w:val="000000" w:themeColor="text1"/>
+                <w:sz w:val="20"/>
+                <w:szCs w:val="20"/>
+                <w:lang w:eastAsia="es-CL"/>
+              </w:rPr>
+              <w:t>APIs</w:t>
+            </w:r>
+            <w:proofErr w:type="spellEnd"/>
+            <w:r>
+              <w:rPr>
+                <w:rFonts w:ascii="Calibri" w:hAnsi="Calibri" w:cs="Arial"/>
+                <w:i/>
+                <w:color w:val="000000" w:themeColor="text1"/>
+                <w:sz w:val="20"/>
+                <w:szCs w:val="20"/>
+                <w:lang w:eastAsia="es-CL"/>
+              </w:rPr>
+              <w:t>, los requerimientos funcionales y no funcionales identificados, y las decisiones metodológicas adoptadas durante el desarrollo. Estas evidencias permiten reflejar la evolución del proyecto desde la etapa de análisis hasta la fase de implementación inicial</w:t>
             </w:r>
             <w:r>
               <w:rPr>
@@ -1452,7 +1895,31 @@
                 <w:szCs w:val="20"/>
                 <w:lang w:eastAsia="es-CL"/>
               </w:rPr>
-              <w:t>La calidad del proyecto se resguardó mediante la correcta aplicación de la metodología Scrum y el desarrollo iterativo, lo que permitió realizar ajustes oportunos en la planificación y priorizar tareas críticas. Asimismo, se aplicaron principios de diseño centrado en el usuario, asegurando una experiencia intuitiva para los streamers y cumpliendo con los objeti</w:t>
+              <w:t xml:space="preserve">La calidad del proyecto se resguardó mediante la correcta aplicación de la metodología </w:t>
+            </w:r>
+            <w:proofErr w:type="spellStart"/>
+            <w:r>
+              <w:rPr>
+                <w:rFonts w:ascii="Calibri" w:hAnsi="Calibri" w:cs="Arial"/>
+                <w:i/>
+                <w:color w:val="000000" w:themeColor="text1"/>
+                <w:sz w:val="20"/>
+                <w:szCs w:val="20"/>
+                <w:lang w:eastAsia="es-CL"/>
+              </w:rPr>
+              <w:t>Scrum</w:t>
+            </w:r>
+            <w:proofErr w:type="spellEnd"/>
+            <w:r>
+              <w:rPr>
+                <w:rFonts w:ascii="Calibri" w:hAnsi="Calibri" w:cs="Arial"/>
+                <w:i/>
+                <w:color w:val="000000" w:themeColor="text1"/>
+                <w:sz w:val="20"/>
+                <w:szCs w:val="20"/>
+                <w:lang w:eastAsia="es-CL"/>
+              </w:rPr>
+              <w:t xml:space="preserve"> y el desarrollo iterativo, lo que permitió realizar ajustes oportunos en la planificación y priorizar tareas críticas. Asimismo, se aplicaron principios de diseño centrado en el usuario, asegurando una experiencia intuitiva para los streamers y cumpliendo con los objeti</w:t>
             </w:r>
             <w:r>
               <w:rPr>
@@ -1488,6 +1955,547 @@
                 <w:lang w:eastAsia="es-CL"/>
               </w:rPr>
               <w:t>En conjunto, estas evidencias permiten demostrar de manera clara el avance técnico y metodológico del proyecto, así como la coherencia entre los objetivos planteados y los resultados alcanzados hasta el momento, proporcionando una base sólida para la evaluación y seguimiento del Proyecto APT.</w:t>
+            </w:r>
+          </w:p>
+          <w:p>
+            <w:pPr>
+              <w:jc w:val="both"/>
+              <w:rPr>
+                <w:rFonts w:ascii="Calibri" w:hAnsi="Calibri" w:cs="Arial"/>
+                <w:i/>
+                <w:color w:val="000000" w:themeColor="text1"/>
+                <w:sz w:val="20"/>
+                <w:szCs w:val="20"/>
+                <w:lang w:eastAsia="es-CL"/>
+              </w:rPr>
+            </w:pPr>
+          </w:p>
+          <w:p>
+            <w:pPr>
+              <w:jc w:val="both"/>
+              <w:rPr>
+                <w:rFonts w:ascii="Calibri" w:hAnsi="Calibri" w:cs="Arial"/>
+                <w:i/>
+                <w:color w:val="000000" w:themeColor="text1"/>
+                <w:sz w:val="20"/>
+                <w:szCs w:val="20"/>
+                <w:lang w:eastAsia="es-CL"/>
+              </w:rPr>
+            </w:pPr>
+          </w:p>
+          <w:p>
+            <w:pPr>
+              <w:jc w:val="both"/>
+              <w:rPr>
+                <w:rFonts w:ascii="Calibri" w:hAnsi="Calibri" w:cs="Arial"/>
+                <w:i/>
+                <w:color w:val="000000" w:themeColor="text1"/>
+                <w:sz w:val="20"/>
+                <w:szCs w:val="20"/>
+                <w:lang w:eastAsia="es-CL"/>
+              </w:rPr>
+            </w:pPr>
+          </w:p>
+          <w:p>
+            <w:pPr>
+              <w:jc w:val="both"/>
+              <w:rPr>
+                <w:rFonts w:ascii="Calibri" w:hAnsi="Calibri" w:cs="Arial"/>
+                <w:i/>
+                <w:color w:val="000000" w:themeColor="text1"/>
+                <w:sz w:val="20"/>
+                <w:szCs w:val="20"/>
+                <w:lang w:eastAsia="es-CL"/>
+              </w:rPr>
+            </w:pPr>
+          </w:p>
+          <w:p>
+            <w:pPr>
+              <w:jc w:val="both"/>
+              <w:rPr>
+                <w:rFonts w:ascii="Calibri" w:hAnsi="Calibri" w:cs="Arial"/>
+                <w:i/>
+                <w:color w:val="000000" w:themeColor="text1"/>
+                <w:sz w:val="20"/>
+                <w:szCs w:val="20"/>
+                <w:lang w:eastAsia="es-CL"/>
+              </w:rPr>
+            </w:pPr>
+          </w:p>
+          <w:p>
+            <w:pPr>
+              <w:jc w:val="both"/>
+              <w:rPr>
+                <w:rFonts w:ascii="Calibri" w:hAnsi="Calibri" w:cs="Arial"/>
+                <w:i/>
+                <w:color w:val="000000" w:themeColor="text1"/>
+                <w:sz w:val="20"/>
+                <w:szCs w:val="20"/>
+                <w:lang w:eastAsia="es-CL"/>
+              </w:rPr>
+            </w:pPr>
+          </w:p>
+          <w:p>
+            <w:pPr>
+              <w:jc w:val="both"/>
+              <w:rPr>
+                <w:rFonts w:ascii="Calibri" w:hAnsi="Calibri" w:cs="Arial"/>
+                <w:i/>
+                <w:color w:val="000000" w:themeColor="text1"/>
+                <w:sz w:val="20"/>
+                <w:szCs w:val="20"/>
+                <w:lang w:eastAsia="es-CL"/>
+              </w:rPr>
+            </w:pPr>
+          </w:p>
+          <w:p>
+            <w:pPr>
+              <w:jc w:val="both"/>
+              <w:rPr>
+                <w:rFonts w:ascii="Calibri" w:hAnsi="Calibri" w:cs="Arial"/>
+                <w:i/>
+                <w:color w:val="000000" w:themeColor="text1"/>
+                <w:sz w:val="20"/>
+                <w:szCs w:val="20"/>
+                <w:lang w:eastAsia="es-CL"/>
+              </w:rPr>
+            </w:pPr>
+          </w:p>
+          <w:p>
+            <w:pPr>
+              <w:jc w:val="both"/>
+              <w:rPr>
+                <w:rFonts w:ascii="Calibri" w:hAnsi="Calibri" w:cs="Arial"/>
+                <w:i/>
+                <w:color w:val="000000" w:themeColor="text1"/>
+                <w:sz w:val="20"/>
+                <w:szCs w:val="20"/>
+                <w:lang w:eastAsia="es-CL"/>
+              </w:rPr>
+            </w:pPr>
+          </w:p>
+          <w:p>
+            <w:pPr>
+              <w:jc w:val="both"/>
+              <w:rPr>
+                <w:rFonts w:ascii="Calibri" w:hAnsi="Calibri" w:cs="Arial"/>
+                <w:i/>
+                <w:color w:val="000000" w:themeColor="text1"/>
+                <w:sz w:val="20"/>
+                <w:szCs w:val="20"/>
+                <w:lang w:eastAsia="es-CL"/>
+              </w:rPr>
+            </w:pPr>
+          </w:p>
+          <w:p>
+            <w:pPr>
+              <w:jc w:val="both"/>
+              <w:rPr>
+                <w:rFonts w:ascii="Calibri" w:hAnsi="Calibri" w:cs="Arial"/>
+                <w:b/>
+                <w:color w:val="000000" w:themeColor="text1"/>
+                <w:sz w:val="20"/>
+                <w:szCs w:val="20"/>
+                <w:u w:val="single"/>
+                <w:lang w:eastAsia="es-CL"/>
+              </w:rPr>
+            </w:pPr>
+            <w:r>
+              <w:rPr>
+                <w:rFonts w:ascii="Calibri" w:hAnsi="Calibri" w:cs="Arial"/>
+                <w:b/>
+                <w:color w:val="000000" w:themeColor="text1"/>
+                <w:sz w:val="20"/>
+                <w:szCs w:val="20"/>
+                <w:u w:val="single"/>
+                <w:lang w:eastAsia="es-CL"/>
+              </w:rPr>
+              <w:t>Historias de Usuario:</w:t>
+            </w:r>
+          </w:p>
+          <w:p>
+            <w:pPr>
+              <w:jc w:val="both"/>
+              <w:rPr>
+                <w:rFonts w:ascii="Calibri" w:hAnsi="Calibri" w:cs="Arial"/>
+                <w:i/>
+                <w:color w:val="000000" w:themeColor="text1"/>
+                <w:sz w:val="20"/>
+                <w:szCs w:val="20"/>
+                <w:lang w:eastAsia="es-CL"/>
+              </w:rPr>
+            </w:pPr>
+            <w:r>
+              <w:rPr>
+                <w:rFonts w:ascii="Calibri" w:hAnsi="Calibri" w:cs="Arial"/>
+                <w:i/>
+                <w:color w:val="000000" w:themeColor="text1"/>
+                <w:sz w:val="20"/>
+                <w:szCs w:val="20"/>
+                <w:lang w:eastAsia="es-CL"/>
+              </w:rPr>
+              <w:drawing>
+                <wp:inline distT="0" distB="0" distL="0" distR="0" wp14:anchorId="216EED96" wp14:editId="379D5235">
+                  <wp:extent cx="2476800" cy="2530636"/>
+                  <wp:effectExtent l="0" t="0" r="0" b="3175"/>
+                  <wp:docPr id="12" name="Imagen 12"/>
+                  <wp:cNvGraphicFramePr>
+                    <a:graphicFrameLocks xmlns:a="http://schemas.openxmlformats.org/drawingml/2006/main" noChangeAspect="1"/>
+                  </wp:cNvGraphicFramePr>
+                  <a:graphic xmlns:a="http://schemas.openxmlformats.org/drawingml/2006/main">
+                    <a:graphicData uri="http://schemas.openxmlformats.org/drawingml/2006/picture">
+                      <pic:pic xmlns:pic="http://schemas.openxmlformats.org/drawingml/2006/picture">
+                        <pic:nvPicPr>
+                          <pic:cNvPr id="1" name=""/>
+                          <pic:cNvPicPr/>
+                        </pic:nvPicPr>
+                        <pic:blipFill>
+                          <a:blip r:embed="rId11"/>
+                          <a:stretch>
+                            <a:fillRect/>
+                          </a:stretch>
+                        </pic:blipFill>
+                        <pic:spPr>
+                          <a:xfrm>
+                            <a:off x="0" y="0"/>
+                            <a:ext cx="2536655" cy="2591792"/>
+                          </a:xfrm>
+                          <a:prstGeom prst="rect">
+                            <a:avLst/>
+                          </a:prstGeom>
+                        </pic:spPr>
+                      </pic:pic>
+                    </a:graphicData>
+                  </a:graphic>
+                </wp:inline>
+              </w:drawing>
+            </w:r>
+            <w:r>
+              <w:rPr>
+                <w:noProof/>
+                <w:lang w:val="en-US"/>
+              </w:rPr>
+              <w:t xml:space="preserve"> </w:t>
+            </w:r>
+            <w:r>
+              <w:rPr>
+                <w:noProof/>
+                <w:lang w:val="en-US"/>
+              </w:rPr>
+              <w:drawing>
+                <wp:inline distT="0" distB="0" distL="0" distR="0" wp14:anchorId="2967965E" wp14:editId="06006932">
+                  <wp:extent cx="2735332" cy="2525385"/>
+                  <wp:effectExtent l="0" t="0" r="8255" b="8890"/>
+                  <wp:docPr id="13" name="Imagen 13"/>
+                  <wp:cNvGraphicFramePr>
+                    <a:graphicFrameLocks xmlns:a="http://schemas.openxmlformats.org/drawingml/2006/main" noChangeAspect="1"/>
+                  </wp:cNvGraphicFramePr>
+                  <a:graphic xmlns:a="http://schemas.openxmlformats.org/drawingml/2006/main">
+                    <a:graphicData uri="http://schemas.openxmlformats.org/drawingml/2006/picture">
+                      <pic:pic xmlns:pic="http://schemas.openxmlformats.org/drawingml/2006/picture">
+                        <pic:nvPicPr>
+                          <pic:cNvPr id="1" name=""/>
+                          <pic:cNvPicPr/>
+                        </pic:nvPicPr>
+                        <pic:blipFill>
+                          <a:blip r:embed="rId12"/>
+                          <a:stretch>
+                            <a:fillRect/>
+                          </a:stretch>
+                        </pic:blipFill>
+                        <pic:spPr>
+                          <a:xfrm>
+                            <a:off x="0" y="0"/>
+                            <a:ext cx="2776973" cy="2563830"/>
+                          </a:xfrm>
+                          <a:prstGeom prst="rect">
+                            <a:avLst/>
+                          </a:prstGeom>
+                        </pic:spPr>
+                      </pic:pic>
+                    </a:graphicData>
+                  </a:graphic>
+                </wp:inline>
+              </w:drawing>
+            </w:r>
+          </w:p>
+          <w:p>
+            <w:pPr>
+              <w:jc w:val="both"/>
+              <w:rPr>
+                <w:rFonts w:ascii="Calibri" w:hAnsi="Calibri" w:cs="Arial"/>
+                <w:i/>
+                <w:color w:val="000000" w:themeColor="text1"/>
+                <w:sz w:val="20"/>
+                <w:szCs w:val="20"/>
+                <w:lang w:eastAsia="es-CL"/>
+              </w:rPr>
+            </w:pPr>
+            <w:r>
+              <w:rPr>
+                <w:rFonts w:ascii="Calibri" w:hAnsi="Calibri" w:cs="Arial"/>
+                <w:i/>
+                <w:color w:val="000000" w:themeColor="text1"/>
+                <w:sz w:val="20"/>
+                <w:szCs w:val="20"/>
+                <w:lang w:eastAsia="es-CL"/>
+              </w:rPr>
+              <w:drawing>
+                <wp:inline distT="0" distB="0" distL="0" distR="0" wp14:anchorId="58D05CDC" wp14:editId="4C873884">
+                  <wp:extent cx="2519680" cy="2340000"/>
+                  <wp:effectExtent l="0" t="0" r="0" b="3175"/>
+                  <wp:docPr id="14" name="Imagen 14"/>
+                  <wp:cNvGraphicFramePr>
+                    <a:graphicFrameLocks xmlns:a="http://schemas.openxmlformats.org/drawingml/2006/main" noChangeAspect="1"/>
+                  </wp:cNvGraphicFramePr>
+                  <a:graphic xmlns:a="http://schemas.openxmlformats.org/drawingml/2006/main">
+                    <a:graphicData uri="http://schemas.openxmlformats.org/drawingml/2006/picture">
+                      <pic:pic xmlns:pic="http://schemas.openxmlformats.org/drawingml/2006/picture">
+                        <pic:nvPicPr>
+                          <pic:cNvPr id="1" name=""/>
+                          <pic:cNvPicPr/>
+                        </pic:nvPicPr>
+                        <pic:blipFill>
+                          <a:blip r:embed="rId13"/>
+                          <a:stretch>
+                            <a:fillRect/>
+                          </a:stretch>
+                        </pic:blipFill>
+                        <pic:spPr>
+                          <a:xfrm>
+                            <a:off x="0" y="0"/>
+                            <a:ext cx="2546657" cy="2365053"/>
+                          </a:xfrm>
+                          <a:prstGeom prst="rect">
+                            <a:avLst/>
+                          </a:prstGeom>
+                        </pic:spPr>
+                      </pic:pic>
+                    </a:graphicData>
+                  </a:graphic>
+                </wp:inline>
+              </w:drawing>
+            </w:r>
+            <w:r>
+              <w:rPr>
+                <w:noProof/>
+                <w:lang w:val="en-US"/>
+              </w:rPr>
+              <w:t xml:space="preserve"> </w:t>
+            </w:r>
+            <w:r>
+              <w:rPr>
+                <w:rFonts w:ascii="Calibri" w:hAnsi="Calibri" w:cs="Arial"/>
+                <w:i/>
+                <w:color w:val="000000" w:themeColor="text1"/>
+                <w:sz w:val="20"/>
+                <w:szCs w:val="20"/>
+                <w:lang w:eastAsia="es-CL"/>
+              </w:rPr>
+              <w:drawing>
+                <wp:inline distT="0" distB="0" distL="0" distR="0" wp14:anchorId="7A8FFC90" wp14:editId="00D90DA3">
+                  <wp:extent cx="2757600" cy="2349500"/>
+                  <wp:effectExtent l="0" t="0" r="5080" b="0"/>
+                  <wp:docPr id="15" name="Imagen 15"/>
+                  <wp:cNvGraphicFramePr>
+                    <a:graphicFrameLocks xmlns:a="http://schemas.openxmlformats.org/drawingml/2006/main" noChangeAspect="1"/>
+                  </wp:cNvGraphicFramePr>
+                  <a:graphic xmlns:a="http://schemas.openxmlformats.org/drawingml/2006/main">
+                    <a:graphicData uri="http://schemas.openxmlformats.org/drawingml/2006/picture">
+                      <pic:pic xmlns:pic="http://schemas.openxmlformats.org/drawingml/2006/picture">
+                        <pic:nvPicPr>
+                          <pic:cNvPr id="1" name=""/>
+                          <pic:cNvPicPr/>
+                        </pic:nvPicPr>
+                        <pic:blipFill>
+                          <a:blip r:embed="rId14"/>
+                          <a:stretch>
+                            <a:fillRect/>
+                          </a:stretch>
+                        </pic:blipFill>
+                        <pic:spPr>
+                          <a:xfrm>
+                            <a:off x="0" y="0"/>
+                            <a:ext cx="2767445" cy="2357888"/>
+                          </a:xfrm>
+                          <a:prstGeom prst="rect">
+                            <a:avLst/>
+                          </a:prstGeom>
+                        </pic:spPr>
+                      </pic:pic>
+                    </a:graphicData>
+                  </a:graphic>
+                </wp:inline>
+              </w:drawing>
+            </w:r>
+          </w:p>
+          <w:p>
+            <w:pPr>
+              <w:jc w:val="both"/>
+              <w:rPr>
+                <w:rFonts w:ascii="Calibri" w:hAnsi="Calibri" w:cs="Arial"/>
+                <w:i/>
+                <w:color w:val="000000" w:themeColor="text1"/>
+                <w:sz w:val="20"/>
+                <w:szCs w:val="20"/>
+                <w:lang w:eastAsia="es-CL"/>
+              </w:rPr>
+            </w:pPr>
+          </w:p>
+          <w:p>
+            <w:pPr>
+              <w:jc w:val="both"/>
+              <w:rPr>
+                <w:rFonts w:ascii="Calibri" w:hAnsi="Calibri" w:cs="Arial"/>
+                <w:i/>
+                <w:color w:val="000000" w:themeColor="text1"/>
+                <w:sz w:val="20"/>
+                <w:szCs w:val="20"/>
+                <w:lang w:eastAsia="es-CL"/>
+              </w:rPr>
+            </w:pPr>
+          </w:p>
+          <w:p>
+            <w:pPr>
+              <w:jc w:val="both"/>
+              <w:rPr>
+                <w:rFonts w:ascii="Calibri" w:hAnsi="Calibri" w:cs="Arial"/>
+                <w:i/>
+                <w:color w:val="000000" w:themeColor="text1"/>
+                <w:sz w:val="20"/>
+                <w:szCs w:val="20"/>
+                <w:lang w:eastAsia="es-CL"/>
+              </w:rPr>
+            </w:pPr>
+          </w:p>
+          <w:p>
+            <w:pPr>
+              <w:jc w:val="both"/>
+              <w:rPr>
+                <w:rFonts w:ascii="Calibri" w:hAnsi="Calibri" w:cs="Arial"/>
+                <w:i/>
+                <w:color w:val="000000" w:themeColor="text1"/>
+                <w:sz w:val="20"/>
+                <w:szCs w:val="20"/>
+                <w:lang w:eastAsia="es-CL"/>
+              </w:rPr>
+            </w:pPr>
+          </w:p>
+          <w:p>
+            <w:pPr>
+              <w:jc w:val="both"/>
+              <w:rPr>
+                <w:rFonts w:ascii="Calibri" w:hAnsi="Calibri" w:cs="Arial"/>
+                <w:i/>
+                <w:color w:val="000000" w:themeColor="text1"/>
+                <w:sz w:val="20"/>
+                <w:szCs w:val="20"/>
+                <w:lang w:eastAsia="es-CL"/>
+              </w:rPr>
+            </w:pPr>
+          </w:p>
+          <w:p>
+            <w:pPr>
+              <w:jc w:val="both"/>
+              <w:rPr>
+                <w:rFonts w:ascii="Calibri" w:hAnsi="Calibri" w:cs="Arial"/>
+                <w:i/>
+                <w:color w:val="000000" w:themeColor="text1"/>
+                <w:sz w:val="20"/>
+                <w:szCs w:val="20"/>
+                <w:lang w:eastAsia="es-CL"/>
+              </w:rPr>
+            </w:pPr>
+          </w:p>
+          <w:p>
+            <w:pPr>
+              <w:jc w:val="both"/>
+              <w:rPr>
+                <w:rFonts w:ascii="Calibri" w:hAnsi="Calibri" w:cs="Arial"/>
+                <w:i/>
+                <w:color w:val="000000" w:themeColor="text1"/>
+                <w:sz w:val="20"/>
+                <w:szCs w:val="20"/>
+                <w:lang w:eastAsia="es-CL"/>
+              </w:rPr>
+            </w:pPr>
+          </w:p>
+          <w:p>
+            <w:pPr>
+              <w:jc w:val="both"/>
+              <w:rPr>
+                <w:rFonts w:ascii="Calibri" w:hAnsi="Calibri" w:cs="Arial"/>
+                <w:i/>
+                <w:color w:val="000000" w:themeColor="text1"/>
+                <w:sz w:val="20"/>
+                <w:szCs w:val="20"/>
+                <w:lang w:eastAsia="es-CL"/>
+              </w:rPr>
+            </w:pPr>
+          </w:p>
+          <w:p>
+            <w:pPr>
+              <w:jc w:val="both"/>
+              <w:rPr>
+                <w:rFonts w:ascii="Calibri" w:hAnsi="Calibri" w:cs="Arial"/>
+                <w:i/>
+                <w:color w:val="000000" w:themeColor="text1"/>
+                <w:sz w:val="20"/>
+                <w:szCs w:val="20"/>
+                <w:lang w:eastAsia="es-CL"/>
+              </w:rPr>
+            </w:pPr>
+          </w:p>
+          <w:p>
+            <w:pPr>
+              <w:jc w:val="both"/>
+              <w:rPr>
+                <w:rFonts w:ascii="Calibri" w:hAnsi="Calibri" w:cs="Arial"/>
+                <w:i/>
+                <w:color w:val="000000" w:themeColor="text1"/>
+                <w:sz w:val="20"/>
+                <w:szCs w:val="20"/>
+                <w:lang w:eastAsia="es-CL"/>
+              </w:rPr>
+            </w:pPr>
+          </w:p>
+          <w:p>
+            <w:pPr>
+              <w:jc w:val="both"/>
+              <w:rPr>
+                <w:rFonts w:ascii="Calibri" w:hAnsi="Calibri" w:cs="Arial"/>
+                <w:i/>
+                <w:color w:val="000000" w:themeColor="text1"/>
+                <w:sz w:val="20"/>
+                <w:szCs w:val="20"/>
+                <w:lang w:eastAsia="es-CL"/>
+              </w:rPr>
+            </w:pPr>
+          </w:p>
+          <w:p>
+            <w:pPr>
+              <w:jc w:val="both"/>
+              <w:rPr>
+                <w:rFonts w:ascii="Calibri" w:hAnsi="Calibri" w:cs="Arial"/>
+                <w:b/>
+                <w:color w:val="000000" w:themeColor="text1"/>
+                <w:sz w:val="20"/>
+                <w:szCs w:val="20"/>
+                <w:u w:val="single"/>
+                <w:lang w:eastAsia="es-CL"/>
+              </w:rPr>
+            </w:pPr>
+            <w:r>
+              <w:rPr>
+                <w:rFonts w:ascii="Calibri" w:hAnsi="Calibri" w:cs="Arial"/>
+                <w:b/>
+                <w:color w:val="000000" w:themeColor="text1"/>
+                <w:sz w:val="20"/>
+                <w:szCs w:val="20"/>
+                <w:u w:val="single"/>
+                <w:lang w:eastAsia="es-CL"/>
+              </w:rPr>
+              <w:t>Flujograma de Proceso:</w:t>
             </w:r>
           </w:p>
           <w:p>
@@ -1511,7 +2519,6 @@
                 <w:sz w:val="18"/>
                 <w:lang w:val="en-US"/>
               </w:rPr>
-              <w:lastRenderedPageBreak/>
               <w:drawing>
                 <wp:inline distT="0" distB="0" distL="0" distR="0" wp14:anchorId="4719A950" wp14:editId="3E814AE3">
                   <wp:extent cx="5400040" cy="3676015"/>
@@ -1528,7 +2535,7 @@
                           <pic:cNvPicPr/>
                         </pic:nvPicPr>
                         <pic:blipFill>
-                          <a:blip r:embed="rId10" cstate="print">
+                          <a:blip r:embed="rId15" cstate="print">
                             <a:extLst>
                               <a:ext uri="{28A0092B-C50C-407E-A947-70E740481C1C}">
                                 <a14:useLocalDpi xmlns:a14="http://schemas.microsoft.com/office/drawing/2010/main" val="0"/>
@@ -1560,6 +2567,32 @@
               <w:jc w:val="both"/>
               <w:rPr>
                 <w:rFonts w:ascii="Calibri" w:hAnsi="Calibri" w:cs="Arial"/>
+                <w:b/>
+                <w:color w:val="000000" w:themeColor="text1"/>
+                <w:sz w:val="20"/>
+                <w:szCs w:val="20"/>
+                <w:u w:val="single"/>
+                <w:lang w:eastAsia="es-CL"/>
+              </w:rPr>
+            </w:pPr>
+            <w:r>
+              <w:rPr>
+                <w:rFonts w:ascii="Calibri" w:hAnsi="Calibri" w:cs="Arial"/>
+                <w:b/>
+                <w:color w:val="000000" w:themeColor="text1"/>
+                <w:sz w:val="20"/>
+                <w:szCs w:val="20"/>
+                <w:u w:val="single"/>
+                <w:lang w:eastAsia="es-CL"/>
+              </w:rPr>
+              <w:t>Diagrama de casos de uso:</w:t>
+            </w:r>
+          </w:p>
+          <w:p>
+            <w:pPr>
+              <w:jc w:val="both"/>
+              <w:rPr>
+                <w:rFonts w:ascii="Calibri" w:hAnsi="Calibri" w:cs="Arial"/>
                 <w:i/>
                 <w:color w:val="000000" w:themeColor="text1"/>
                 <w:sz w:val="20"/>
@@ -1577,9 +2610,9 @@
                 <w:lang w:val="en-US"/>
               </w:rPr>
               <w:drawing>
-                <wp:inline distT="0" distB="0" distL="0" distR="0" wp14:anchorId="59D0CDC7" wp14:editId="3A73273B">
-                  <wp:extent cx="3868891" cy="3987165"/>
-                  <wp:effectExtent l="0" t="0" r="0" b="0"/>
+                <wp:inline distT="0" distB="0" distL="0" distR="0" wp14:anchorId="59D0CDC7" wp14:editId="37A895F2">
+                  <wp:extent cx="3945255" cy="3520800"/>
+                  <wp:effectExtent l="0" t="0" r="0" b="3810"/>
                   <wp:docPr id="2" name="Imagen 2"/>
                   <wp:cNvGraphicFramePr>
                     <a:graphicFrameLocks xmlns:a="http://schemas.openxmlformats.org/drawingml/2006/main" noChangeAspect="1"/>
@@ -1592,7 +2625,7 @@
                           <pic:cNvPicPr/>
                         </pic:nvPicPr>
                         <pic:blipFill>
-                          <a:blip r:embed="rId11"/>
+                          <a:blip r:embed="rId16"/>
                           <a:stretch>
                             <a:fillRect/>
                           </a:stretch>
@@ -1600,7 +2633,7 @@
                         <pic:spPr>
                           <a:xfrm>
                             <a:off x="0" y="0"/>
-                            <a:ext cx="3877698" cy="3996241"/>
+                            <a:ext cx="3977270" cy="3549371"/>
                           </a:xfrm>
                           <a:prstGeom prst="rect">
                             <a:avLst/>
@@ -1625,6 +2658,46 @@
                 <w:lang w:eastAsia="es-CL"/>
               </w:rPr>
             </w:pPr>
+          </w:p>
+          <w:p>
+            <w:pPr>
+              <w:jc w:val="both"/>
+              <w:rPr>
+                <w:rFonts w:ascii="Calibri" w:hAnsi="Calibri" w:cs="Arial"/>
+                <w:b/>
+                <w:color w:val="000000" w:themeColor="text1"/>
+                <w:sz w:val="20"/>
+                <w:szCs w:val="20"/>
+                <w:u w:val="single"/>
+                <w:lang w:eastAsia="es-CL"/>
+              </w:rPr>
+            </w:pPr>
+            <w:r>
+              <w:rPr>
+                <w:rFonts w:ascii="Calibri" w:hAnsi="Calibri" w:cs="Arial"/>
+                <w:b/>
+                <w:color w:val="000000" w:themeColor="text1"/>
+                <w:sz w:val="20"/>
+                <w:szCs w:val="20"/>
+                <w:u w:val="single"/>
+                <w:lang w:eastAsia="es-CL"/>
+              </w:rPr>
+              <w:lastRenderedPageBreak/>
+              <w:t>Avance de desarrollo de la aplicación:</w:t>
+            </w:r>
+          </w:p>
+          <w:p>
+            <w:pPr>
+              <w:jc w:val="both"/>
+              <w:rPr>
+                <w:rFonts w:ascii="Calibri" w:hAnsi="Calibri" w:cs="Arial"/>
+                <w:i/>
+                <w:color w:val="000000" w:themeColor="text1"/>
+                <w:sz w:val="20"/>
+                <w:szCs w:val="20"/>
+                <w:lang w:eastAsia="es-CL"/>
+              </w:rPr>
+            </w:pPr>
             <w:r>
               <w:rPr>
                 <w:rFonts w:ascii="Calibri" w:hAnsi="Calibri" w:cs="Arial"/>
@@ -1635,7 +2708,6 @@
                 <w:szCs w:val="20"/>
                 <w:lang w:val="en-US"/>
               </w:rPr>
-              <w:lastRenderedPageBreak/>
               <w:drawing>
                 <wp:inline distT="0" distB="0" distL="0" distR="0" wp14:anchorId="0D789B48" wp14:editId="546E3EEA">
                   <wp:extent cx="5389644" cy="2289976"/>
@@ -1652,7 +2724,7 @@
                           <pic:cNvPicPr/>
                         </pic:nvPicPr>
                         <pic:blipFill>
-                          <a:blip r:embed="rId12"/>
+                          <a:blip r:embed="rId17"/>
                           <a:stretch>
                             <a:fillRect/>
                           </a:stretch>
@@ -1705,7 +2777,7 @@
                           <pic:cNvPicPr/>
                         </pic:nvPicPr>
                         <pic:blipFill>
-                          <a:blip r:embed="rId13"/>
+                          <a:blip r:embed="rId18"/>
                           <a:stretch>
                             <a:fillRect/>
                           </a:stretch>
@@ -1764,7 +2836,7 @@
                           <pic:cNvPicPr/>
                         </pic:nvPicPr>
                         <pic:blipFill>
-                          <a:blip r:embed="rId14"/>
+                          <a:blip r:embed="rId19"/>
                           <a:stretch>
                             <a:fillRect/>
                           </a:stretch>
@@ -1816,13 +2888,25 @@
               <w:rPr>
                 <w:rFonts w:ascii="Calibri" w:hAnsi="Calibri" w:cs="Arial"/>
                 <w:b/>
-                <w:i/>
-                <w:color w:val="548DD4"/>
-                <w:sz w:val="20"/>
-                <w:szCs w:val="20"/>
-                <w:lang w:eastAsia="es-CL"/>
-              </w:rPr>
-            </w:pPr>
+                <w:color w:val="000000" w:themeColor="text1"/>
+                <w:sz w:val="20"/>
+                <w:szCs w:val="20"/>
+                <w:u w:val="single"/>
+                <w:lang w:eastAsia="es-CL"/>
+              </w:rPr>
+            </w:pPr>
+            <w:r>
+              <w:rPr>
+                <w:rFonts w:ascii="Calibri" w:hAnsi="Calibri" w:cs="Arial"/>
+                <w:b/>
+                <w:color w:val="000000" w:themeColor="text1"/>
+                <w:sz w:val="20"/>
+                <w:szCs w:val="20"/>
+                <w:u w:val="single"/>
+                <w:lang w:eastAsia="es-CL"/>
+              </w:rPr>
+              <w:t>Documentación de requerimientos:</w:t>
+            </w:r>
           </w:p>
           <w:p>
             <w:pPr>
@@ -1868,7 +2952,7 @@
                           </pic:cNvPicPr>
                         </pic:nvPicPr>
                         <pic:blipFill>
-                          <a:blip r:embed="rId15">
+                          <a:blip r:embed="rId20">
                             <a:extLst>
                               <a:ext uri="{28A0092B-C50C-407E-A947-70E740481C1C}">
                                 <a14:useLocalDpi xmlns:a14="http://schemas.microsoft.com/office/drawing/2010/main" val="0"/>
@@ -1925,7 +3009,7 @@
                           </pic:cNvPicPr>
                         </pic:nvPicPr>
                         <pic:blipFill>
-                          <a:blip r:embed="rId16">
+                          <a:blip r:embed="rId21">
                             <a:extLst>
                               <a:ext uri="{28A0092B-C50C-407E-A947-70E740481C1C}">
                                 <a14:useLocalDpi xmlns:a14="http://schemas.microsoft.com/office/drawing/2010/main" val="0"/>
@@ -2112,13 +3196,25 @@
               <w:rPr>
                 <w:rFonts w:ascii="Calibri" w:hAnsi="Calibri" w:cs="Arial"/>
                 <w:b/>
-                <w:i/>
-                <w:color w:val="548DD4"/>
-                <w:sz w:val="20"/>
-                <w:szCs w:val="20"/>
-                <w:lang w:eastAsia="es-CL"/>
-              </w:rPr>
-            </w:pPr>
+                <w:color w:val="000000" w:themeColor="text1"/>
+                <w:sz w:val="20"/>
+                <w:szCs w:val="20"/>
+                <w:u w:val="single"/>
+                <w:lang w:eastAsia="es-CL"/>
+              </w:rPr>
+            </w:pPr>
+            <w:r>
+              <w:rPr>
+                <w:rFonts w:ascii="Calibri" w:hAnsi="Calibri" w:cs="Arial"/>
+                <w:b/>
+                <w:color w:val="000000" w:themeColor="text1"/>
+                <w:sz w:val="20"/>
+                <w:szCs w:val="20"/>
+                <w:u w:val="single"/>
+                <w:lang w:eastAsia="es-CL"/>
+              </w:rPr>
+              <w:t>EDT</w:t>
+            </w:r>
           </w:p>
           <w:p>
             <w:pPr>
@@ -2156,7 +3252,7 @@
                           </pic:cNvPicPr>
                         </pic:nvPicPr>
                         <pic:blipFill>
-                          <a:blip r:embed="rId17">
+                          <a:blip r:embed="rId22">
                             <a:extLst>
                               <a:ext uri="{28A0092B-C50C-407E-A947-70E740481C1C}">
                                 <a14:useLocalDpi xmlns:a14="http://schemas.microsoft.com/office/drawing/2010/main" val="0"/>
@@ -2245,13 +3341,26 @@
               <w:rPr>
                 <w:rFonts w:ascii="Calibri" w:hAnsi="Calibri" w:cs="Arial"/>
                 <w:b/>
-                <w:i/>
-                <w:color w:val="548DD4"/>
-                <w:sz w:val="20"/>
-                <w:szCs w:val="20"/>
-                <w:lang w:eastAsia="es-CL"/>
-              </w:rPr>
-            </w:pPr>
+                <w:color w:val="000000" w:themeColor="text1"/>
+                <w:sz w:val="20"/>
+                <w:szCs w:val="20"/>
+                <w:u w:val="single"/>
+                <w:lang w:eastAsia="es-CL"/>
+              </w:rPr>
+            </w:pPr>
+            <w:r>
+              <w:rPr>
+                <w:rFonts w:ascii="Calibri" w:hAnsi="Calibri" w:cs="Arial"/>
+                <w:b/>
+                <w:color w:val="000000" w:themeColor="text1"/>
+                <w:sz w:val="20"/>
+                <w:szCs w:val="20"/>
+                <w:u w:val="single"/>
+                <w:lang w:eastAsia="es-CL"/>
+              </w:rPr>
+              <w:lastRenderedPageBreak/>
+              <w:t>RBS</w:t>
+            </w:r>
           </w:p>
           <w:p>
             <w:pPr>
@@ -2321,7 +3430,7 @@
                           <pic:cNvPicPr/>
                         </pic:nvPicPr>
                         <pic:blipFill>
-                          <a:blip r:embed="rId18"/>
+                          <a:blip r:embed="rId23"/>
                           <a:stretch>
                             <a:fillRect/>
                           </a:stretch>
@@ -3474,8 +4583,30 @@
               <w:rPr>
                 <w:lang w:val="es-ES"/>
               </w:rPr>
-              <w:t>Identificar y documentar requisitos funcionales y no funcionales, definición del backlog y organización de sprints</w:t>
-            </w:r>
+              <w:t xml:space="preserve">Identificar y documentar requisitos funcionales y no funcionales, definición del </w:t>
+            </w:r>
+            <w:proofErr w:type="spellStart"/>
+            <w:r>
+              <w:rPr>
+                <w:lang w:val="es-ES"/>
+              </w:rPr>
+              <w:t>backlog</w:t>
+            </w:r>
+            <w:proofErr w:type="spellEnd"/>
+            <w:r>
+              <w:rPr>
+                <w:lang w:val="es-ES"/>
+              </w:rPr>
+              <w:t xml:space="preserve"> y organización de </w:t>
+            </w:r>
+            <w:proofErr w:type="spellStart"/>
+            <w:r>
+              <w:rPr>
+                <w:lang w:val="es-ES"/>
+              </w:rPr>
+              <w:t>sprints</w:t>
+            </w:r>
+            <w:proofErr w:type="spellEnd"/>
           </w:p>
         </w:tc>
         <w:tc>
@@ -3491,9 +4622,11 @@
             <w:pPr>
               <w:jc w:val="both"/>
             </w:pPr>
+            <w:proofErr w:type="spellStart"/>
             <w:r>
               <w:t>Gemini</w:t>
             </w:r>
+            <w:proofErr w:type="spellEnd"/>
           </w:p>
         </w:tc>
         <w:tc>
@@ -3642,7 +4775,21 @@
               <w:rPr>
                 <w:lang w:val="es-ES"/>
               </w:rPr>
-              <w:t>Diseñar prototipo inicial en Figma y definir estructura de la base de datos</w:t>
+              <w:t xml:space="preserve">Diseñar prototipo inicial en </w:t>
+            </w:r>
+            <w:proofErr w:type="spellStart"/>
+            <w:r>
+              <w:rPr>
+                <w:lang w:val="es-ES"/>
+              </w:rPr>
+              <w:t>Figma</w:t>
+            </w:r>
+            <w:proofErr w:type="spellEnd"/>
+            <w:r>
+              <w:rPr>
+                <w:lang w:val="es-ES"/>
+              </w:rPr>
+              <w:t xml:space="preserve"> y definir estructura de la base de datos</w:t>
             </w:r>
           </w:p>
         </w:tc>
@@ -3651,9 +4798,27 @@
             <w:tcW w:w="1276" w:type="dxa"/>
           </w:tcPr>
           <w:p>
-            <w:r>
-              <w:t>Figma, MySQL, Bootstrap</w:t>
-            </w:r>
+            <w:proofErr w:type="spellStart"/>
+            <w:r>
+              <w:t>Figma</w:t>
+            </w:r>
+            <w:proofErr w:type="spellEnd"/>
+            <w:r>
+              <w:t xml:space="preserve">, </w:t>
+            </w:r>
+            <w:proofErr w:type="spellStart"/>
+            <w:r>
+              <w:t>MySQL</w:t>
+            </w:r>
+            <w:proofErr w:type="spellEnd"/>
+            <w:r>
+              <w:t xml:space="preserve">, </w:t>
+            </w:r>
+            <w:proofErr w:type="spellStart"/>
+            <w:r>
+              <w:t>Bootstrap</w:t>
+            </w:r>
+            <w:proofErr w:type="spellEnd"/>
           </w:p>
         </w:tc>
         <w:tc>
@@ -3677,9 +4842,27 @@
             <w:pPr>
               <w:jc w:val="both"/>
             </w:pPr>
-            <w:r>
-              <w:t>Frontend/Integration Specialist</w:t>
-            </w:r>
+            <w:proofErr w:type="spellStart"/>
+            <w:r>
+              <w:t>Frontend</w:t>
+            </w:r>
+            <w:proofErr w:type="spellEnd"/>
+            <w:r>
+              <w:t>/</w:t>
+            </w:r>
+            <w:proofErr w:type="spellStart"/>
+            <w:r>
+              <w:t>Integration</w:t>
+            </w:r>
+            <w:proofErr w:type="spellEnd"/>
+            <w:r>
+              <w:t xml:space="preserve"> </w:t>
+            </w:r>
+            <w:proofErr w:type="spellStart"/>
+            <w:r>
+              <w:t>Specialist</w:t>
+            </w:r>
+            <w:proofErr w:type="spellEnd"/>
           </w:p>
         </w:tc>
         <w:tc>
@@ -3752,7 +4935,117 @@
                 <w:szCs w:val="20"/>
                 <w:lang w:eastAsia="es-CL"/>
               </w:rPr>
-              <w:t>En la elaboracion del diseño del prototipo inicial no se utilizaron figma y boostrap en remplazo de estas herramientas se utilizó directamente electronjunto a css.</w:t>
+              <w:t xml:space="preserve">En la </w:t>
+            </w:r>
+            <w:proofErr w:type="spellStart"/>
+            <w:r>
+              <w:rPr>
+                <w:rFonts w:ascii="Calibri" w:hAnsi="Calibri" w:cs="Arial"/>
+                <w:i/>
+                <w:sz w:val="18"/>
+                <w:szCs w:val="20"/>
+                <w:lang w:eastAsia="es-CL"/>
+              </w:rPr>
+              <w:t>elaboracion</w:t>
+            </w:r>
+            <w:proofErr w:type="spellEnd"/>
+            <w:r>
+              <w:rPr>
+                <w:rFonts w:ascii="Calibri" w:hAnsi="Calibri" w:cs="Arial"/>
+                <w:i/>
+                <w:sz w:val="18"/>
+                <w:szCs w:val="20"/>
+                <w:lang w:eastAsia="es-CL"/>
+              </w:rPr>
+              <w:t xml:space="preserve"> del diseño del prototipo inicial no se utilizaron </w:t>
+            </w:r>
+            <w:proofErr w:type="spellStart"/>
+            <w:r>
+              <w:rPr>
+                <w:rFonts w:ascii="Calibri" w:hAnsi="Calibri" w:cs="Arial"/>
+                <w:i/>
+                <w:sz w:val="18"/>
+                <w:szCs w:val="20"/>
+                <w:lang w:eastAsia="es-CL"/>
+              </w:rPr>
+              <w:t>figma</w:t>
+            </w:r>
+            <w:proofErr w:type="spellEnd"/>
+            <w:r>
+              <w:rPr>
+                <w:rFonts w:ascii="Calibri" w:hAnsi="Calibri" w:cs="Arial"/>
+                <w:i/>
+                <w:sz w:val="18"/>
+                <w:szCs w:val="20"/>
+                <w:lang w:eastAsia="es-CL"/>
+              </w:rPr>
+              <w:t xml:space="preserve"> y </w:t>
+            </w:r>
+            <w:proofErr w:type="spellStart"/>
+            <w:r>
+              <w:rPr>
+                <w:rFonts w:ascii="Calibri" w:hAnsi="Calibri" w:cs="Arial"/>
+                <w:i/>
+                <w:sz w:val="18"/>
+                <w:szCs w:val="20"/>
+                <w:lang w:eastAsia="es-CL"/>
+              </w:rPr>
+              <w:t>boostrap</w:t>
+            </w:r>
+            <w:proofErr w:type="spellEnd"/>
+            <w:r>
+              <w:rPr>
+                <w:rFonts w:ascii="Calibri" w:hAnsi="Calibri" w:cs="Arial"/>
+                <w:i/>
+                <w:sz w:val="18"/>
+                <w:szCs w:val="20"/>
+                <w:lang w:eastAsia="es-CL"/>
+              </w:rPr>
+              <w:t xml:space="preserve"> en remplazo de estas herramientas se utilizó directamente </w:t>
+            </w:r>
+            <w:proofErr w:type="spellStart"/>
+            <w:r>
+              <w:rPr>
+                <w:rFonts w:ascii="Calibri" w:hAnsi="Calibri" w:cs="Arial"/>
+                <w:i/>
+                <w:sz w:val="18"/>
+                <w:szCs w:val="20"/>
+                <w:lang w:eastAsia="es-CL"/>
+              </w:rPr>
+              <w:t>electronjunto</w:t>
+            </w:r>
+            <w:proofErr w:type="spellEnd"/>
+            <w:r>
+              <w:rPr>
+                <w:rFonts w:ascii="Calibri" w:hAnsi="Calibri" w:cs="Arial"/>
+                <w:i/>
+                <w:sz w:val="18"/>
+                <w:szCs w:val="20"/>
+                <w:lang w:eastAsia="es-CL"/>
+              </w:rPr>
+              <w:t xml:space="preserve"> a </w:t>
+            </w:r>
+            <w:proofErr w:type="spellStart"/>
+            <w:r>
+              <w:rPr>
+                <w:rFonts w:ascii="Calibri" w:hAnsi="Calibri" w:cs="Arial"/>
+                <w:i/>
+                <w:sz w:val="18"/>
+                <w:szCs w:val="20"/>
+                <w:lang w:eastAsia="es-CL"/>
+              </w:rPr>
+              <w:t>css</w:t>
+            </w:r>
+            <w:proofErr w:type="spellEnd"/>
+            <w:r>
+              <w:rPr>
+                <w:rFonts w:ascii="Calibri" w:hAnsi="Calibri" w:cs="Arial"/>
+                <w:i/>
+                <w:sz w:val="18"/>
+                <w:szCs w:val="20"/>
+                <w:lang w:eastAsia="es-CL"/>
+              </w:rPr>
+              <w:t>.</w:t>
             </w:r>
           </w:p>
         </w:tc>
@@ -3795,8 +5088,30 @@
               <w:rPr>
                 <w:lang w:val="es-ES"/>
               </w:rPr>
-              <w:t>Implementar la lógica del sistema para capturar mensajes de Twitch y procesarlos con OpenAI</w:t>
-            </w:r>
+              <w:t xml:space="preserve">Implementar la lógica del sistema para capturar mensajes de </w:t>
+            </w:r>
+            <w:proofErr w:type="spellStart"/>
+            <w:r>
+              <w:rPr>
+                <w:lang w:val="es-ES"/>
+              </w:rPr>
+              <w:t>Twitch</w:t>
+            </w:r>
+            <w:proofErr w:type="spellEnd"/>
+            <w:r>
+              <w:rPr>
+                <w:lang w:val="es-ES"/>
+              </w:rPr>
+              <w:t xml:space="preserve"> y procesarlos con </w:t>
+            </w:r>
+            <w:proofErr w:type="spellStart"/>
+            <w:r>
+              <w:rPr>
+                <w:lang w:val="es-ES"/>
+              </w:rPr>
+              <w:t>OpenAI</w:t>
+            </w:r>
+            <w:proofErr w:type="spellEnd"/>
           </w:p>
         </w:tc>
         <w:tc>
@@ -3805,9 +5120,41 @@
           </w:tcPr>
           <w:p>
             <w:r>
-              <w:t>Python, Gemini, MySQL, GitHub</w:t>
-            </w:r>
-          </w:p>
+              <w:t xml:space="preserve">Python, </w:t>
+            </w:r>
+            <w:proofErr w:type="spellStart"/>
+            <w:r>
+              <w:t>Gemini</w:t>
+            </w:r>
+            <w:proofErr w:type="spellEnd"/>
+            <w:r>
+              <w:t>,</w:t>
+            </w:r>
+          </w:p>
+          <w:p>
+            <w:r>
+              <w:t xml:space="preserve"> </w:t>
+            </w:r>
+            <w:proofErr w:type="spellStart"/>
+            <w:r>
+              <w:t>MySQL</w:t>
+            </w:r>
+            <w:proofErr w:type="spellEnd"/>
+            <w:r>
+              <w:t>, GitHub</w:t>
+            </w:r>
+            <w:r>
+              <w:t>,</w:t>
+            </w:r>
+          </w:p>
+          <w:p>
+            <w:proofErr w:type="spellStart"/>
+            <w:r>
+              <w:t>Firebase</w:t>
+            </w:r>
+            <w:proofErr w:type="spellEnd"/>
+          </w:p>
+          <w:p/>
         </w:tc>
         <w:tc>
           <w:tcPr>
@@ -3831,8 +5178,13 @@
               <w:jc w:val="both"/>
             </w:pPr>
             <w:r>
-              <w:t>Backend Developer</w:t>
-            </w:r>
+              <w:t xml:space="preserve">Backend </w:t>
+            </w:r>
+            <w:proofErr w:type="spellStart"/>
+            <w:r>
+              <w:t>Developer</w:t>
+            </w:r>
+            <w:proofErr w:type="spellEnd"/>
           </w:p>
         </w:tc>
         <w:tc>
@@ -3938,7 +5290,35 @@
               <w:rPr>
                 <w:lang w:val="es-ES"/>
               </w:rPr>
-              <w:t>Integrar servicios externos ElevenLabs y VTube Studio para TTS y sincronización del avatar</w:t>
+              <w:t xml:space="preserve">Integrar servicios externos </w:t>
+            </w:r>
+            <w:proofErr w:type="spellStart"/>
+            <w:r>
+              <w:rPr>
+                <w:lang w:val="es-ES"/>
+              </w:rPr>
+              <w:t>ElevenLabs</w:t>
+            </w:r>
+            <w:proofErr w:type="spellEnd"/>
+            <w:r>
+              <w:rPr>
+                <w:lang w:val="es-ES"/>
+              </w:rPr>
+              <w:t xml:space="preserve"> y </w:t>
+            </w:r>
+            <w:proofErr w:type="spellStart"/>
+            <w:r>
+              <w:rPr>
+                <w:lang w:val="es-ES"/>
+              </w:rPr>
+              <w:t>VTube</w:t>
+            </w:r>
+            <w:proofErr w:type="spellEnd"/>
+            <w:r>
+              <w:rPr>
+                <w:lang w:val="es-ES"/>
+              </w:rPr>
+              <w:t xml:space="preserve"> Studio para TTS y sincronización del avatar</w:t>
             </w:r>
           </w:p>
         </w:tc>
@@ -3948,7 +5328,23 @@
           </w:tcPr>
           <w:p>
             <w:r>
-              <w:t>Python, ElevenLabs, VTube Studio</w:t>
+              <w:t xml:space="preserve">Python, </w:t>
+            </w:r>
+            <w:proofErr w:type="spellStart"/>
+            <w:r>
+              <w:t>ElevenLabs</w:t>
+            </w:r>
+            <w:proofErr w:type="spellEnd"/>
+            <w:r>
+              <w:t xml:space="preserve">, </w:t>
+            </w:r>
+            <w:proofErr w:type="spellStart"/>
+            <w:r>
+              <w:t>VTube</w:t>
+            </w:r>
+            <w:proofErr w:type="spellEnd"/>
+            <w:r>
+              <w:t xml:space="preserve"> Studio</w:t>
             </w:r>
           </w:p>
         </w:tc>
@@ -4045,15 +5441,49 @@
                 <w:lang w:eastAsia="es-CL"/>
               </w:rPr>
             </w:pPr>
-            <w:r>
-              <w:rPr>
-                <w:rFonts w:ascii="Calibri" w:hAnsi="Calibri" w:cs="Arial"/>
-                <w:i/>
-                <w:sz w:val="18"/>
-                <w:szCs w:val="20"/>
-                <w:lang w:eastAsia="es-CL"/>
-              </w:rPr>
-              <w:t>Unicamente falta integrar VTuberStudio al sistema para sincronización del avatar.</w:t>
+            <w:proofErr w:type="spellStart"/>
+            <w:r>
+              <w:rPr>
+                <w:rFonts w:ascii="Calibri" w:hAnsi="Calibri" w:cs="Arial"/>
+                <w:i/>
+                <w:sz w:val="18"/>
+                <w:szCs w:val="20"/>
+                <w:lang w:eastAsia="es-CL"/>
+              </w:rPr>
+              <w:t>Unicamente</w:t>
+            </w:r>
+            <w:proofErr w:type="spellEnd"/>
+            <w:r>
+              <w:rPr>
+                <w:rFonts w:ascii="Calibri" w:hAnsi="Calibri" w:cs="Arial"/>
+                <w:i/>
+                <w:sz w:val="18"/>
+                <w:szCs w:val="20"/>
+                <w:lang w:eastAsia="es-CL"/>
+              </w:rPr>
+              <w:t xml:space="preserve"> falta integrar </w:t>
+            </w:r>
+            <w:proofErr w:type="spellStart"/>
+            <w:r>
+              <w:rPr>
+                <w:rFonts w:ascii="Calibri" w:hAnsi="Calibri" w:cs="Arial"/>
+                <w:i/>
+                <w:sz w:val="18"/>
+                <w:szCs w:val="20"/>
+                <w:lang w:eastAsia="es-CL"/>
+              </w:rPr>
+              <w:t>VTuberStudio</w:t>
+            </w:r>
+            <w:proofErr w:type="spellEnd"/>
+            <w:r>
+              <w:rPr>
+                <w:rFonts w:ascii="Calibri" w:hAnsi="Calibri" w:cs="Arial"/>
+                <w:i/>
+                <w:sz w:val="18"/>
+                <w:szCs w:val="20"/>
+                <w:lang w:eastAsia="es-CL"/>
+              </w:rPr>
+              <w:t xml:space="preserve"> al sistema para sincronización del avatar.</w:t>
             </w:r>
           </w:p>
         </w:tc>
@@ -4106,7 +5536,15 @@
           </w:tcPr>
           <w:p>
             <w:r>
-              <w:t>Python (pytest), Jira, GitHub</w:t>
+              <w:t>Python (</w:t>
+            </w:r>
+            <w:proofErr w:type="spellStart"/>
+            <w:r>
+              <w:t>pytest</w:t>
+            </w:r>
+            <w:proofErr w:type="spellEnd"/>
+            <w:r>
+              <w:t>), Jira, GitHub</w:t>
             </w:r>
           </w:p>
         </w:tc>
@@ -4134,9 +5572,11 @@
                 <w:lang w:val="en-US"/>
               </w:rPr>
             </w:pPr>
+            <w:proofErr w:type="spellStart"/>
             <w:r>
               <w:t>Tester</w:t>
             </w:r>
+            <w:proofErr w:type="spellEnd"/>
           </w:p>
         </w:tc>
         <w:tc>
@@ -4252,8 +5692,21 @@
             <w:tcW w:w="1276" w:type="dxa"/>
           </w:tcPr>
           <w:p>
-            <w:r>
-              <w:t>Electron, Python, MySQL, GitHub</w:t>
+            <w:proofErr w:type="spellStart"/>
+            <w:r>
+              <w:t>Electron</w:t>
+            </w:r>
+            <w:proofErr w:type="spellEnd"/>
+            <w:r>
+              <w:t xml:space="preserve">, Python, </w:t>
+            </w:r>
+            <w:proofErr w:type="spellStart"/>
+            <w:r>
+              <w:t>MySQL</w:t>
+            </w:r>
+            <w:proofErr w:type="spellEnd"/>
+            <w:r>
+              <w:t>, GitHub</w:t>
             </w:r>
           </w:p>
         </w:tc>
@@ -4387,8 +5840,16 @@
               <w:rPr>
                 <w:lang w:val="es-ES"/>
               </w:rPr>
-              <w:t>Corregir incidencias post-despliegue, aplicar mejoras y ajustes según feedback</w:t>
-            </w:r>
+              <w:t xml:space="preserve">Corregir incidencias post-despliegue, aplicar mejoras y ajustes según </w:t>
+            </w:r>
+            <w:proofErr w:type="spellStart"/>
+            <w:r>
+              <w:rPr>
+                <w:lang w:val="es-ES"/>
+              </w:rPr>
+              <w:t>feedback</w:t>
+            </w:r>
+            <w:proofErr w:type="spellEnd"/>
           </w:p>
         </w:tc>
         <w:tc>
@@ -4887,7 +6348,71 @@
                 <w:color w:val="000000" w:themeColor="text1"/>
               </w:rPr>
               <w:lastRenderedPageBreak/>
-              <w:t>En cuanto a las dificultades, se presentaron desafíos relacionados con la integración de las APIs externas (Gemini, ElevenLabs y Twitch), principalmente por diferencias en la documentación y en la gestión de autenticaciones. Para abordar estos inconvenientes, se implementó un proceso de pruebas iterativas y documentación técnica complementaria, lo que permitió resolver gradualmente los errores y asegurar la correcta interoperabilidad entre los distintos servicios.</w:t>
+              <w:t xml:space="preserve">En cuanto a las dificultades, se presentaron desafíos relacionados con la integración de las </w:t>
+            </w:r>
+            <w:proofErr w:type="spellStart"/>
+            <w:r>
+              <w:rPr>
+                <w:rFonts w:ascii="Calibri" w:hAnsi="Calibri"/>
+                <w:color w:val="000000" w:themeColor="text1"/>
+              </w:rPr>
+              <w:t>APIs</w:t>
+            </w:r>
+            <w:proofErr w:type="spellEnd"/>
+            <w:r>
+              <w:rPr>
+                <w:rFonts w:ascii="Calibri" w:hAnsi="Calibri"/>
+                <w:color w:val="000000" w:themeColor="text1"/>
+              </w:rPr>
+              <w:t xml:space="preserve"> externas (</w:t>
+            </w:r>
+            <w:proofErr w:type="spellStart"/>
+            <w:r>
+              <w:rPr>
+                <w:rFonts w:ascii="Calibri" w:hAnsi="Calibri"/>
+                <w:color w:val="000000" w:themeColor="text1"/>
+              </w:rPr>
+              <w:t>Gemini</w:t>
+            </w:r>
+            <w:proofErr w:type="spellEnd"/>
+            <w:r>
+              <w:rPr>
+                <w:rFonts w:ascii="Calibri" w:hAnsi="Calibri"/>
+                <w:color w:val="000000" w:themeColor="text1"/>
+              </w:rPr>
+              <w:t xml:space="preserve">, </w:t>
+            </w:r>
+            <w:proofErr w:type="spellStart"/>
+            <w:r>
+              <w:rPr>
+                <w:rFonts w:ascii="Calibri" w:hAnsi="Calibri"/>
+                <w:color w:val="000000" w:themeColor="text1"/>
+              </w:rPr>
+              <w:t>ElevenLabs</w:t>
+            </w:r>
+            <w:proofErr w:type="spellEnd"/>
+            <w:r>
+              <w:rPr>
+                <w:rFonts w:ascii="Calibri" w:hAnsi="Calibri"/>
+                <w:color w:val="000000" w:themeColor="text1"/>
+              </w:rPr>
+              <w:t xml:space="preserve"> y </w:t>
+            </w:r>
+            <w:proofErr w:type="spellStart"/>
+            <w:r>
+              <w:rPr>
+                <w:rFonts w:ascii="Calibri" w:hAnsi="Calibri"/>
+                <w:color w:val="000000" w:themeColor="text1"/>
+              </w:rPr>
+              <w:t>Twitch</w:t>
+            </w:r>
+            <w:proofErr w:type="spellEnd"/>
+            <w:r>
+              <w:rPr>
+                <w:rFonts w:ascii="Calibri" w:hAnsi="Calibri"/>
+                <w:color w:val="000000" w:themeColor="text1"/>
+              </w:rPr>
+              <w:t>), principalmente por diferencias en la documentación y en la gestión de autenticaciones. Para abordar estos inconvenientes, se implementó un proceso de pruebas iterativas y documentación técnica complementaria, lo que permitió resolver gradualmente los errores y asegurar la correcta interoperabilidad entre los distintos servicios.</w:t>
             </w:r>
           </w:p>
           <w:p>
@@ -5724,7 +7249,7 @@
       </w:pPr>
     </w:p>
     <w:sectPr>
-      <w:headerReference w:type="default" r:id="rId19"/>
+      <w:headerReference w:type="default" r:id="rId24"/>
       <w:pgSz w:w="11906" w:h="16838"/>
       <w:pgMar w:top="1417" w:right="1701" w:bottom="1417" w:left="1701" w:header="708" w:footer="708" w:gutter="0"/>
       <w:cols w:space="708"/>
@@ -6993,6 +8518,25 @@
       <w:szCs w:val="20"/>
     </w:rPr>
   </w:style>
+  <w:style w:type="paragraph" w:styleId="Descripcin">
+    <w:name w:val="caption"/>
+    <w:basedOn w:val="Normal"/>
+    <w:next w:val="Normal"/>
+    <w:uiPriority w:val="35"/>
+    <w:unhideWhenUsed/>
+    <w:qFormat/>
+    <w:rsid w:val="00C674D4"/>
+    <w:pPr>
+      <w:spacing w:after="200" w:line="240" w:lineRule="auto"/>
+    </w:pPr>
+    <w:rPr>
+      <w:i/>
+      <w:iCs/>
+      <w:color w:val="44546A" w:themeColor="text2"/>
+      <w:sz w:val="18"/>
+      <w:szCs w:val="18"/>
+    </w:rPr>
+  </w:style>
 </w:styles>
 </file>
 
@@ -7438,6 +8982,10 @@
 </FormTemplates>
 </file>
 
+<file path=customXml/item4.xml><?xml version="1.0" encoding="utf-8"?>
+<b:Sources xmlns:b="http://schemas.openxmlformats.org/officeDocument/2006/bibliography" xmlns="http://schemas.openxmlformats.org/officeDocument/2006/bibliography" SelectedStyle="\APASixthEditionOfficeOnline.xsl" StyleName="APA" Version="6"/>
+</file>
+
 <file path=customXml/itemProps1.xml><?xml version="1.0" encoding="utf-8"?>
 <ds:datastoreItem xmlns:ds="http://schemas.openxmlformats.org/officeDocument/2006/customXml" ds:itemID="{46CA5683-AF87-4E40-B841-2E23A3B52406}">
   <ds:schemaRefs>
@@ -7471,4 +9019,12 @@
     <ds:schemaRef ds:uri="http://schemas.microsoft.com/sharepoint/v3/contenttype/forms"/>
   </ds:schemaRefs>
 </ds:datastoreItem>
+</file>
+
+<file path=customXml/itemProps4.xml><?xml version="1.0" encoding="utf-8"?>
+<ds:datastoreItem xmlns:ds="http://schemas.openxmlformats.org/officeDocument/2006/customXml" ds:itemID="{D866680E-76C2-402C-A81C-074F93AAEDBF}">
+  <ds:schemaRefs>
+    <ds:schemaRef ds:uri="http://schemas.openxmlformats.org/officeDocument/2006/bibliography"/>
+  </ds:schemaRefs>
+</ds:datastoreItem>
 </file>
</xml_diff>